<commit_message>
Update Simplified SYH OA manager signature
</commit_message>
<xml_diff>
--- a/Project Rooms/Operating Agreements/sources/Jeff Watson/Simplified OA - 25-06-25 SELL_YOUR_HOME_LLC Simplified with Summary with Jeff Watson tracked edits.docx
+++ b/Project Rooms/Operating Agreements/sources/Jeff Watson/Simplified OA - 25-06-25 SELL_YOUR_HOME_LLC Simplified with Summary with Jeff Watson tracked edits.docx
@@ -7078,6 +7078,15 @@
           <w:color w:val="0070C0"/>
         </w:rPr>
         <w:t xml:space="preserve"> replaced, resigns, or is removed. Attending a meeting or approving its minutes counts as accepting the Manager role.</w:t>
+      </w:r>
+    </w:p>
+    <w:p>
+      <w:r>
+        <w:rPr>
+          <w:b w:val="0"/>
+          <w:color w:val="008000"/>
+        </w:rPr>
+        <w:t>Current Manager(s). Joshua Kennedy is the current Manager of the Company and will serve until replaced, resignation, or removal under this Agreement.</w:t>
       </w:r>
     </w:p>
     <w:p>
@@ -12891,6 +12900,42 @@
       </w:pPr>
       <w:r>
         <w:br w:type="page"/>
+      </w:r>
+    </w:p>
+    <w:p/>
+    <w:p>
+      <w:r>
+        <w:rPr>
+          <w:b/>
+          <w:color w:val="008000"/>
+        </w:rPr>
+        <w:t>Manager:</w:t>
+      </w:r>
+    </w:p>
+    <w:p>
+      <w:r>
+        <w:rPr>
+          <w:b w:val="0"/>
+          <w:color w:val="008000"/>
+        </w:rPr>
+        <w:t>By:</w:t>
+        <w:tab/>
+        <w:tab/>
+        <w:tab/>
+        <w:tab/>
+        <w:tab/>
+        <w:tab/>
+        <w:tab/>
+        <w:t xml:space="preserve">, </w:t>
+      </w:r>
+    </w:p>
+    <w:p>
+      <w:r>
+        <w:rPr>
+          <w:b w:val="0"/>
+          <w:color w:val="008000"/>
+        </w:rPr>
+        <w:t>Joshua Kennedy, Manager</w:t>
       </w:r>
     </w:p>
     <w:p>

</xml_diff>

<commit_message>
Compact SYH certification signature page
</commit_message>
<xml_diff>
--- a/Project Rooms/Operating Agreements/sources/Jeff Watson/Simplified OA - 25-06-25 SELL_YOUR_HOME_LLC Simplified with Summary with Jeff Watson tracked edits.docx
+++ b/Project Rooms/Operating Agreements/sources/Jeff Watson/Simplified OA - 25-06-25 SELL_YOUR_HOME_LLC Simplified with Summary with Jeff Watson tracked edits.docx
@@ -11657,11 +11657,17 @@
     <w:p>
       <w:pPr>
         <w:pStyle w:val="Heading1"/>
+        <w:pageBreakBefore/>
+        <w:spacing w:before="0" w:after="120"/>
         <w:rPr>
           <w:color w:val="4F81BD" w:themeColor="accent1"/>
         </w:rPr>
       </w:pPr>
       <w:r>
+        <w:rPr>
+          <w:b/>
+          <w:sz w:val="22"/>
+        </w:rPr>
         <w:lastRenderedPageBreak/>
         <w:t>CERTIFICATION</w:t>
       </w:r>
@@ -11672,6 +11678,7 @@
         <w:keepNext w:val="0"/>
         <w:keepLines w:val="0"/>
         <w:widowControl w:val="0"/>
+        <w:spacing w:before="0" w:after="160" w:line="240" w:lineRule="auto"/>
         <w:jc w:val="both"/>
         <w:rPr>
           <w:b w:val="0"/>
@@ -11684,6 +11691,7 @@
           <w:b w:val="0"/>
           <w:bCs w:val="0"/>
           <w:color w:val="auto"/>
+          <w:sz w:val="18"/>
         </w:rPr>
         <w:t xml:space="preserve">THE UNDERSIGNED, being </w:t>
       </w:r>
@@ -11693,6 +11701,7 @@
           <w:b w:val="0"/>
           <w:bCs w:val="0"/>
           <w:color w:val="auto"/>
+          <w:sz w:val="18"/>
         </w:rPr>
         <w:t>all of</w:t>
       </w:r>
@@ -11702,6 +11711,7 @@
           <w:b w:val="0"/>
           <w:bCs w:val="0"/>
           <w:color w:val="auto"/>
+          <w:sz w:val="18"/>
         </w:rPr>
         <w:t xml:space="preserve"> the Members and Manager(s) of the Company, hereby evidence their adoption and ratification of this Amended and Restated Operating Agreement for and on </w:t>
       </w:r>
@@ -11711,6 +11721,7 @@
           <w:b w:val="0"/>
           <w:bCs w:val="0"/>
           <w:color w:val="auto"/>
+          <w:sz w:val="18"/>
         </w:rPr>
         <w:t>the behalf</w:t>
       </w:r>
@@ -11720,6 +11731,7 @@
           <w:b w:val="0"/>
           <w:bCs w:val="0"/>
           <w:color w:val="auto"/>
+          <w:sz w:val="18"/>
         </w:rPr>
         <w:t xml:space="preserve"> of themselves and the Company, effective </w:t>
       </w:r>
@@ -11729,6 +11741,7 @@
           <w:b w:val="0"/>
           <w:bCs w:val="0"/>
           <w:color w:val="auto"/>
+          <w:sz w:val="18"/>
         </w:rPr>
         <w:t>June __</w:t>
       </w:r>
@@ -11738,1211 +11751,368 @@
           <w:b w:val="0"/>
           <w:bCs w:val="0"/>
           <w:color w:val="auto"/>
+          <w:sz w:val="18"/>
         </w:rPr>
         <w:t>__, 2025.</w:t>
       </w:r>
     </w:p>
+    <w:tbl>
+      <w:tblPr>
+        <w:tblW w:type="auto" w:w="0"/>
+        <w:jc w:val="center"/>
+        <w:tblLayout w:type="fixed"/>
+        <w:tblLook w:firstColumn="1" w:firstRow="1" w:lastColumn="0" w:lastRow="0" w:noHBand="0" w:noVBand="1" w:val="04A0"/>
+      </w:tblPr>
+      <w:tblGrid>
+        <w:gridCol w:w="4680"/>
+        <w:gridCol w:w="4680"/>
+      </w:tblGrid>
+      <w:tr>
+        <w:tc>
+          <w:tcPr>
+            <w:tcW w:type="dxa" w:w="4608"/>
+            <w:vAlign w:val="top"/>
+            <w:tcBorders>
+              <w:top w:val="nil"/>
+              <w:left w:val="nil"/>
+              <w:bottom w:val="nil"/>
+              <w:right w:val="nil"/>
+              <w:insideH w:val="nil"/>
+              <w:insideV w:val="nil"/>
+            </w:tcBorders>
+            <w:tcMar>
+              <w:top w:w="40" w:type="dxa"/>
+              <w:start w:w="80" w:type="dxa"/>
+              <w:bottom w:w="40" w:type="dxa"/>
+              <w:end w:w="80" w:type="dxa"/>
+            </w:tcMar>
+          </w:tcPr>
+          <w:p>
+            <w:pPr>
+              <w:spacing w:before="0" w:after="40" w:line="240" w:lineRule="auto"/>
+            </w:pPr>
+            <w:r>
+              <w:rPr>
+                <w:b/>
+                <w:sz w:val="18"/>
+              </w:rPr>
+              <w:t>Heritage IRA, FBO Wesley Dale Browning HSA #99169956</w:t>
+            </w:r>
+          </w:p>
+          <w:p>
+            <w:pPr>
+              <w:spacing w:before="0" w:after="0" w:line="240" w:lineRule="auto"/>
+            </w:pPr>
+            <w:r>
+              <w:rPr>
+                <w:b w:val="0"/>
+                <w:sz w:val="18"/>
+              </w:rPr>
+              <w:t>By: ________________________________</w:t>
+            </w:r>
+          </w:p>
+          <w:p>
+            <w:pPr>
+              <w:spacing w:before="0" w:after="60" w:line="240" w:lineRule="auto"/>
+            </w:pPr>
+            <w:r>
+              <w:rPr>
+                <w:b w:val="0"/>
+                <w:sz w:val="16"/>
+              </w:rPr>
+              <w:t>as an authorized signer</w:t>
+            </w:r>
+          </w:p>
+          <w:p>
+            <w:pPr>
+              <w:spacing w:before="0" w:after="0" w:line="240" w:lineRule="auto"/>
+            </w:pPr>
+            <w:r>
+              <w:rPr>
+                <w:b w:val="0"/>
+                <w:sz w:val="16"/>
+              </w:rPr>
+              <w:t>Read and approved for investment by:</w:t>
+            </w:r>
+          </w:p>
+          <w:p>
+            <w:pPr>
+              <w:spacing w:before="0" w:after="0" w:line="240" w:lineRule="auto"/>
+            </w:pPr>
+            <w:r>
+              <w:rPr>
+                <w:b w:val="0"/>
+                <w:sz w:val="18"/>
+              </w:rPr>
+              <w:t>____________________________________</w:t>
+            </w:r>
+          </w:p>
+          <w:p>
+            <w:pPr>
+              <w:spacing w:before="0" w:after="120" w:line="240" w:lineRule="auto"/>
+            </w:pPr>
+            <w:r>
+              <w:rPr>
+                <w:b w:val="0"/>
+                <w:sz w:val="16"/>
+              </w:rPr>
+              <w:t>Wesley Dale Browning, Accountholder</w:t>
+            </w:r>
+          </w:p>
+        </w:tc>
+        <w:tc>
+          <w:tcPr>
+            <w:tcW w:type="dxa" w:w="4608"/>
+            <w:vAlign w:val="top"/>
+            <w:tcBorders>
+              <w:top w:val="nil"/>
+              <w:left w:val="nil"/>
+              <w:bottom w:val="nil"/>
+              <w:right w:val="nil"/>
+              <w:insideH w:val="nil"/>
+              <w:insideV w:val="nil"/>
+            </w:tcBorders>
+            <w:tcMar>
+              <w:top w:w="40" w:type="dxa"/>
+              <w:start w:w="80" w:type="dxa"/>
+              <w:bottom w:w="40" w:type="dxa"/>
+              <w:end w:w="80" w:type="dxa"/>
+            </w:tcMar>
+          </w:tcPr>
+          <w:p>
+            <w:pPr>
+              <w:spacing w:before="0" w:after="40" w:line="240" w:lineRule="auto"/>
+            </w:pPr>
+            <w:r>
+              <w:rPr>
+                <w:b/>
+                <w:sz w:val="18"/>
+              </w:rPr>
+              <w:t>Heritage IRA, FBO Wesley Dale Browning Roth IRA #8870274</w:t>
+            </w:r>
+          </w:p>
+          <w:p>
+            <w:pPr>
+              <w:spacing w:before="0" w:after="0" w:line="240" w:lineRule="auto"/>
+            </w:pPr>
+            <w:r>
+              <w:rPr>
+                <w:b w:val="0"/>
+                <w:sz w:val="18"/>
+              </w:rPr>
+              <w:t>By: ________________________________</w:t>
+            </w:r>
+          </w:p>
+          <w:p>
+            <w:pPr>
+              <w:spacing w:before="0" w:after="60" w:line="240" w:lineRule="auto"/>
+            </w:pPr>
+            <w:r>
+              <w:rPr>
+                <w:b w:val="0"/>
+                <w:sz w:val="16"/>
+              </w:rPr>
+              <w:t>as an authorized signer</w:t>
+            </w:r>
+          </w:p>
+          <w:p>
+            <w:pPr>
+              <w:spacing w:before="0" w:after="0" w:line="240" w:lineRule="auto"/>
+            </w:pPr>
+            <w:r>
+              <w:rPr>
+                <w:b w:val="0"/>
+                <w:sz w:val="16"/>
+              </w:rPr>
+              <w:t>Read and approved for investment by:</w:t>
+            </w:r>
+          </w:p>
+          <w:p>
+            <w:pPr>
+              <w:spacing w:before="0" w:after="0" w:line="240" w:lineRule="auto"/>
+            </w:pPr>
+            <w:r>
+              <w:rPr>
+                <w:b w:val="0"/>
+                <w:sz w:val="18"/>
+              </w:rPr>
+              <w:t>____________________________________</w:t>
+            </w:r>
+          </w:p>
+          <w:p>
+            <w:pPr>
+              <w:spacing w:before="0" w:after="120" w:line="240" w:lineRule="auto"/>
+            </w:pPr>
+            <w:r>
+              <w:rPr>
+                <w:b w:val="0"/>
+                <w:sz w:val="16"/>
+              </w:rPr>
+              <w:t>Wesley Dale Browning, Accountholder</w:t>
+            </w:r>
+          </w:p>
+        </w:tc>
+      </w:tr>
+      <w:tr>
+        <w:tc>
+          <w:tcPr>
+            <w:tcW w:type="dxa" w:w="4608"/>
+            <w:vAlign w:val="top"/>
+            <w:tcBorders>
+              <w:top w:val="nil"/>
+              <w:left w:val="nil"/>
+              <w:bottom w:val="nil"/>
+              <w:right w:val="nil"/>
+              <w:insideH w:val="nil"/>
+              <w:insideV w:val="nil"/>
+            </w:tcBorders>
+            <w:tcMar>
+              <w:top w:w="40" w:type="dxa"/>
+              <w:start w:w="80" w:type="dxa"/>
+              <w:bottom w:w="40" w:type="dxa"/>
+              <w:end w:w="80" w:type="dxa"/>
+            </w:tcMar>
+          </w:tcPr>
+          <w:p>
+            <w:pPr>
+              <w:spacing w:before="0" w:after="40" w:line="240" w:lineRule="auto"/>
+            </w:pPr>
+            <w:r>
+              <w:rPr>
+                <w:b/>
+                <w:sz w:val="18"/>
+              </w:rPr>
+              <w:t>Heritage IRA, FBO Jeanette W. Hollinger Roth IRA #61077178</w:t>
+            </w:r>
+          </w:p>
+          <w:p>
+            <w:pPr>
+              <w:spacing w:before="0" w:after="0" w:line="240" w:lineRule="auto"/>
+            </w:pPr>
+            <w:r>
+              <w:rPr>
+                <w:b w:val="0"/>
+                <w:sz w:val="18"/>
+              </w:rPr>
+              <w:t>By: ________________________________</w:t>
+            </w:r>
+          </w:p>
+          <w:p>
+            <w:pPr>
+              <w:spacing w:before="0" w:after="60" w:line="240" w:lineRule="auto"/>
+            </w:pPr>
+            <w:r>
+              <w:rPr>
+                <w:b w:val="0"/>
+                <w:sz w:val="16"/>
+              </w:rPr>
+              <w:t>as an authorized signer</w:t>
+            </w:r>
+          </w:p>
+          <w:p>
+            <w:pPr>
+              <w:spacing w:before="0" w:after="0" w:line="240" w:lineRule="auto"/>
+            </w:pPr>
+            <w:r>
+              <w:rPr>
+                <w:b w:val="0"/>
+                <w:sz w:val="16"/>
+              </w:rPr>
+              <w:t>Read and approved for investment by:</w:t>
+            </w:r>
+          </w:p>
+          <w:p>
+            <w:pPr>
+              <w:spacing w:before="0" w:after="0" w:line="240" w:lineRule="auto"/>
+            </w:pPr>
+            <w:r>
+              <w:rPr>
+                <w:b w:val="0"/>
+                <w:sz w:val="18"/>
+              </w:rPr>
+              <w:t>____________________________________</w:t>
+            </w:r>
+          </w:p>
+          <w:p>
+            <w:pPr>
+              <w:spacing w:before="0" w:after="120" w:line="240" w:lineRule="auto"/>
+            </w:pPr>
+            <w:r>
+              <w:rPr>
+                <w:b w:val="0"/>
+                <w:sz w:val="16"/>
+              </w:rPr>
+              <w:t>Jeanette W. Hollinger</w:t>
+            </w:r>
+          </w:p>
+        </w:tc>
+        <w:tc>
+          <w:tcPr>
+            <w:tcW w:type="dxa" w:w="4608"/>
+            <w:vAlign w:val="top"/>
+            <w:tcBorders>
+              <w:top w:val="nil"/>
+              <w:left w:val="nil"/>
+              <w:bottom w:val="nil"/>
+              <w:right w:val="nil"/>
+              <w:insideH w:val="nil"/>
+              <w:insideV w:val="nil"/>
+            </w:tcBorders>
+            <w:tcMar>
+              <w:top w:w="40" w:type="dxa"/>
+              <w:start w:w="80" w:type="dxa"/>
+              <w:bottom w:w="40" w:type="dxa"/>
+              <w:end w:w="80" w:type="dxa"/>
+            </w:tcMar>
+          </w:tcPr>
+          <w:p>
+            <w:pPr>
+              <w:spacing w:before="0" w:after="40" w:line="240" w:lineRule="auto"/>
+            </w:pPr>
+            <w:r>
+              <w:rPr>
+                <w:b/>
+                <w:color w:val="008000"/>
+                <w:sz w:val="18"/>
+              </w:rPr>
+              <w:t>Manager:</w:t>
+            </w:r>
+          </w:p>
+          <w:p>
+            <w:pPr>
+              <w:spacing w:before="0" w:after="0" w:line="240" w:lineRule="auto"/>
+            </w:pPr>
+            <w:r>
+              <w:rPr>
+                <w:b w:val="0"/>
+                <w:color w:val="008000"/>
+                <w:sz w:val="18"/>
+              </w:rPr>
+              <w:t>By: ________________________________</w:t>
+            </w:r>
+          </w:p>
+          <w:p>
+            <w:pPr>
+              <w:spacing w:before="0" w:after="120" w:line="240" w:lineRule="auto"/>
+            </w:pPr>
+            <w:r>
+              <w:rPr>
+                <w:b w:val="0"/>
+                <w:color w:val="008000"/>
+                <w:sz w:val="16"/>
+              </w:rPr>
+              <w:t>Joshua Kennedy, Manager</w:t>
+            </w:r>
+          </w:p>
+        </w:tc>
+      </w:tr>
+    </w:tbl>
     <w:p>
       <w:pPr>
         <w:pStyle w:val="Heading1"/>
         <w:keepNext w:val="0"/>
         <w:keepLines w:val="0"/>
-        <w:widowControl w:val="0"/>
-        <w:spacing w:before="0"/>
-        <w:jc w:val="both"/>
-        <w:rPr>
-          <w:b w:val="0"/>
-          <w:bCs w:val="0"/>
-          <w:color w:val="auto"/>
-        </w:rPr>
-      </w:pPr>
-    </w:p>
-    <w:p>
-      <w:pPr>
-        <w:pStyle w:val="Heading1"/>
-        <w:keepNext w:val="0"/>
-        <w:keepLines w:val="0"/>
-        <w:widowControl w:val="0"/>
-        <w:spacing w:before="0"/>
-        <w:ind w:left="3240"/>
-        <w:jc w:val="left"/>
-        <w:rPr>
-          <w:color w:val="auto"/>
-          <w:sz w:val="22"/>
-          <w:szCs w:val="22"/>
-          <w:u w:val="single"/>
-        </w:rPr>
-      </w:pPr>
-      <w:r>
-        <w:rPr>
-          <w:color w:val="auto"/>
-          <w:sz w:val="22"/>
-          <w:szCs w:val="22"/>
-        </w:rPr>
-        <w:t xml:space="preserve">Heritage IRA, FBO Wesley Dale Browning </w:t>
-      </w:r>
-      <w:proofErr w:type="gramStart"/>
-      <w:r>
-        <w:rPr>
-          <w:color w:val="auto"/>
-          <w:sz w:val="22"/>
-          <w:szCs w:val="22"/>
-        </w:rPr>
-        <w:t>HSA</w:t>
-      </w:r>
-      <w:r>
-        <w:rPr>
-          <w:color w:val="auto"/>
-          <w:sz w:val="22"/>
-          <w:szCs w:val="22"/>
-        </w:rPr>
-        <w:t xml:space="preserve"> </w:t>
-      </w:r>
-      <w:r>
-        <w:rPr>
-          <w:color w:val="auto"/>
-          <w:sz w:val="22"/>
-          <w:szCs w:val="22"/>
-        </w:rPr>
-        <w:t xml:space="preserve"> </w:t>
-      </w:r>
-      <w:r>
-        <w:rPr>
-          <w:color w:val="auto"/>
-          <w:sz w:val="22"/>
-          <w:szCs w:val="22"/>
-          <w:u w:val="single"/>
-        </w:rPr>
-        <w:t>#</w:t>
-      </w:r>
-      <w:proofErr w:type="gramEnd"/>
-      <w:r>
-        <w:rPr>
-          <w:color w:val="auto"/>
-          <w:sz w:val="22"/>
-          <w:szCs w:val="22"/>
-          <w:u w:val="single"/>
-        </w:rPr>
-        <w:t>99169956</w:t>
-      </w:r>
-    </w:p>
-    <w:p>
-      <w:pPr>
-        <w:pStyle w:val="Heading1"/>
-        <w:keepNext w:val="0"/>
-        <w:keepLines w:val="0"/>
-        <w:widowControl w:val="0"/>
-        <w:spacing w:before="0"/>
-        <w:ind w:left="3240"/>
-        <w:jc w:val="left"/>
-        <w:rPr>
-          <w:b w:val="0"/>
-          <w:bCs w:val="0"/>
-          <w:color w:val="auto"/>
-          <w:sz w:val="22"/>
-          <w:szCs w:val="22"/>
-        </w:rPr>
-      </w:pPr>
-      <w:proofErr w:type="gramStart"/>
-      <w:r>
-        <w:rPr>
-          <w:b w:val="0"/>
-          <w:bCs w:val="0"/>
-          <w:color w:val="auto"/>
-          <w:sz w:val="22"/>
-          <w:szCs w:val="22"/>
-        </w:rPr>
-        <w:t>By:</w:t>
-      </w:r>
-      <w:r>
-        <w:rPr>
-          <w:b w:val="0"/>
-          <w:bCs w:val="0"/>
-          <w:color w:val="auto"/>
-          <w:sz w:val="22"/>
-          <w:szCs w:val="22"/>
-          <w:u w:val="single"/>
-        </w:rPr>
-        <w:tab/>
-      </w:r>
-      <w:r>
-        <w:rPr>
-          <w:b w:val="0"/>
-          <w:bCs w:val="0"/>
-          <w:color w:val="auto"/>
-          <w:sz w:val="22"/>
-          <w:szCs w:val="22"/>
-          <w:u w:val="single"/>
-        </w:rPr>
-        <w:tab/>
-      </w:r>
-      <w:r>
-        <w:rPr>
-          <w:b w:val="0"/>
-          <w:bCs w:val="0"/>
-          <w:color w:val="auto"/>
-          <w:sz w:val="22"/>
-          <w:szCs w:val="22"/>
-          <w:u w:val="single"/>
-        </w:rPr>
-        <w:tab/>
-      </w:r>
-      <w:r>
-        <w:rPr>
-          <w:b w:val="0"/>
-          <w:bCs w:val="0"/>
-          <w:color w:val="auto"/>
-          <w:sz w:val="22"/>
-          <w:szCs w:val="22"/>
-          <w:u w:val="single"/>
-        </w:rPr>
-        <w:tab/>
-      </w:r>
-      <w:r>
-        <w:rPr>
-          <w:b w:val="0"/>
-          <w:bCs w:val="0"/>
-          <w:color w:val="auto"/>
-          <w:sz w:val="22"/>
-          <w:szCs w:val="22"/>
-          <w:u w:val="single"/>
-        </w:rPr>
-        <w:tab/>
-      </w:r>
-      <w:r>
-        <w:rPr>
-          <w:b w:val="0"/>
-          <w:bCs w:val="0"/>
-          <w:color w:val="auto"/>
-          <w:sz w:val="22"/>
-          <w:szCs w:val="22"/>
-          <w:u w:val="single"/>
-        </w:rPr>
-        <w:tab/>
-      </w:r>
-      <w:r>
-        <w:rPr>
-          <w:b w:val="0"/>
-          <w:bCs w:val="0"/>
-          <w:color w:val="auto"/>
-          <w:sz w:val="22"/>
-          <w:szCs w:val="22"/>
-          <w:u w:val="single"/>
-        </w:rPr>
-        <w:tab/>
-      </w:r>
-      <w:r>
-        <w:rPr>
-          <w:b w:val="0"/>
-          <w:bCs w:val="0"/>
-          <w:color w:val="auto"/>
-          <w:sz w:val="22"/>
-          <w:szCs w:val="22"/>
-        </w:rPr>
-        <w:t>,</w:t>
-      </w:r>
-      <w:proofErr w:type="gramEnd"/>
-      <w:r>
-        <w:rPr>
-          <w:b w:val="0"/>
-          <w:bCs w:val="0"/>
-          <w:color w:val="auto"/>
-          <w:sz w:val="22"/>
-          <w:szCs w:val="22"/>
-        </w:rPr>
-        <w:t xml:space="preserve"> </w:t>
-      </w:r>
-    </w:p>
-    <w:p>
-      <w:pPr>
-        <w:pStyle w:val="Heading1"/>
-        <w:keepNext w:val="0"/>
-        <w:keepLines w:val="0"/>
-        <w:widowControl w:val="0"/>
-        <w:spacing w:before="0"/>
-        <w:ind w:left="3240"/>
-        <w:jc w:val="left"/>
-        <w:rPr>
-          <w:b w:val="0"/>
-          <w:bCs w:val="0"/>
-          <w:color w:val="auto"/>
-          <w:sz w:val="22"/>
-          <w:szCs w:val="22"/>
-        </w:rPr>
-      </w:pPr>
-      <w:r>
-        <w:rPr>
-          <w:b w:val="0"/>
-          <w:bCs w:val="0"/>
-          <w:color w:val="auto"/>
-          <w:sz w:val="22"/>
-          <w:szCs w:val="22"/>
-        </w:rPr>
-        <w:t>as an authorized signer</w:t>
-      </w:r>
-    </w:p>
-    <w:p>
-      <w:pPr>
-        <w:pStyle w:val="Heading1"/>
-        <w:keepNext w:val="0"/>
-        <w:keepLines w:val="0"/>
-        <w:widowControl w:val="0"/>
-        <w:spacing w:before="0"/>
-        <w:ind w:left="3240"/>
-        <w:jc w:val="left"/>
-        <w:rPr>
-          <w:color w:val="auto"/>
-          <w:sz w:val="22"/>
-          <w:szCs w:val="22"/>
-        </w:rPr>
-      </w:pPr>
-      <w:r>
-        <w:rPr>
-          <w:color w:val="auto"/>
-          <w:sz w:val="22"/>
-          <w:szCs w:val="22"/>
-        </w:rPr>
-        <w:t>Read and approved for investment by:</w:t>
-      </w:r>
-    </w:p>
-    <w:p>
-      <w:pPr>
-        <w:pStyle w:val="Heading1"/>
-        <w:keepNext w:val="0"/>
-        <w:keepLines w:val="0"/>
-        <w:widowControl w:val="0"/>
-        <w:spacing w:before="0"/>
-        <w:ind w:left="3240"/>
-        <w:jc w:val="left"/>
-        <w:rPr>
-          <w:b w:val="0"/>
-          <w:bCs w:val="0"/>
-          <w:color w:val="auto"/>
-          <w:sz w:val="22"/>
-          <w:szCs w:val="22"/>
-        </w:rPr>
-      </w:pPr>
-      <w:r>
-        <w:rPr>
-          <w:b w:val="0"/>
-          <w:bCs w:val="0"/>
-          <w:color w:val="auto"/>
-          <w:sz w:val="22"/>
-          <w:szCs w:val="22"/>
-          <w:u w:val="single"/>
-        </w:rPr>
-        <w:tab/>
-      </w:r>
-      <w:r>
-        <w:rPr>
-          <w:b w:val="0"/>
-          <w:bCs w:val="0"/>
-          <w:color w:val="auto"/>
-          <w:sz w:val="22"/>
-          <w:szCs w:val="22"/>
-          <w:u w:val="single"/>
-        </w:rPr>
-        <w:tab/>
-      </w:r>
-      <w:r>
-        <w:rPr>
-          <w:b w:val="0"/>
-          <w:bCs w:val="0"/>
-          <w:color w:val="auto"/>
-          <w:sz w:val="22"/>
-          <w:szCs w:val="22"/>
-          <w:u w:val="single"/>
-        </w:rPr>
-        <w:tab/>
-      </w:r>
-      <w:r>
-        <w:rPr>
-          <w:b w:val="0"/>
-          <w:bCs w:val="0"/>
-          <w:color w:val="auto"/>
-          <w:sz w:val="22"/>
-          <w:szCs w:val="22"/>
-          <w:u w:val="single"/>
-        </w:rPr>
-        <w:tab/>
-      </w:r>
-      <w:r>
-        <w:rPr>
-          <w:b w:val="0"/>
-          <w:bCs w:val="0"/>
-          <w:color w:val="auto"/>
-          <w:sz w:val="22"/>
-          <w:szCs w:val="22"/>
-          <w:u w:val="single"/>
-        </w:rPr>
-        <w:tab/>
-      </w:r>
-      <w:r>
-        <w:rPr>
-          <w:b w:val="0"/>
-          <w:bCs w:val="0"/>
-          <w:color w:val="auto"/>
-          <w:sz w:val="22"/>
-          <w:szCs w:val="22"/>
-          <w:u w:val="single"/>
-        </w:rPr>
-        <w:tab/>
-      </w:r>
-      <w:r>
-        <w:rPr>
-          <w:b w:val="0"/>
-          <w:bCs w:val="0"/>
-          <w:color w:val="auto"/>
-          <w:sz w:val="22"/>
-          <w:szCs w:val="22"/>
-          <w:u w:val="single"/>
-        </w:rPr>
-        <w:tab/>
-      </w:r>
-    </w:p>
-    <w:p>
-      <w:pPr>
-        <w:pStyle w:val="Heading1"/>
-        <w:keepNext w:val="0"/>
-        <w:keepLines w:val="0"/>
-        <w:widowControl w:val="0"/>
-        <w:spacing w:before="0"/>
-        <w:ind w:left="3240"/>
-        <w:jc w:val="left"/>
-        <w:rPr>
-          <w:b w:val="0"/>
-          <w:bCs w:val="0"/>
-          <w:color w:val="auto"/>
-          <w:sz w:val="22"/>
-          <w:szCs w:val="22"/>
-        </w:rPr>
-      </w:pPr>
-      <w:r>
-        <w:rPr>
-          <w:b w:val="0"/>
-          <w:bCs w:val="0"/>
-          <w:color w:val="auto"/>
-          <w:sz w:val="22"/>
-          <w:szCs w:val="22"/>
-        </w:rPr>
-        <w:t>Wesley Dale Browning, Accountholder</w:t>
-      </w:r>
-    </w:p>
-    <w:p>
-      <w:pPr>
-        <w:widowControl w:val="0"/>
-        <w:ind w:left="3240"/>
-        <w:rPr>
-          <w:sz w:val="22"/>
-        </w:rPr>
-      </w:pPr>
-    </w:p>
-    <w:p>
-      <w:pPr>
-        <w:pStyle w:val="Heading1"/>
-        <w:keepNext w:val="0"/>
-        <w:keepLines w:val="0"/>
-        <w:widowControl w:val="0"/>
-        <w:spacing w:before="0"/>
-        <w:ind w:left="3240"/>
-        <w:jc w:val="left"/>
-        <w:rPr>
-          <w:color w:val="auto"/>
-          <w:sz w:val="22"/>
-          <w:szCs w:val="22"/>
-        </w:rPr>
-      </w:pPr>
-      <w:r>
-        <w:rPr>
-          <w:color w:val="auto"/>
-          <w:sz w:val="22"/>
-          <w:szCs w:val="22"/>
-        </w:rPr>
-        <w:t>Heritage IRA, FBO Wesley Dale Browning Roth</w:t>
-      </w:r>
-      <w:r>
-        <w:rPr>
-          <w:color w:val="auto"/>
-          <w:sz w:val="22"/>
-          <w:szCs w:val="22"/>
-        </w:rPr>
-        <w:t xml:space="preserve"> </w:t>
-      </w:r>
-      <w:r>
-        <w:rPr>
-          <w:color w:val="auto"/>
-          <w:sz w:val="22"/>
-          <w:szCs w:val="22"/>
-        </w:rPr>
-        <w:t>IRA #</w:t>
-      </w:r>
-      <w:r>
-        <w:rPr>
-          <w:color w:val="auto"/>
-          <w:sz w:val="22"/>
-          <w:szCs w:val="22"/>
-          <w:u w:val="single"/>
-        </w:rPr>
-        <w:t>8870274</w:t>
-      </w:r>
-      <w:r>
-        <w:rPr>
-          <w:rFonts w:ascii="Calibri" w:eastAsia="Calibri" w:hAnsi="Calibri" w:cs="Calibri"/>
-          <w:sz w:val="24"/>
-        </w:rPr>
-        <w:t xml:space="preserve">  </w:t>
-      </w:r>
-    </w:p>
-    <w:p>
-      <w:pPr>
-        <w:pStyle w:val="Heading1"/>
-        <w:keepNext w:val="0"/>
-        <w:keepLines w:val="0"/>
-        <w:widowControl w:val="0"/>
-        <w:spacing w:before="0"/>
-        <w:ind w:left="3240"/>
-        <w:jc w:val="left"/>
-        <w:rPr>
-          <w:b w:val="0"/>
-          <w:bCs w:val="0"/>
-          <w:color w:val="auto"/>
-          <w:sz w:val="22"/>
-          <w:szCs w:val="22"/>
-        </w:rPr>
-      </w:pPr>
-      <w:proofErr w:type="gramStart"/>
-      <w:r>
-        <w:rPr>
-          <w:b w:val="0"/>
-          <w:bCs w:val="0"/>
-          <w:color w:val="auto"/>
-          <w:sz w:val="22"/>
-          <w:szCs w:val="22"/>
-        </w:rPr>
-        <w:t>By:</w:t>
-      </w:r>
-      <w:r>
-        <w:rPr>
-          <w:b w:val="0"/>
-          <w:bCs w:val="0"/>
-          <w:color w:val="auto"/>
-          <w:sz w:val="22"/>
-          <w:szCs w:val="22"/>
-          <w:u w:val="single"/>
-        </w:rPr>
-        <w:tab/>
-      </w:r>
-      <w:r>
-        <w:rPr>
-          <w:b w:val="0"/>
-          <w:bCs w:val="0"/>
-          <w:color w:val="auto"/>
-          <w:sz w:val="22"/>
-          <w:szCs w:val="22"/>
-          <w:u w:val="single"/>
-        </w:rPr>
-        <w:tab/>
-      </w:r>
-      <w:r>
-        <w:rPr>
-          <w:b w:val="0"/>
-          <w:bCs w:val="0"/>
-          <w:color w:val="auto"/>
-          <w:sz w:val="22"/>
-          <w:szCs w:val="22"/>
-          <w:u w:val="single"/>
-        </w:rPr>
-        <w:tab/>
-      </w:r>
-      <w:r>
-        <w:rPr>
-          <w:b w:val="0"/>
-          <w:bCs w:val="0"/>
-          <w:color w:val="auto"/>
-          <w:sz w:val="22"/>
-          <w:szCs w:val="22"/>
-          <w:u w:val="single"/>
-        </w:rPr>
-        <w:tab/>
-      </w:r>
-      <w:r>
-        <w:rPr>
-          <w:b w:val="0"/>
-          <w:bCs w:val="0"/>
-          <w:color w:val="auto"/>
-          <w:sz w:val="22"/>
-          <w:szCs w:val="22"/>
-          <w:u w:val="single"/>
-        </w:rPr>
-        <w:tab/>
-      </w:r>
-      <w:r>
-        <w:rPr>
-          <w:b w:val="0"/>
-          <w:bCs w:val="0"/>
-          <w:color w:val="auto"/>
-          <w:sz w:val="22"/>
-          <w:szCs w:val="22"/>
-          <w:u w:val="single"/>
-        </w:rPr>
-        <w:tab/>
-      </w:r>
-      <w:r>
-        <w:rPr>
-          <w:b w:val="0"/>
-          <w:bCs w:val="0"/>
-          <w:color w:val="auto"/>
-          <w:sz w:val="22"/>
-          <w:szCs w:val="22"/>
-          <w:u w:val="single"/>
-        </w:rPr>
-        <w:tab/>
-      </w:r>
-      <w:r>
-        <w:rPr>
-          <w:b w:val="0"/>
-          <w:bCs w:val="0"/>
-          <w:color w:val="auto"/>
-          <w:sz w:val="22"/>
-          <w:szCs w:val="22"/>
-        </w:rPr>
-        <w:t>,</w:t>
-      </w:r>
-      <w:proofErr w:type="gramEnd"/>
-      <w:r>
-        <w:rPr>
-          <w:b w:val="0"/>
-          <w:bCs w:val="0"/>
-          <w:color w:val="auto"/>
-          <w:sz w:val="22"/>
-          <w:szCs w:val="22"/>
-        </w:rPr>
-        <w:t xml:space="preserve"> </w:t>
-      </w:r>
-    </w:p>
-    <w:p>
-      <w:pPr>
-        <w:pStyle w:val="Heading1"/>
-        <w:keepNext w:val="0"/>
-        <w:keepLines w:val="0"/>
-        <w:widowControl w:val="0"/>
-        <w:spacing w:before="0"/>
-        <w:ind w:left="3240"/>
-        <w:jc w:val="left"/>
-        <w:rPr>
-          <w:b w:val="0"/>
-          <w:bCs w:val="0"/>
-          <w:color w:val="auto"/>
-          <w:sz w:val="22"/>
-          <w:szCs w:val="22"/>
-        </w:rPr>
-      </w:pPr>
-      <w:r>
-        <w:rPr>
-          <w:b w:val="0"/>
-          <w:bCs w:val="0"/>
-          <w:color w:val="auto"/>
-          <w:sz w:val="22"/>
-          <w:szCs w:val="22"/>
-        </w:rPr>
-        <w:t>as an authorized signer</w:t>
-      </w:r>
-    </w:p>
-    <w:p>
-      <w:pPr>
-        <w:pStyle w:val="Heading1"/>
-        <w:keepNext w:val="0"/>
-        <w:keepLines w:val="0"/>
-        <w:widowControl w:val="0"/>
-        <w:spacing w:before="0"/>
-        <w:ind w:left="3240"/>
-        <w:jc w:val="left"/>
-        <w:rPr>
-          <w:color w:val="auto"/>
-          <w:sz w:val="22"/>
-          <w:szCs w:val="22"/>
-        </w:rPr>
-      </w:pPr>
-      <w:r>
-        <w:rPr>
-          <w:color w:val="auto"/>
-          <w:sz w:val="22"/>
-          <w:szCs w:val="22"/>
-        </w:rPr>
-        <w:t>Read and approved for investment by:</w:t>
-      </w:r>
-    </w:p>
-    <w:p>
-      <w:pPr>
-        <w:pStyle w:val="Heading1"/>
-        <w:keepNext w:val="0"/>
-        <w:keepLines w:val="0"/>
-        <w:widowControl w:val="0"/>
-        <w:spacing w:before="0"/>
-        <w:ind w:left="3240"/>
-        <w:jc w:val="left"/>
-        <w:rPr>
-          <w:b w:val="0"/>
-          <w:bCs w:val="0"/>
-          <w:color w:val="auto"/>
-          <w:sz w:val="22"/>
-          <w:szCs w:val="22"/>
-        </w:rPr>
-      </w:pPr>
-      <w:r>
-        <w:rPr>
-          <w:b w:val="0"/>
-          <w:bCs w:val="0"/>
-          <w:color w:val="auto"/>
-          <w:sz w:val="22"/>
-          <w:szCs w:val="22"/>
-          <w:u w:val="single"/>
-        </w:rPr>
-        <w:tab/>
-      </w:r>
-      <w:r>
-        <w:rPr>
-          <w:b w:val="0"/>
-          <w:bCs w:val="0"/>
-          <w:color w:val="auto"/>
-          <w:sz w:val="22"/>
-          <w:szCs w:val="22"/>
-          <w:u w:val="single"/>
-        </w:rPr>
-        <w:tab/>
-      </w:r>
-      <w:r>
-        <w:rPr>
-          <w:b w:val="0"/>
-          <w:bCs w:val="0"/>
-          <w:color w:val="auto"/>
-          <w:sz w:val="22"/>
-          <w:szCs w:val="22"/>
-          <w:u w:val="single"/>
-        </w:rPr>
-        <w:tab/>
-      </w:r>
-      <w:r>
-        <w:rPr>
-          <w:b w:val="0"/>
-          <w:bCs w:val="0"/>
-          <w:color w:val="auto"/>
-          <w:sz w:val="22"/>
-          <w:szCs w:val="22"/>
-          <w:u w:val="single"/>
-        </w:rPr>
-        <w:tab/>
-      </w:r>
-      <w:r>
-        <w:rPr>
-          <w:b w:val="0"/>
-          <w:bCs w:val="0"/>
-          <w:color w:val="auto"/>
-          <w:sz w:val="22"/>
-          <w:szCs w:val="22"/>
-          <w:u w:val="single"/>
-        </w:rPr>
-        <w:tab/>
-      </w:r>
-      <w:r>
-        <w:rPr>
-          <w:b w:val="0"/>
-          <w:bCs w:val="0"/>
-          <w:color w:val="auto"/>
-          <w:sz w:val="22"/>
-          <w:szCs w:val="22"/>
-          <w:u w:val="single"/>
-        </w:rPr>
-        <w:tab/>
-      </w:r>
-      <w:r>
-        <w:rPr>
-          <w:b w:val="0"/>
-          <w:bCs w:val="0"/>
-          <w:color w:val="auto"/>
-          <w:sz w:val="22"/>
-          <w:szCs w:val="22"/>
-          <w:u w:val="single"/>
-        </w:rPr>
-        <w:tab/>
-      </w:r>
-    </w:p>
-    <w:p>
-      <w:pPr>
-        <w:pStyle w:val="Heading1"/>
-        <w:keepNext w:val="0"/>
-        <w:keepLines w:val="0"/>
-        <w:widowControl w:val="0"/>
-        <w:spacing w:before="0"/>
-        <w:ind w:left="3240"/>
-        <w:jc w:val="left"/>
-        <w:rPr>
-          <w:b w:val="0"/>
-          <w:bCs w:val="0"/>
-          <w:color w:val="auto"/>
-          <w:sz w:val="22"/>
-          <w:szCs w:val="22"/>
-        </w:rPr>
-      </w:pPr>
-      <w:r>
-        <w:rPr>
-          <w:b w:val="0"/>
-          <w:bCs w:val="0"/>
-          <w:color w:val="auto"/>
-          <w:sz w:val="22"/>
-          <w:szCs w:val="22"/>
-        </w:rPr>
-        <w:t>Wesley Dale Browning, Accountholder</w:t>
-      </w:r>
-    </w:p>
-    <w:p>
-      <w:pPr>
-        <w:pStyle w:val="Heading1"/>
-        <w:keepNext w:val="0"/>
-        <w:keepLines w:val="0"/>
-        <w:widowControl w:val="0"/>
-        <w:spacing w:before="0"/>
-        <w:ind w:left="3240"/>
-        <w:jc w:val="left"/>
-        <w:rPr>
-          <w:b w:val="0"/>
-          <w:bCs w:val="0"/>
-          <w:color w:val="auto"/>
-          <w:sz w:val="22"/>
-          <w:szCs w:val="22"/>
-        </w:rPr>
-      </w:pPr>
-    </w:p>
-    <w:p>
-      <w:pPr>
-        <w:pStyle w:val="Heading1"/>
-        <w:keepNext w:val="0"/>
-        <w:keepLines w:val="0"/>
-        <w:widowControl w:val="0"/>
-        <w:spacing w:before="0"/>
-        <w:ind w:left="3240"/>
-        <w:jc w:val="left"/>
-        <w:rPr>
-          <w:b w:val="0"/>
-          <w:bCs w:val="0"/>
-          <w:color w:val="auto"/>
-          <w:sz w:val="22"/>
-          <w:szCs w:val="22"/>
-        </w:rPr>
-      </w:pPr>
-    </w:p>
-    <w:p>
-      <w:pPr>
-        <w:pStyle w:val="Heading1"/>
-        <w:keepNext w:val="0"/>
-        <w:keepLines w:val="0"/>
-        <w:widowControl w:val="0"/>
-        <w:spacing w:before="0"/>
-        <w:ind w:left="3240"/>
-        <w:jc w:val="left"/>
-        <w:rPr>
-          <w:color w:val="auto"/>
-          <w:sz w:val="22"/>
-          <w:szCs w:val="22"/>
-          <w:u w:val="single"/>
-        </w:rPr>
-      </w:pPr>
-      <w:r>
-        <w:rPr>
-          <w:color w:val="auto"/>
-          <w:sz w:val="22"/>
-          <w:szCs w:val="22"/>
-        </w:rPr>
-        <w:t>Heritage IRA, FBO Jeanette W.</w:t>
-      </w:r>
-      <w:r>
-        <w:rPr>
-          <w:color w:val="auto"/>
-          <w:sz w:val="22"/>
-          <w:szCs w:val="22"/>
-        </w:rPr>
-        <w:t xml:space="preserve"> Hollinger Roth </w:t>
-      </w:r>
-      <w:r>
-        <w:rPr>
-          <w:color w:val="auto"/>
-          <w:sz w:val="22"/>
-          <w:szCs w:val="22"/>
-        </w:rPr>
-        <w:t>IRA #</w:t>
-      </w:r>
-      <w:r>
-        <w:rPr>
-          <w:color w:val="auto"/>
-          <w:sz w:val="22"/>
-          <w:szCs w:val="22"/>
-          <w:u w:val="single"/>
-        </w:rPr>
-        <w:t>61077178</w:t>
-      </w:r>
-    </w:p>
-    <w:p>
-      <w:pPr>
-        <w:pStyle w:val="Heading1"/>
-        <w:keepNext w:val="0"/>
-        <w:keepLines w:val="0"/>
-        <w:widowControl w:val="0"/>
-        <w:spacing w:before="0"/>
-        <w:ind w:left="3240"/>
-        <w:jc w:val="left"/>
-        <w:rPr>
-          <w:b w:val="0"/>
-          <w:bCs w:val="0"/>
-          <w:color w:val="auto"/>
-          <w:sz w:val="22"/>
-          <w:szCs w:val="22"/>
-        </w:rPr>
-      </w:pPr>
-      <w:proofErr w:type="gramStart"/>
-      <w:r>
-        <w:rPr>
-          <w:b w:val="0"/>
-          <w:bCs w:val="0"/>
-          <w:color w:val="auto"/>
-          <w:sz w:val="22"/>
-          <w:szCs w:val="22"/>
-        </w:rPr>
-        <w:t>By:</w:t>
-      </w:r>
-      <w:r>
-        <w:rPr>
-          <w:b w:val="0"/>
-          <w:bCs w:val="0"/>
-          <w:color w:val="auto"/>
-          <w:sz w:val="22"/>
-          <w:szCs w:val="22"/>
-          <w:u w:val="single"/>
-        </w:rPr>
-        <w:tab/>
-      </w:r>
-      <w:r>
-        <w:rPr>
-          <w:b w:val="0"/>
-          <w:bCs w:val="0"/>
-          <w:color w:val="auto"/>
-          <w:sz w:val="22"/>
-          <w:szCs w:val="22"/>
-          <w:u w:val="single"/>
-        </w:rPr>
-        <w:tab/>
-      </w:r>
-      <w:r>
-        <w:rPr>
-          <w:b w:val="0"/>
-          <w:bCs w:val="0"/>
-          <w:color w:val="auto"/>
-          <w:sz w:val="22"/>
-          <w:szCs w:val="22"/>
-          <w:u w:val="single"/>
-        </w:rPr>
-        <w:tab/>
-      </w:r>
-      <w:r>
-        <w:rPr>
-          <w:b w:val="0"/>
-          <w:bCs w:val="0"/>
-          <w:color w:val="auto"/>
-          <w:sz w:val="22"/>
-          <w:szCs w:val="22"/>
-          <w:u w:val="single"/>
-        </w:rPr>
-        <w:tab/>
-      </w:r>
-      <w:r>
-        <w:rPr>
-          <w:b w:val="0"/>
-          <w:bCs w:val="0"/>
-          <w:color w:val="auto"/>
-          <w:sz w:val="22"/>
-          <w:szCs w:val="22"/>
-          <w:u w:val="single"/>
-        </w:rPr>
-        <w:tab/>
-      </w:r>
-      <w:r>
-        <w:rPr>
-          <w:b w:val="0"/>
-          <w:bCs w:val="0"/>
-          <w:color w:val="auto"/>
-          <w:sz w:val="22"/>
-          <w:szCs w:val="22"/>
-          <w:u w:val="single"/>
-        </w:rPr>
-        <w:tab/>
-      </w:r>
-      <w:r>
-        <w:rPr>
-          <w:b w:val="0"/>
-          <w:bCs w:val="0"/>
-          <w:color w:val="auto"/>
-          <w:sz w:val="22"/>
-          <w:szCs w:val="22"/>
-          <w:u w:val="single"/>
-        </w:rPr>
-        <w:tab/>
-      </w:r>
-      <w:r>
-        <w:rPr>
-          <w:b w:val="0"/>
-          <w:bCs w:val="0"/>
-          <w:color w:val="auto"/>
-          <w:sz w:val="22"/>
-          <w:szCs w:val="22"/>
-        </w:rPr>
-        <w:t>,</w:t>
-      </w:r>
-      <w:proofErr w:type="gramEnd"/>
-      <w:r>
-        <w:rPr>
-          <w:b w:val="0"/>
-          <w:bCs w:val="0"/>
-          <w:color w:val="auto"/>
-          <w:sz w:val="22"/>
-          <w:szCs w:val="22"/>
-        </w:rPr>
-        <w:t xml:space="preserve"> </w:t>
-      </w:r>
-    </w:p>
-    <w:p>
-      <w:pPr>
-        <w:pStyle w:val="Heading1"/>
-        <w:keepNext w:val="0"/>
-        <w:keepLines w:val="0"/>
-        <w:widowControl w:val="0"/>
-        <w:spacing w:before="0"/>
-        <w:ind w:left="3240"/>
-        <w:jc w:val="left"/>
-        <w:rPr>
-          <w:b w:val="0"/>
-          <w:bCs w:val="0"/>
-          <w:color w:val="auto"/>
-          <w:sz w:val="22"/>
-          <w:szCs w:val="22"/>
-        </w:rPr>
-      </w:pPr>
-      <w:r>
-        <w:rPr>
-          <w:b w:val="0"/>
-          <w:bCs w:val="0"/>
-          <w:color w:val="auto"/>
-          <w:sz w:val="22"/>
-          <w:szCs w:val="22"/>
-        </w:rPr>
-        <w:t>as an authorized signer</w:t>
-      </w:r>
-    </w:p>
-    <w:p>
-      <w:pPr>
-        <w:pStyle w:val="Heading1"/>
-        <w:keepNext w:val="0"/>
-        <w:keepLines w:val="0"/>
-        <w:widowControl w:val="0"/>
-        <w:spacing w:before="0"/>
-        <w:ind w:left="3240"/>
-        <w:jc w:val="left"/>
-        <w:rPr>
-          <w:color w:val="auto"/>
-          <w:sz w:val="22"/>
-          <w:szCs w:val="22"/>
-        </w:rPr>
-      </w:pPr>
-      <w:r>
-        <w:rPr>
-          <w:color w:val="auto"/>
-          <w:sz w:val="22"/>
-          <w:szCs w:val="22"/>
-        </w:rPr>
-        <w:t>Read and approved for investment by:</w:t>
-      </w:r>
-    </w:p>
-    <w:p>
-      <w:pPr>
-        <w:pStyle w:val="Heading1"/>
-        <w:keepNext w:val="0"/>
-        <w:keepLines w:val="0"/>
-        <w:widowControl w:val="0"/>
-        <w:spacing w:before="0"/>
-        <w:ind w:left="3240"/>
-        <w:jc w:val="left"/>
-        <w:rPr>
-          <w:b w:val="0"/>
-          <w:bCs w:val="0"/>
-          <w:color w:val="auto"/>
-          <w:sz w:val="22"/>
-          <w:szCs w:val="22"/>
-        </w:rPr>
-      </w:pPr>
-      <w:r>
-        <w:rPr>
-          <w:b w:val="0"/>
-          <w:bCs w:val="0"/>
-          <w:color w:val="auto"/>
-          <w:sz w:val="22"/>
-          <w:szCs w:val="22"/>
-          <w:u w:val="single"/>
-        </w:rPr>
-        <w:tab/>
-      </w:r>
-      <w:r>
-        <w:rPr>
-          <w:b w:val="0"/>
-          <w:bCs w:val="0"/>
-          <w:color w:val="auto"/>
-          <w:sz w:val="22"/>
-          <w:szCs w:val="22"/>
-          <w:u w:val="single"/>
-        </w:rPr>
-        <w:tab/>
-      </w:r>
-      <w:r>
-        <w:rPr>
-          <w:b w:val="0"/>
-          <w:bCs w:val="0"/>
-          <w:color w:val="auto"/>
-          <w:sz w:val="22"/>
-          <w:szCs w:val="22"/>
-          <w:u w:val="single"/>
-        </w:rPr>
-        <w:tab/>
-      </w:r>
-      <w:r>
-        <w:rPr>
-          <w:b w:val="0"/>
-          <w:bCs w:val="0"/>
-          <w:color w:val="auto"/>
-          <w:sz w:val="22"/>
-          <w:szCs w:val="22"/>
-          <w:u w:val="single"/>
-        </w:rPr>
-        <w:tab/>
-      </w:r>
-      <w:r>
-        <w:rPr>
-          <w:b w:val="0"/>
-          <w:bCs w:val="0"/>
-          <w:color w:val="auto"/>
-          <w:sz w:val="22"/>
-          <w:szCs w:val="22"/>
-          <w:u w:val="single"/>
-        </w:rPr>
-        <w:tab/>
-      </w:r>
-      <w:r>
-        <w:rPr>
-          <w:b w:val="0"/>
-          <w:bCs w:val="0"/>
-          <w:color w:val="auto"/>
-          <w:sz w:val="22"/>
-          <w:szCs w:val="22"/>
-          <w:u w:val="single"/>
-        </w:rPr>
-        <w:tab/>
-      </w:r>
-      <w:r>
-        <w:rPr>
-          <w:b w:val="0"/>
-          <w:bCs w:val="0"/>
-          <w:color w:val="auto"/>
-          <w:sz w:val="22"/>
-          <w:szCs w:val="22"/>
-          <w:u w:val="single"/>
-        </w:rPr>
-        <w:tab/>
-      </w:r>
-    </w:p>
-    <w:p>
-      <w:pPr>
-        <w:pStyle w:val="Heading1"/>
-        <w:keepNext w:val="0"/>
-        <w:keepLines w:val="0"/>
-        <w:widowControl w:val="0"/>
-        <w:spacing w:before="0"/>
-        <w:ind w:left="3240"/>
-        <w:jc w:val="left"/>
-        <w:rPr>
-          <w:b w:val="0"/>
-          <w:bCs w:val="0"/>
-          <w:color w:val="auto"/>
-          <w:sz w:val="22"/>
-          <w:szCs w:val="22"/>
-        </w:rPr>
-      </w:pPr>
-      <w:r>
-        <w:rPr>
-          <w:b w:val="0"/>
-          <w:bCs w:val="0"/>
-          <w:color w:val="auto"/>
-          <w:sz w:val="22"/>
-          <w:szCs w:val="22"/>
-        </w:rPr>
-        <w:t>Jeanette W.</w:t>
-      </w:r>
-      <w:r>
-        <w:rPr>
-          <w:b w:val="0"/>
-          <w:bCs w:val="0"/>
-          <w:color w:val="auto"/>
-          <w:sz w:val="22"/>
-          <w:szCs w:val="22"/>
-        </w:rPr>
-        <w:t xml:space="preserve"> Hollinger</w:t>
-      </w:r>
-    </w:p>
-    <w:p>
-      <w:pPr>
-        <w:pStyle w:val="Heading1"/>
-        <w:ind w:left="3330"/>
-      </w:pPr>
-      <w:r>
-        <w:br w:type="page"/>
-      </w:r>
-    </w:p>
-    <w:p/>
-    <w:p>
-      <w:r>
-        <w:rPr>
-          <w:b/>
-          <w:color w:val="008000"/>
-        </w:rPr>
-        <w:t>Manager:</w:t>
-      </w:r>
-    </w:p>
-    <w:p>
-      <w:r>
-        <w:rPr>
-          <w:b w:val="0"/>
-          <w:color w:val="008000"/>
-        </w:rPr>
-        <w:t>By:</w:t>
-        <w:tab/>
-        <w:tab/>
-        <w:tab/>
-        <w:tab/>
-        <w:tab/>
-        <w:tab/>
-        <w:tab/>
-        <w:t xml:space="preserve">, </w:t>
-      </w:r>
-    </w:p>
-    <w:p>
-      <w:r>
-        <w:rPr>
-          <w:b w:val="0"/>
-          <w:color w:val="008000"/>
-        </w:rPr>
-        <w:t>Joshua Kennedy, Manager</w:t>
-      </w:r>
-    </w:p>
-    <w:p>
-      <w:pPr>
-        <w:pStyle w:val="Heading1"/>
-        <w:keepNext w:val="0"/>
-        <w:keepLines w:val="0"/>
+        <w:pageBreakBefore/>
         <w:widowControl w:val="0"/>
         <w:rPr>
           <w:color w:val="auto"/>

</xml_diff>

<commit_message>
Add SYH entity manager language to OA stack
</commit_message>
<xml_diff>
--- a/Project Rooms/Operating Agreements/sources/Jeff Watson/Simplified OA - 25-06-25 SELL_YOUR_HOME_LLC Simplified with Summary with Jeff Watson tracked edits.docx
+++ b/Project Rooms/Operating Agreements/sources/Jeff Watson/Simplified OA - 25-06-25 SELL_YOUR_HOME_LLC Simplified with Summary with Jeff Watson tracked edits.docx
@@ -7087,6 +7087,15 @@
           <w:color w:val="008000"/>
         </w:rPr>
         <w:t>Current Manager(s). Joshua Kennedy is the current Manager of the Company and will serve until replaced, resignation, or removal under this Agreement.</w:t>
+      </w:r>
+    </w:p>
+    <w:p>
+      <w:pPr/>
+      <w:r>
+        <w:rPr>
+          <w:color w:val="008000"/>
+        </w:rPr>
+        <w:t>Entity Manager Authority. Investment Services LLC may serve as a Manager of the Company. When Investment Services LLC acts as Manager, it may act through its authorized manager or other authorized representative, and that person may sign on behalf of Investment Services LLC in its capacity as Manager.</w:t>
       </w:r>
     </w:p>
     <w:p>
@@ -12102,6 +12111,55 @@
                 <w:sz w:val="16"/>
               </w:rPr>
               <w:t>Joshua Kennedy, Manager</w:t>
+            </w:r>
+          </w:p>
+          <w:p>
+            <w:r>
+              <w:rPr>
+                <w:b w:val="0"/>
+                <w:color w:val="008000"/>
+                <w:sz w:val="18"/>
+              </w:rPr>
+            </w:r>
+          </w:p>
+          <w:p>
+            <w:r>
+              <w:rPr>
+                <w:b/>
+                <w:color w:val="008000"/>
+                <w:sz w:val="18"/>
+              </w:rPr>
+              <w:t>Investment Services LLC, Manager</w:t>
+            </w:r>
+          </w:p>
+          <w:p>
+            <w:r>
+              <w:rPr>
+                <w:b w:val="0"/>
+                <w:color w:val="008000"/>
+                <w:sz w:val="18"/>
+              </w:rPr>
+              <w:t>By: ________________________________</w:t>
+            </w:r>
+          </w:p>
+          <w:p>
+            <w:r>
+              <w:rPr>
+                <w:b w:val="0"/>
+                <w:color w:val="008000"/>
+                <w:sz w:val="16"/>
+              </w:rPr>
+              <w:t>Printed Name: ______________________</w:t>
+            </w:r>
+          </w:p>
+          <w:p>
+            <w:r>
+              <w:rPr>
+                <w:b w:val="0"/>
+                <w:color w:val="008000"/>
+                <w:sz w:val="16"/>
+              </w:rPr>
+              <w:t>Title: Manager of Investment Services LLC</w:t>
             </w:r>
           </w:p>
         </w:tc>

</xml_diff>

<commit_message>
Add OA drafting legend subfile
</commit_message>
<xml_diff>
--- a/Project Rooms/Operating Agreements/sources/Jeff Watson/Simplified OA - 25-06-25 SELL_YOUR_HOME_LLC Simplified with Summary with Jeff Watson tracked edits.docx
+++ b/Project Rooms/Operating Agreements/sources/Jeff Watson/Simplified OA - 25-06-25 SELL_YOUR_HOME_LLC Simplified with Summary with Jeff Watson tracked edits.docx
@@ -12941,13 +12941,93 @@
         <w:widowControl w:val="0"/>
       </w:pPr>
     </w:p>
+    <w:p>
+      <w:pPr>
+        <w:sectPr>
+          <w:headerReference w:type="even" r:id="rId15"/>
+          <w:headerReference w:type="default" r:id="rId16"/>
+          <w:footerReference w:type="even" r:id="rId17"/>
+          <w:footerReference w:type="default" r:id="rId18"/>
+          <w:headerReference w:type="first" r:id="rId19"/>
+          <w:footerReference w:type="first" r:id="rId20"/>
+          <w:pgSz w:w="12240" w:h="15840"/>
+          <w:pgMar w:top="1440" w:right="1440" w:bottom="1440" w:left="1440" w:header="720" w:footer="720" w:gutter="0"/>
+          <w:cols w:space="720"/>
+          <w:docGrid w:linePitch="360"/>
+        </w:sectPr>
+      </w:pPr>
+    </w:p>
+    <w:p>
+      <w:r>
+        <w:rPr>
+          <w:b/>
+          <w:sz w:val="24"/>
+        </w:rPr>
+        <w:t>Drafting Legend</w:t>
+      </w:r>
+    </w:p>
+    <w:p>
+      <w:r>
+        <w:rPr>
+          <w:i/>
+          <w:sz w:val="18"/>
+        </w:rPr>
+        <w:t>This drafting legend is not part of the Operating Agreement. It is included for review and drafting use and may be omitted from print or final signing copies.</w:t>
+      </w:r>
+    </w:p>
+    <w:p>
+      <w:r>
+        <w:rPr>
+          <w:strike w:val="0"/>
+          <w:color w:val="000000"/>
+          <w:sz w:val="20"/>
+        </w:rPr>
+        <w:t>Black text reflects original source agreement language.</w:t>
+      </w:r>
+    </w:p>
+    <w:p>
+      <w:r>
+        <w:rPr>
+          <w:strike w:val="0"/>
+          <w:color w:val="0000FF"/>
+          <w:sz w:val="20"/>
+        </w:rPr>
+        <w:t>Blue text reflects Wes Browning simplified draft language.</w:t>
+      </w:r>
+    </w:p>
+    <w:p>
+      <w:r>
+        <w:rPr>
+          <w:strike w:val="0"/>
+          <w:color w:val="FF0000"/>
+          <w:sz w:val="20"/>
+        </w:rPr>
+        <w:t>Red text reflects Jeff Watson review edits or source redline edits.</w:t>
+      </w:r>
+    </w:p>
+    <w:p>
+      <w:r>
+        <w:rPr>
+          <w:strike w:val="0"/>
+          <w:color w:val="008000"/>
+          <w:sz w:val="20"/>
+        </w:rPr>
+        <w:t>Green text reflects current target-entity additions, replacements, or drafting changes made for this version.</w:t>
+      </w:r>
+    </w:p>
+    <w:p>
+      <w:r>
+        <w:rPr>
+          <w:strike/>
+          <w:color w:val="000000"/>
+          <w:sz w:val="20"/>
+        </w:rPr>
+        <w:t>Strikethrough text reflects source language proposed to be omitted or replaced in this draft.</w:t>
+      </w:r>
+    </w:p>
     <w:sectPr>
-      <w:headerReference w:type="even" r:id="rId15"/>
-      <w:headerReference w:type="default" r:id="rId16"/>
-      <w:footerReference w:type="even" r:id="rId17"/>
-      <w:footerReference w:type="default" r:id="rId18"/>
-      <w:headerReference w:type="first" r:id="rId19"/>
-      <w:footerReference w:type="first" r:id="rId20"/>
+      <w:headerReference w:type="default" r:id="rId24"/>
+      <w:footerReference w:type="default" r:id="rId25"/>
       <w:pgSz w:w="12240" w:h="15840"/>
       <w:pgMar w:top="1440" w:right="1440" w:bottom="1440" w:left="1440" w:header="720" w:footer="720" w:gutter="0"/>
       <w:cols w:space="720"/>
@@ -13101,6 +13181,16 @@
 </w:ftr>
 </file>
 
+<file path=word/footer4.xml><?xml version="1.0" encoding="utf-8"?>
+<w:ftr xmlns:m="http://schemas.openxmlformats.org/officeDocument/2006/math" xmlns:mc="http://schemas.openxmlformats.org/markup-compatibility/2006" xmlns:mo="http://schemas.microsoft.com/office/mac/office/2008/main" xmlns:mv="urn:schemas-microsoft-com:mac:vml" xmlns:o="urn:schemas-microsoft-com:office:office" xmlns:r="http://schemas.openxmlformats.org/officeDocument/2006/relationships" xmlns:v="urn:schemas-microsoft-com:vml" xmlns:w10="urn:schemas-microsoft-com:office:word" xmlns:w14="http://schemas.microsoft.com/office/word/2010/wordml" xmlns:w="http://schemas.openxmlformats.org/wordprocessingml/2006/main" xmlns:wne="http://schemas.microsoft.com/office/word/2006/wordml" xmlns:wp14="http://schemas.microsoft.com/office/word/2010/wordprocessingDrawing" xmlns:wp="http://schemas.openxmlformats.org/drawingml/2006/wordprocessingDrawing" xmlns:wpc="http://schemas.microsoft.com/office/word/2010/wordprocessingCanvas" xmlns:wpg="http://schemas.microsoft.com/office/word/2010/wordprocessingGroup" xmlns:wpi="http://schemas.microsoft.com/office/word/2010/wordprocessingInk" xmlns:wps="http://schemas.microsoft.com/office/word/2010/wordprocessingShape" mc:Ignorable="w14 wp14">
+  <w:p>
+    <w:pPr>
+      <w:pStyle w:val="Footer"/>
+    </w:pPr>
+  </w:p>
+</w:ftr>
+</file>
+
 <file path=word/footnotes.xml><?xml version="1.0" encoding="utf-8"?>
 <w:footnotes xmlns:wpc="http://schemas.microsoft.com/office/word/2010/wordprocessingCanvas" xmlns:cx="http://schemas.microsoft.com/office/drawing/2014/chartex" xmlns:cx1="http://schemas.microsoft.com/office/drawing/2015/9/8/chartex" xmlns:cx2="http://schemas.microsoft.com/office/drawing/2015/10/21/chartex" xmlns:cx3="http://schemas.microsoft.com/office/drawing/2016/5/9/chartex" xmlns:cx4="http://schemas.microsoft.com/office/drawing/2016/5/10/chartex" xmlns:cx5="http://schemas.microsoft.com/office/drawing/2016/5/11/chartex" xmlns:cx6="http://schemas.microsoft.com/office/drawing/2016/5/12/chartex" xmlns:cx7="http://schemas.microsoft.com/office/drawing/2016/5/13/chartex" xmlns:cx8="http://schemas.microsoft.com/office/drawing/2016/5/14/chartex" xmlns:mc="http://schemas.openxmlformats.org/markup-compatibility/2006" xmlns:aink="http://schemas.microsoft.com/office/drawing/2016/ink" xmlns:am3d="http://schemas.microsoft.com/office/drawing/2017/model3d" xmlns:o="urn:schemas-microsoft-com:office:office" xmlns:oel="http://schemas.microsoft.com/office/2019/extlst" xmlns:r="http://schemas.openxmlformats.org/officeDocument/2006/relationships" xmlns:m="http://schemas.openxmlformats.org/officeDocument/2006/math" xmlns:v="urn:schemas-microsoft-com:vml" xmlns:wp14="http://schemas.microsoft.com/office/word/2010/wordprocessingDrawing" xmlns:wp="http://schemas.openxmlformats.org/drawingml/2006/wordprocessingDrawing" xmlns:w10="urn:schemas-microsoft-com:office:word" xmlns:w="http://schemas.openxmlformats.org/wordprocessingml/2006/main" xmlns:w14="http://schemas.microsoft.com/office/word/2010/wordml" xmlns:w15="http://schemas.microsoft.com/office/word/2012/wordml" xmlns:w16cex="http://schemas.microsoft.com/office/word/2018/wordml/cex" xmlns:w16cid="http://schemas.microsoft.com/office/word/2016/wordml/cid" xmlns:w16="http://schemas.microsoft.com/office/word/2018/wordml" xmlns:w16du="http://schemas.microsoft.com/office/word/2023/wordml/word16du" xmlns:w16sdtdh="http://schemas.microsoft.com/office/word/2020/wordml/sdtdatahash" xmlns:w16sdtfl="http://schemas.microsoft.com/office/word/2024/wordml/sdtformatlock" xmlns:w16se="http://schemas.microsoft.com/office/word/2015/wordml/symex" xmlns:wpg="http://schemas.microsoft.com/office/word/2010/wordprocessingGroup" xmlns:wpi="http://schemas.microsoft.com/office/word/2010/wordprocessingInk" xmlns:wne="http://schemas.microsoft.com/office/word/2006/wordml" xmlns:wps="http://schemas.microsoft.com/office/word/2010/wordprocessingShape" mc:Ignorable="w14 w15 w16se w16cid w16 w16cex w16sdtdh w16sdtfl w16du wp14">
   <w:footnote w:type="separator" w:id="-1">
@@ -13155,6 +13245,16 @@
 
 <file path=word/header3.xml><?xml version="1.0" encoding="utf-8"?>
 <w:hdr xmlns:wpc="http://schemas.microsoft.com/office/word/2010/wordprocessingCanvas" xmlns:cx="http://schemas.microsoft.com/office/drawing/2014/chartex" xmlns:cx1="http://schemas.microsoft.com/office/drawing/2015/9/8/chartex" xmlns:cx2="http://schemas.microsoft.com/office/drawing/2015/10/21/chartex" xmlns:cx3="http://schemas.microsoft.com/office/drawing/2016/5/9/chartex" xmlns:cx4="http://schemas.microsoft.com/office/drawing/2016/5/10/chartex" xmlns:cx5="http://schemas.microsoft.com/office/drawing/2016/5/11/chartex" xmlns:cx6="http://schemas.microsoft.com/office/drawing/2016/5/12/chartex" xmlns:cx7="http://schemas.microsoft.com/office/drawing/2016/5/13/chartex" xmlns:cx8="http://schemas.microsoft.com/office/drawing/2016/5/14/chartex" xmlns:mc="http://schemas.openxmlformats.org/markup-compatibility/2006" xmlns:aink="http://schemas.microsoft.com/office/drawing/2016/ink" xmlns:am3d="http://schemas.microsoft.com/office/drawing/2017/model3d" xmlns:o="urn:schemas-microsoft-com:office:office" xmlns:oel="http://schemas.microsoft.com/office/2019/extlst" xmlns:r="http://schemas.openxmlformats.org/officeDocument/2006/relationships" xmlns:m="http://schemas.openxmlformats.org/officeDocument/2006/math" xmlns:v="urn:schemas-microsoft-com:vml" xmlns:wp14="http://schemas.microsoft.com/office/word/2010/wordprocessingDrawing" xmlns:wp="http://schemas.openxmlformats.org/drawingml/2006/wordprocessingDrawing" xmlns:w10="urn:schemas-microsoft-com:office:word" xmlns:w="http://schemas.openxmlformats.org/wordprocessingml/2006/main" xmlns:w14="http://schemas.microsoft.com/office/word/2010/wordml" xmlns:w15="http://schemas.microsoft.com/office/word/2012/wordml" xmlns:w16cex="http://schemas.microsoft.com/office/word/2018/wordml/cex" xmlns:w16cid="http://schemas.microsoft.com/office/word/2016/wordml/cid" xmlns:w16="http://schemas.microsoft.com/office/word/2018/wordml" xmlns:w16du="http://schemas.microsoft.com/office/word/2023/wordml/word16du" xmlns:w16sdtdh="http://schemas.microsoft.com/office/word/2020/wordml/sdtdatahash" xmlns:w16sdtfl="http://schemas.microsoft.com/office/word/2024/wordml/sdtformatlock" xmlns:w16se="http://schemas.microsoft.com/office/word/2015/wordml/symex" xmlns:wpg="http://schemas.microsoft.com/office/word/2010/wordprocessingGroup" xmlns:wpi="http://schemas.microsoft.com/office/word/2010/wordprocessingInk" xmlns:wne="http://schemas.microsoft.com/office/word/2006/wordml" xmlns:wps="http://schemas.microsoft.com/office/word/2010/wordprocessingShape" mc:Ignorable="w14 w15 w16se w16cid w16 w16cex w16sdtdh w16sdtfl w16du wp14">
+  <w:p>
+    <w:pPr>
+      <w:pStyle w:val="Header"/>
+    </w:pPr>
+  </w:p>
+</w:hdr>
+</file>
+
+<file path=word/header4.xml><?xml version="1.0" encoding="utf-8"?>
+<w:hdr xmlns:m="http://schemas.openxmlformats.org/officeDocument/2006/math" xmlns:mc="http://schemas.openxmlformats.org/markup-compatibility/2006" xmlns:mo="http://schemas.microsoft.com/office/mac/office/2008/main" xmlns:mv="urn:schemas-microsoft-com:mac:vml" xmlns:o="urn:schemas-microsoft-com:office:office" xmlns:r="http://schemas.openxmlformats.org/officeDocument/2006/relationships" xmlns:v="urn:schemas-microsoft-com:vml" xmlns:w10="urn:schemas-microsoft-com:office:word" xmlns:w14="http://schemas.microsoft.com/office/word/2010/wordml" xmlns:w="http://schemas.openxmlformats.org/wordprocessingml/2006/main" xmlns:wne="http://schemas.microsoft.com/office/word/2006/wordml" xmlns:wp14="http://schemas.microsoft.com/office/word/2010/wordprocessingDrawing" xmlns:wp="http://schemas.openxmlformats.org/drawingml/2006/wordprocessingDrawing" xmlns:wpc="http://schemas.microsoft.com/office/word/2010/wordprocessingCanvas" xmlns:wpg="http://schemas.microsoft.com/office/word/2010/wordprocessingGroup" xmlns:wpi="http://schemas.microsoft.com/office/word/2010/wordprocessingInk" xmlns:wps="http://schemas.microsoft.com/office/word/2010/wordprocessingShape" mc:Ignorable="w14 wp14">
   <w:p>
     <w:pPr>
       <w:pStyle w:val="Header"/>

</xml_diff>

<commit_message>
Refresh OA accepted build stack
</commit_message>
<xml_diff>
--- a/Project Rooms/Operating Agreements/sources/Jeff Watson/Simplified OA - 25-06-25 SELL_YOUR_HOME_LLC Simplified with Summary with Jeff Watson tracked edits.docx
+++ b/Project Rooms/Operating Agreements/sources/Jeff Watson/Simplified OA - 25-06-25 SELL_YOUR_HOME_LLC Simplified with Summary with Jeff Watson tracked edits.docx
@@ -59,23 +59,7 @@
         <w:jc w:val="both"/>
       </w:pPr>
       <w:r>
-        <w:t xml:space="preserve">This Amended and Restated Operating Agreement is entered into on this _____ day of </w:t>
-      </w:r>
-      <w:proofErr w:type="gramStart"/>
-      <w:r>
-        <w:t>June,</w:t>
-      </w:r>
-      <w:proofErr w:type="gramEnd"/>
-      <w:r>
-        <w:t xml:space="preserve"> 2025, by and among the </w:t>
-      </w:r>
-      <w:proofErr w:type="gramStart"/>
-      <w:r>
-        <w:t>persons</w:t>
-      </w:r>
-      <w:proofErr w:type="gramEnd"/>
-      <w:r>
-        <w:t xml:space="preserve"> executing this Agreement as Members, or their representatives, on the following terms and conditions.</w:t>
+        <w:t>This Amended and Restated Operating Agreement is entered into on this _____ day of June, 2025, by and among the persons executing this Agreement as Members, or their representatives, on the following terms and conditions.</w:t>
       </w:r>
     </w:p>
     <w:p>
@@ -104,15 +88,7 @@
         <w:jc w:val="both"/>
       </w:pPr>
       <w:r>
-        <w:t xml:space="preserve">WHEREAS, the Members of the Company entered into an Operating Agreement, dated_______________, and the </w:t>
-      </w:r>
-      <w:proofErr w:type="gramStart"/>
-      <w:r>
-        <w:t>persons</w:t>
-      </w:r>
-      <w:proofErr w:type="gramEnd"/>
-      <w:r>
-        <w:t xml:space="preserve"> or representatives executing this Agreement as Members now wish to amend and restate such agreement in its entirety to reflect a change in the titling and ownership of the various members, specifically: </w:t>
+        <w:t xml:space="preserve">WHEREAS, the Members of the Company entered into an Operating Agreement, dated_______________, and the persons or representatives executing this Agreement as Members now wish to amend and restate such agreement in its entirety to reflect a change in the titling and ownership of the various members, specifically: </w:t>
       </w:r>
     </w:p>
     <w:p>
@@ -151,7 +127,6 @@
         </w:rPr>
         <w:t xml:space="preserve">Heritage IRA FBO Wesley Dale Browning HSA </w:t>
       </w:r>
-      <w:proofErr w:type="gramStart"/>
       <w:r>
         <w:rPr>
           <w:b/>
@@ -175,15 +150,7 @@
           <w:sz w:val="22"/>
           <w:szCs w:val="20"/>
         </w:rPr>
-        <w:t>;</w:t>
-      </w:r>
-      <w:proofErr w:type="gramEnd"/>
-      <w:r>
-        <w:rPr>
-          <w:sz w:val="22"/>
-          <w:szCs w:val="20"/>
-        </w:rPr>
-        <w:t xml:space="preserve"> </w:t>
+        <w:t xml:space="preserve">; </w:t>
       </w:r>
     </w:p>
     <w:p>
@@ -221,15 +188,7 @@
           <w:sz w:val="22"/>
           <w:szCs w:val="20"/>
         </w:rPr>
-        <w:t xml:space="preserve">Heritage IRA FBO Wesley Dale Browning Roth IRA </w:t>
-      </w:r>
-      <w:proofErr w:type="gramStart"/>
-      <w:r>
-        <w:rPr>
-          <w:sz w:val="22"/>
-          <w:szCs w:val="20"/>
-        </w:rPr>
-        <w:t>#</w:t>
+        <w:t>Heritage IRA FBO Wesley Dale Browning Roth IRA #</w:t>
       </w:r>
       <w:r>
         <w:rPr>
@@ -245,15 +204,7 @@
           <w:sz w:val="22"/>
           <w:szCs w:val="20"/>
         </w:rPr>
-        <w:t>;</w:t>
-      </w:r>
-      <w:proofErr w:type="gramEnd"/>
-      <w:r>
-        <w:rPr>
-          <w:sz w:val="22"/>
-          <w:szCs w:val="20"/>
-        </w:rPr>
-        <w:t xml:space="preserve"> </w:t>
+        <w:t xml:space="preserve">; </w:t>
       </w:r>
     </w:p>
     <w:bookmarkEnd w:id="0"/>
@@ -333,15 +284,7 @@
           <w:sz w:val="22"/>
           <w:szCs w:val="20"/>
         </w:rPr>
-        <w:t xml:space="preserve"> Roth IRA </w:t>
-      </w:r>
-      <w:proofErr w:type="gramStart"/>
-      <w:r>
-        <w:rPr>
-          <w:sz w:val="22"/>
-          <w:szCs w:val="20"/>
-        </w:rPr>
-        <w:t>#</w:t>
+        <w:t xml:space="preserve"> Roth IRA #</w:t>
       </w:r>
       <w:r>
         <w:rPr>
@@ -357,15 +300,7 @@
           <w:sz w:val="22"/>
           <w:szCs w:val="20"/>
         </w:rPr>
-        <w:t>;</w:t>
-      </w:r>
-      <w:proofErr w:type="gramEnd"/>
-      <w:r>
-        <w:rPr>
-          <w:sz w:val="22"/>
-          <w:szCs w:val="20"/>
-        </w:rPr>
-        <w:t xml:space="preserve"> </w:t>
+        <w:t xml:space="preserve">; </w:t>
       </w:r>
     </w:p>
     <w:p>
@@ -416,21 +351,7 @@
         <w:rPr>
           <w:szCs w:val="24"/>
         </w:rPr>
-        <w:t xml:space="preserve">This Section provides </w:t>
-      </w:r>
-      <w:proofErr w:type="gramStart"/>
-      <w:r>
-        <w:rPr>
-          <w:szCs w:val="24"/>
-        </w:rPr>
-        <w:t>a brief summary</w:t>
-      </w:r>
-      <w:proofErr w:type="gramEnd"/>
-      <w:r>
-        <w:rPr>
-          <w:szCs w:val="24"/>
-        </w:rPr>
-        <w:t xml:space="preserve"> of each Article in the Operating Agreement for Sell Your Home, LLC. It is intended for quick reference only. For legal interpretation, consult the full Operating Agreement further down in this document.</w:t>
+        <w:t>This Section provides a brief summary of each Article in the Operating Agreement for Sell Your Home, LLC. It is intended for quick reference only. For legal interpretation, consult the full Operating Agreement further down in this document.</w:t>
       </w:r>
     </w:p>
     <w:p>
@@ -505,21 +426,7 @@
         <w:rPr>
           <w:szCs w:val="24"/>
         </w:rPr>
-        <w:t xml:space="preserve">Additional offices </w:t>
-      </w:r>
-      <w:proofErr w:type="gramStart"/>
-      <w:r>
-        <w:rPr>
-          <w:szCs w:val="24"/>
-        </w:rPr>
-        <w:t>allowed</w:t>
-      </w:r>
-      <w:proofErr w:type="gramEnd"/>
-      <w:r>
-        <w:rPr>
-          <w:szCs w:val="24"/>
-        </w:rPr>
-        <w:t xml:space="preserve"> anywhere.</w:t>
+        <w:t>Additional offices allowed anywhere.</w:t>
       </w:r>
     </w:p>
     <w:p>
@@ -557,21 +464,7 @@
         <w:rPr>
           <w:szCs w:val="24"/>
         </w:rPr>
-        <w:t xml:space="preserve">Members can inspect records with written </w:t>
-      </w:r>
-      <w:proofErr w:type="gramStart"/>
-      <w:r>
-        <w:rPr>
-          <w:szCs w:val="24"/>
-        </w:rPr>
-        <w:t>request</w:t>
-      </w:r>
-      <w:proofErr w:type="gramEnd"/>
-      <w:r>
-        <w:rPr>
-          <w:szCs w:val="24"/>
-        </w:rPr>
-        <w:t xml:space="preserve"> but must not misuse info.</w:t>
+        <w:t>Members can inspect records with written request but must not misuse info.</w:t>
       </w:r>
     </w:p>
     <w:p>
@@ -894,21 +787,7 @@
         <w:rPr>
           <w:szCs w:val="24"/>
         </w:rPr>
-        <w:t xml:space="preserve">If a </w:t>
-      </w:r>
-      <w:proofErr w:type="gramStart"/>
-      <w:r>
-        <w:rPr>
-          <w:szCs w:val="24"/>
-        </w:rPr>
-        <w:t>Member</w:t>
-      </w:r>
-      <w:proofErr w:type="gramEnd"/>
-      <w:r>
-        <w:rPr>
-          <w:szCs w:val="24"/>
-        </w:rPr>
-        <w:t xml:space="preserve"> dies or becomes disabled, the Company may buy their Units within 90 days.</w:t>
+        <w:t>If a Member dies or becomes disabled, the Company may buy their Units within 90 days.</w:t>
       </w:r>
     </w:p>
     <w:p>
@@ -1126,21 +1005,7 @@
         <w:rPr>
           <w:szCs w:val="24"/>
         </w:rPr>
-        <w:t xml:space="preserve">: More than 50% of voting Units </w:t>
-      </w:r>
-      <w:proofErr w:type="gramStart"/>
-      <w:r>
-        <w:rPr>
-          <w:szCs w:val="24"/>
-        </w:rPr>
-        <w:t>required</w:t>
-      </w:r>
-      <w:proofErr w:type="gramEnd"/>
-      <w:r>
-        <w:rPr>
-          <w:szCs w:val="24"/>
-        </w:rPr>
-        <w:t xml:space="preserve"> to conduct business.</w:t>
+        <w:t>: More than 50% of voting Units required to conduct business.</w:t>
       </w:r>
     </w:p>
     <w:p>
@@ -1286,21 +1151,7 @@
         <w:rPr>
           <w:szCs w:val="24"/>
         </w:rPr>
-        <w:t xml:space="preserve">Manager(s) need not be Members and cannot be disqualified </w:t>
-      </w:r>
-      <w:proofErr w:type="gramStart"/>
-      <w:r>
-        <w:rPr>
-          <w:szCs w:val="24"/>
-        </w:rPr>
-        <w:t>persons</w:t>
-      </w:r>
-      <w:proofErr w:type="gramEnd"/>
-      <w:r>
-        <w:rPr>
-          <w:szCs w:val="24"/>
-        </w:rPr>
-        <w:t xml:space="preserve"> (e.g., IRA Account Holders).</w:t>
+        <w:t>Manager(s) need not be Members and cannot be disqualified persons (e.g., IRA Account Holders).</w:t>
       </w:r>
     </w:p>
     <w:p>
@@ -1516,21 +1367,7 @@
         <w:rPr>
           <w:szCs w:val="24"/>
         </w:rPr>
-        <w:t xml:space="preserve">Legal costs may be advanced before proceedings conclude if the Manager agrees to </w:t>
-      </w:r>
-      <w:proofErr w:type="gramStart"/>
-      <w:r>
-        <w:rPr>
-          <w:szCs w:val="24"/>
-        </w:rPr>
-        <w:t>repay if</w:t>
-      </w:r>
-      <w:proofErr w:type="gramEnd"/>
-      <w:r>
-        <w:rPr>
-          <w:szCs w:val="24"/>
-        </w:rPr>
-        <w:t xml:space="preserve"> found ineligible.</w:t>
+        <w:t>Legal costs may be advanced before proceedings conclude if the Manager agrees to repay if found ineligible.</w:t>
       </w:r>
     </w:p>
     <w:p>
@@ -2294,21 +2131,7 @@
         <w:rPr>
           <w:szCs w:val="24"/>
         </w:rPr>
-        <w:t xml:space="preserve">: Company can borrow for real estate only with 75% Member approval; disqualified </w:t>
-      </w:r>
-      <w:proofErr w:type="gramStart"/>
-      <w:r>
-        <w:rPr>
-          <w:szCs w:val="24"/>
-        </w:rPr>
-        <w:t>persons</w:t>
-      </w:r>
-      <w:proofErr w:type="gramEnd"/>
-      <w:r>
-        <w:rPr>
-          <w:szCs w:val="24"/>
-        </w:rPr>
-        <w:t xml:space="preserve"> cannot guarantee loans.</w:t>
+        <w:t>: Company can borrow for real estate only with 75% Member approval; disqualified persons cannot guarantee loans.</w:t>
       </w:r>
     </w:p>
     <w:p>
@@ -2753,23 +2576,7 @@
           <w:bCs w:val="0"/>
           <w:color w:val="0070C0"/>
         </w:rPr>
-        <w:t xml:space="preserve">The Company’s main office will be at 2156 Haig Point Way, Raleigh, NC 27604, unless the Manager(s) </w:t>
-      </w:r>
-      <w:proofErr w:type="gramStart"/>
-      <w:r>
-        <w:rPr>
-          <w:bCs w:val="0"/>
-          <w:color w:val="0070C0"/>
-        </w:rPr>
-        <w:t>choose</w:t>
-      </w:r>
-      <w:proofErr w:type="gramEnd"/>
-      <w:r>
-        <w:rPr>
-          <w:bCs w:val="0"/>
-          <w:color w:val="0070C0"/>
-        </w:rPr>
-        <w:t xml:space="preserve"> a different location.</w:t>
+        <w:t>The Company’s main office will be at 2156 Haig Point Way, Raleigh, NC 27604, unless the Manager(s) choose a different location.</w:t>
       </w:r>
     </w:p>
     <w:p>
@@ -2887,21 +2694,7 @@
         <w:rPr>
           <w:color w:val="0070C0"/>
         </w:rPr>
-        <w:t xml:space="preserve">Any Member can request in writing to inspect the Company’s records during normal business hours and make copies. However, Members can’t misuse the information or share it with competitors. The Company may require the Member to agree to cover any </w:t>
-      </w:r>
-      <w:proofErr w:type="gramStart"/>
-      <w:r>
-        <w:rPr>
-          <w:color w:val="0070C0"/>
-        </w:rPr>
-        <w:t>damages</w:t>
-      </w:r>
-      <w:proofErr w:type="gramEnd"/>
-      <w:r>
-        <w:rPr>
-          <w:color w:val="0070C0"/>
-        </w:rPr>
-        <w:t xml:space="preserve"> caused by improper disclosure.</w:t>
+        <w:t>Any Member can request in writing to inspect the Company’s records during normal business hours and make copies. However, Members can’t misuse the information or share it with competitors. The Company may require the Member to agree to cover any damages caused by improper disclosure.</w:t>
       </w:r>
     </w:p>
     <w:p>
@@ -2948,23 +2741,7 @@
           <w:bCs w:val="0"/>
           <w:color w:val="0070C0"/>
         </w:rPr>
-        <w:t xml:space="preserve">The Company’s sole business is investing in residential real estate for rental income and long-term growth. Members can invest in other real estate on their own, </w:t>
-      </w:r>
-      <w:proofErr w:type="gramStart"/>
-      <w:r>
-        <w:rPr>
-          <w:bCs w:val="0"/>
-          <w:color w:val="0070C0"/>
-        </w:rPr>
-        <w:t>as long as</w:t>
-      </w:r>
-      <w:proofErr w:type="gramEnd"/>
-      <w:r>
-        <w:rPr>
-          <w:bCs w:val="0"/>
-          <w:color w:val="0070C0"/>
-        </w:rPr>
-        <w:t xml:space="preserve"> it doesn’t significantly harm the Company.</w:t>
+        <w:t>The Company’s sole business is investing in residential real estate for rental income and long-term growth. Members can invest in other real estate on their own, as long as it doesn’t significantly harm the Company.</w:t>
       </w:r>
     </w:p>
     <w:p>
@@ -3252,25 +3029,7 @@
           <w:color w:val="auto"/>
           <w:u w:val="single"/>
         </w:rPr>
-        <w:t xml:space="preserve">Restrictions on </w:t>
-      </w:r>
-      <w:proofErr w:type="gramStart"/>
-      <w:r>
-        <w:rPr>
-          <w:b/>
-          <w:color w:val="auto"/>
-          <w:u w:val="single"/>
-        </w:rPr>
-        <w:t>a Transfer</w:t>
-      </w:r>
-      <w:proofErr w:type="gramEnd"/>
-      <w:r>
-        <w:rPr>
-          <w:b/>
-          <w:color w:val="auto"/>
-          <w:u w:val="single"/>
-        </w:rPr>
-        <w:t xml:space="preserve"> of Membership Units.</w:t>
+        <w:t>Restrictions on a Transfer of Membership Units.</w:t>
       </w:r>
       <w:r>
         <w:rPr>
@@ -3423,21 +3182,7 @@
         <w:rPr>
           <w:color w:val="0070C0"/>
         </w:rPr>
-        <w:t xml:space="preserve">he record date for written </w:t>
-      </w:r>
-      <w:proofErr w:type="gramStart"/>
-      <w:r>
-        <w:rPr>
-          <w:color w:val="0070C0"/>
-        </w:rPr>
-        <w:t>consents</w:t>
-      </w:r>
-      <w:proofErr w:type="gramEnd"/>
-      <w:r>
-        <w:rPr>
-          <w:color w:val="0070C0"/>
-        </w:rPr>
-        <w:t xml:space="preserve"> without a meeting is the day the first consent is given.</w:t>
+        <w:t>he record date for written consents without a meeting is the day the first consent is given.</w:t>
       </w:r>
     </w:p>
     <w:p>
@@ -3536,29 +3281,7 @@
           <w:sz w:val="22"/>
           <w:szCs w:val="22"/>
         </w:rPr>
-        <w:t xml:space="preserve"> still applies—unless the Manager(s) </w:t>
-      </w:r>
-      <w:proofErr w:type="gramStart"/>
-      <w:r>
-        <w:rPr>
-          <w:b w:val="0"/>
-          <w:bCs w:val="0"/>
-          <w:color w:val="0070C0"/>
-          <w:sz w:val="22"/>
-          <w:szCs w:val="22"/>
-        </w:rPr>
-        <w:t>set</w:t>
-      </w:r>
-      <w:proofErr w:type="gramEnd"/>
-      <w:r>
-        <w:rPr>
-          <w:b w:val="0"/>
-          <w:bCs w:val="0"/>
-          <w:color w:val="0070C0"/>
-          <w:sz w:val="22"/>
-          <w:szCs w:val="22"/>
-        </w:rPr>
-        <w:t xml:space="preserve"> a new one.</w:t>
+        <w:t xml:space="preserve"> still applies—unless the Manager(s) set a new one.</w:t>
       </w:r>
     </w:p>
     <w:p>
@@ -3738,23 +3461,7 @@
           <w:bCs w:val="0"/>
           <w:color w:val="0070C0"/>
         </w:rPr>
-        <w:t xml:space="preserve">They control all related matters, </w:t>
-      </w:r>
-      <w:proofErr w:type="gramStart"/>
-      <w:r>
-        <w:rPr>
-          <w:bCs w:val="0"/>
-          <w:color w:val="0070C0"/>
-        </w:rPr>
-        <w:t>as long as</w:t>
-      </w:r>
-      <w:proofErr w:type="gramEnd"/>
-      <w:r>
-        <w:rPr>
-          <w:bCs w:val="0"/>
-          <w:color w:val="0070C0"/>
-        </w:rPr>
-        <w:t xml:space="preserve"> any required Member approvals are also obtained.</w:t>
+        <w:t>They control all related matters, as long as any required Member approvals are also obtained.</w:t>
       </w:r>
     </w:p>
     <w:p>
@@ -3809,21 +3516,7 @@
         <w:rPr>
           <w:color w:val="0070C0"/>
         </w:rPr>
-        <w:t xml:space="preserve">They may create rules for issuing, transferring, converting, and registering Membership Unit certificates, </w:t>
-      </w:r>
-      <w:proofErr w:type="gramStart"/>
-      <w:r>
-        <w:rPr>
-          <w:color w:val="0070C0"/>
-        </w:rPr>
-        <w:t>as long as</w:t>
-      </w:r>
-      <w:proofErr w:type="gramEnd"/>
-      <w:r>
-        <w:rPr>
-          <w:color w:val="0070C0"/>
-        </w:rPr>
-        <w:t xml:space="preserve"> those rules comply with the law, the Articles of Organization, and this Agreement.</w:t>
+        <w:t>They may create rules for issuing, transferring, converting, and registering Membership Unit certificates, as long as those rules comply with the law, the Articles of Organization, and this Agreement.</w:t>
       </w:r>
     </w:p>
     <w:p>
@@ -3984,21 +3677,7 @@
         <w:rPr>
           <w:color w:val="0070C0"/>
         </w:rPr>
-        <w:t xml:space="preserve">A Member can’t leave or transfer their Units without unanimous approval. If a </w:t>
-      </w:r>
-      <w:proofErr w:type="gramStart"/>
-      <w:r>
-        <w:rPr>
-          <w:color w:val="0070C0"/>
-        </w:rPr>
-        <w:t>Member</w:t>
-      </w:r>
-      <w:proofErr w:type="gramEnd"/>
-      <w:r>
-        <w:rPr>
-          <w:color w:val="0070C0"/>
-        </w:rPr>
-        <w:t xml:space="preserve"> tries to transfer, resign, or is deemed to have done so without following the rules:</w:t>
+        <w:t>A Member can’t leave or transfer their Units without unanimous approval. If a Member tries to transfer, resign, or is deemed to have done so without following the rules:</w:t>
       </w:r>
     </w:p>
     <w:p>
@@ -4018,21 +3697,7 @@
         <w:rPr>
           <w:color w:val="0070C0"/>
         </w:rPr>
-        <w:t xml:space="preserve">They immediately lose their status as a </w:t>
-      </w:r>
-      <w:proofErr w:type="gramStart"/>
-      <w:r>
-        <w:rPr>
-          <w:color w:val="0070C0"/>
-        </w:rPr>
-        <w:t>Member</w:t>
-      </w:r>
-      <w:proofErr w:type="gramEnd"/>
-      <w:r>
-        <w:rPr>
-          <w:color w:val="0070C0"/>
-        </w:rPr>
-        <w:t>.</w:t>
+        <w:t>They immediately lose their status as a Member.</w:t>
       </w:r>
     </w:p>
     <w:p>
@@ -4149,23 +3814,7 @@
           <w:bCs w:val="0"/>
           <w:color w:val="0070C0"/>
         </w:rPr>
-        <w:t xml:space="preserve">A new person can become a </w:t>
-      </w:r>
-      <w:proofErr w:type="gramStart"/>
-      <w:r>
-        <w:rPr>
-          <w:bCs w:val="0"/>
-          <w:color w:val="0070C0"/>
-        </w:rPr>
-        <w:t>Member</w:t>
-      </w:r>
-      <w:proofErr w:type="gramEnd"/>
-      <w:r>
-        <w:rPr>
-          <w:bCs w:val="0"/>
-          <w:color w:val="0070C0"/>
-        </w:rPr>
-        <w:t xml:space="preserve">—but only if all </w:t>
+        <w:t xml:space="preserve">A new person can become a Member—but only if all </w:t>
       </w:r>
       <w:r>
         <w:rPr>
@@ -4202,21 +3851,7 @@
         <w:rPr>
           <w:color w:val="0070C0"/>
         </w:rPr>
-        <w:t xml:space="preserve">If a Member wants to sell any or </w:t>
-      </w:r>
-      <w:proofErr w:type="gramStart"/>
-      <w:r>
-        <w:rPr>
-          <w:color w:val="0070C0"/>
-        </w:rPr>
-        <w:t>all of</w:t>
-      </w:r>
-      <w:proofErr w:type="gramEnd"/>
-      <w:r>
-        <w:rPr>
-          <w:color w:val="0070C0"/>
-        </w:rPr>
-        <w:t xml:space="preserve"> their Membership Units without getting unanimous written consent from the other Members (as required in </w:t>
+        <w:t xml:space="preserve">If a Member wants to sell any or all of their Membership Units without getting unanimous written consent from the other Members (as required in </w:t>
       </w:r>
       <w:r>
         <w:rPr>
@@ -4267,35 +3902,7 @@
         <w:rPr>
           <w:color w:val="0070C0"/>
         </w:rPr>
-        <w:t xml:space="preserve">The Member or their legal representative (the “Seller”) must first offer the Units in writing to the Company and the other Members. If the sale is due to death or permanent disability of a </w:t>
-      </w:r>
-      <w:proofErr w:type="gramStart"/>
-      <w:r>
-        <w:rPr>
-          <w:color w:val="0070C0"/>
-        </w:rPr>
-        <w:t>Member</w:t>
-      </w:r>
-      <w:proofErr w:type="gramEnd"/>
-      <w:r>
-        <w:rPr>
-          <w:color w:val="0070C0"/>
-        </w:rPr>
-        <w:t xml:space="preserve"> or an Account Holder, the Company has the right, but not the obligation, to purchase the Units within 90 days. The purchase price must be </w:t>
-      </w:r>
-      <w:proofErr w:type="gramStart"/>
-      <w:r>
-        <w:rPr>
-          <w:color w:val="0070C0"/>
-        </w:rPr>
-        <w:t>determined</w:t>
-      </w:r>
-      <w:proofErr w:type="gramEnd"/>
-      <w:r>
-        <w:rPr>
-          <w:color w:val="0070C0"/>
-        </w:rPr>
-        <w:t xml:space="preserve"> using the valuation methods in </w:t>
+        <w:t xml:space="preserve">The Member or their legal representative (the “Seller”) must first offer the Units in writing to the Company and the other Members. If the sale is due to death or permanent disability of a Member or an Account Holder, the Company has the right, but not the obligation, to purchase the Units within 90 days. The purchase price must be determined using the valuation methods in </w:t>
       </w:r>
       <w:r>
         <w:rPr>
@@ -4812,21 +4419,7 @@
         <w:rPr>
           <w:color w:val="0070C0"/>
         </w:rPr>
-        <w:t xml:space="preserve">If a </w:t>
-      </w:r>
-      <w:proofErr w:type="gramStart"/>
-      <w:r>
-        <w:rPr>
-          <w:color w:val="0070C0"/>
-        </w:rPr>
-        <w:t>Member</w:t>
-      </w:r>
-      <w:proofErr w:type="gramEnd"/>
-      <w:r>
-        <w:rPr>
-          <w:color w:val="0070C0"/>
-        </w:rPr>
-        <w:t xml:space="preserve"> who is an individual—or the Account Holder of a Member that is not an individual—dies or becomes permanently and totally disabled, the Company has the right (but not the obligation) to purchase that Member’s Units. This right lasts for 90 days from the date of death or disability. The purchase price must be calculated using the methods in </w:t>
+        <w:t xml:space="preserve">If a Member who is an individual—or the Account Holder of a Member that is not an individual—dies or becomes permanently and totally disabled, the Company has the right (but not the obligation) to purchase that Member’s Units. This right lasts for 90 days from the date of death or disability. The purchase price must be calculated using the methods in </w:t>
       </w:r>
       <w:r>
         <w:rPr>
@@ -4947,21 +4540,7 @@
         <w:rPr>
           <w:color w:val="0070C0"/>
         </w:rPr>
-        <w:t>Unless otherwise agreed, Membership Units being sold under this Article will be valued at their “Book Value.” This is based on the Company’s financial records</w:t>
-      </w:r>
-      <w:proofErr w:type="gramStart"/>
-      <w:r>
-        <w:rPr>
-          <w:color w:val="0070C0"/>
-        </w:rPr>
-        <w:t>, adjusted</w:t>
-      </w:r>
-      <w:proofErr w:type="gramEnd"/>
-      <w:r>
-        <w:rPr>
-          <w:color w:val="0070C0"/>
-        </w:rPr>
-        <w:t xml:space="preserve"> as follows</w:t>
+        <w:t>Unless otherwise agreed, Membership Units being sold under this Article will be valued at their “Book Value.” This is based on the Company’s financial records, adjusted as follows</w:t>
       </w:r>
       <w:r>
         <w:rPr>
@@ -5137,35 +4716,7 @@
         <w:rPr>
           <w:color w:val="0070C0"/>
         </w:rPr>
-        <w:t xml:space="preserve">), the Members may use “Agreed Value” to set the price per Unit. Agreed Value means the value listed in a Certificate of Agreed Value that has been signed by all Members and filed with the Company. This certificate is only valid if all Members </w:t>
-      </w:r>
-      <w:proofErr w:type="gramStart"/>
-      <w:r>
-        <w:rPr>
-          <w:color w:val="0070C0"/>
-        </w:rPr>
-        <w:t>signed</w:t>
-      </w:r>
-      <w:proofErr w:type="gramEnd"/>
-      <w:r>
-        <w:rPr>
-          <w:color w:val="0070C0"/>
-        </w:rPr>
-        <w:t xml:space="preserve"> it within one year of </w:t>
-      </w:r>
-      <w:proofErr w:type="gramStart"/>
-      <w:r>
-        <w:rPr>
-          <w:color w:val="0070C0"/>
-        </w:rPr>
-        <w:t>the</w:t>
-      </w:r>
-      <w:proofErr w:type="gramEnd"/>
-      <w:r>
-        <w:rPr>
-          <w:color w:val="0070C0"/>
-        </w:rPr>
-        <w:t xml:space="preserve"> last signature. Members can update or create a new Certificate of Agreed Value at any time.</w:t>
+        <w:t>), the Members may use “Agreed Value” to set the price per Unit. Agreed Value means the value listed in a Certificate of Agreed Value that has been signed by all Members and filed with the Company. This certificate is only valid if all Members signed it within one year of the last signature. Members can update or create a new Certificate of Agreed Value at any time.</w:t>
       </w:r>
     </w:p>
     <w:p>
@@ -5390,21 +4941,7 @@
         <w:rPr>
           <w:color w:val="0070C0"/>
         </w:rPr>
-        <w:t xml:space="preserve">Members can </w:t>
-      </w:r>
-      <w:proofErr w:type="gramStart"/>
-      <w:r>
-        <w:rPr>
-          <w:color w:val="0070C0"/>
-        </w:rPr>
-        <w:t>take action</w:t>
-      </w:r>
-      <w:proofErr w:type="gramEnd"/>
-      <w:r>
-        <w:rPr>
-          <w:color w:val="0070C0"/>
-        </w:rPr>
-        <w:t xml:space="preserve"> without holding a meeting, giving notice, or voting—if all Members entitled to vote sign a written consent describing the action. This written consent has the same legal effect as a unanimous vote at a meeting and must be kept with the meeting records.</w:t>
+        <w:t>Members can take action without holding a meeting, giving notice, or voting—if all Members entitled to vote sign a written consent describing the action. This written consent has the same legal effect as a unanimous vote at a meeting and must be kept with the meeting records.</w:t>
       </w:r>
     </w:p>
     <w:p>
@@ -5475,21 +5012,7 @@
         <w:rPr>
           <w:color w:val="0070C0"/>
         </w:rPr>
-        <w:t xml:space="preserve">If Members are expected to </w:t>
-      </w:r>
-      <w:proofErr w:type="gramStart"/>
-      <w:r>
-        <w:rPr>
-          <w:color w:val="0070C0"/>
-        </w:rPr>
-        <w:t>take action</w:t>
-      </w:r>
-      <w:proofErr w:type="gramEnd"/>
-      <w:r>
-        <w:rPr>
-          <w:color w:val="0070C0"/>
-        </w:rPr>
-        <w:t xml:space="preserve"> at a meeting and aren’t using the written consent process in </w:t>
+        <w:t xml:space="preserve">If Members are expected to take action at a meeting and aren’t using the written consent process in </w:t>
       </w:r>
       <w:r>
         <w:rPr>
@@ -5549,21 +5072,7 @@
         <w:rPr>
           <w:color w:val="0070C0"/>
         </w:rPr>
-        <w:t xml:space="preserve">Members can waive the notice requirement by signing a written waiver before, during, or after the meeting. If a </w:t>
-      </w:r>
-      <w:proofErr w:type="gramStart"/>
-      <w:r>
-        <w:rPr>
-          <w:color w:val="0070C0"/>
-        </w:rPr>
-        <w:t>Member</w:t>
-      </w:r>
-      <w:proofErr w:type="gramEnd"/>
-      <w:r>
-        <w:rPr>
-          <w:color w:val="0070C0"/>
-        </w:rPr>
-        <w:t xml:space="preserve"> shows up to a meeting and doesn’t object at the start, they are considered to have waived notice.</w:t>
+        <w:t>Members can waive the notice requirement by signing a written waiver before, during, or after the meeting. If a Member shows up to a meeting and doesn’t object at the start, they are considered to have waived notice.</w:t>
       </w:r>
     </w:p>
     <w:p>
@@ -5602,42 +5111,14 @@
         <w:rPr>
           <w:color w:val="0070C0"/>
         </w:rPr>
-        <w:t xml:space="preserve">Any Manager may start and lead a </w:t>
-      </w:r>
-      <w:proofErr w:type="gramStart"/>
-      <w:r>
-        <w:rPr>
-          <w:color w:val="0070C0"/>
-        </w:rPr>
-        <w:t>Member</w:t>
-      </w:r>
-      <w:proofErr w:type="gramEnd"/>
-      <w:r>
-        <w:rPr>
-          <w:color w:val="0070C0"/>
-        </w:rPr>
-        <w:t xml:space="preserve"> meeting. If no Manager </w:t>
+        <w:t xml:space="preserve">Any Manager may start and lead a Member meeting. If no Manager </w:t>
       </w:r>
       <w:r>
         <w:rPr>
           <w:color w:val="0070C0"/>
         </w:rPr>
         <w:lastRenderedPageBreak/>
-        <w:t xml:space="preserve">does so, the person who properly called the meeting may begin it, but a </w:t>
-      </w:r>
-      <w:proofErr w:type="gramStart"/>
-      <w:r>
-        <w:rPr>
-          <w:color w:val="0070C0"/>
-        </w:rPr>
-        <w:t>Manager</w:t>
-      </w:r>
-      <w:proofErr w:type="gramEnd"/>
-      <w:r>
-        <w:rPr>
-          <w:color w:val="0070C0"/>
-        </w:rPr>
-        <w:t xml:space="preserve"> will still serve as the meeting’s presiding officer.</w:t>
+        <w:t>does so, the person who properly called the meeting may begin it, but a Manager will still serve as the meeting’s presiding officer.</w:t>
       </w:r>
     </w:p>
     <w:p>
@@ -5801,21 +5282,7 @@
         <w:rPr>
           <w:color w:val="0070C0"/>
         </w:rPr>
-        <w:t xml:space="preserve">A Member may vote in person or by signing a written proxy that authorizes someone else to vote on their behalf. Proxies expire </w:t>
-      </w:r>
-      <w:proofErr w:type="gramStart"/>
-      <w:r>
-        <w:rPr>
-          <w:color w:val="0070C0"/>
-        </w:rPr>
-        <w:t>after one year from</w:t>
-      </w:r>
-      <w:proofErr w:type="gramEnd"/>
-      <w:r>
-        <w:rPr>
-          <w:color w:val="0070C0"/>
-        </w:rPr>
-        <w:t xml:space="preserve"> the date they’re signed.</w:t>
+        <w:t>A Member may vote in person or by signing a written proxy that authorizes someone else to vote on their behalf. Proxies expire after one year from the date they’re signed.</w:t>
       </w:r>
     </w:p>
     <w:p>
@@ -5934,25 +5401,7 @@
           <w:sz w:val="22"/>
           <w:szCs w:val="22"/>
         </w:rPr>
-        <w:t xml:space="preserve">Units held in retirement or savings accounts (like IRAs, HSAs, ESAs, etc.) may be </w:t>
-      </w:r>
-      <w:proofErr w:type="gramStart"/>
-      <w:r>
-        <w:rPr>
-          <w:color w:val="0070C0"/>
-          <w:sz w:val="22"/>
-          <w:szCs w:val="22"/>
-        </w:rPr>
-        <w:t>voted</w:t>
-      </w:r>
-      <w:proofErr w:type="gramEnd"/>
-      <w:r>
-        <w:rPr>
-          <w:color w:val="0070C0"/>
-          <w:sz w:val="22"/>
-          <w:szCs w:val="22"/>
-        </w:rPr>
-        <w:t xml:space="preserve"> by the account holder (or the Responsible Individual for an ESA) until the Company receives notice that:</w:t>
+        <w:t>Units held in retirement or savings accounts (like IRAs, HSAs, ESAs, etc.) may be voted by the account holder (or the Responsible Individual for an ESA) until the Company receives notice that:</w:t>
       </w:r>
     </w:p>
     <w:p>
@@ -6032,29 +5481,7 @@
           <w:sz w:val="22"/>
           <w:szCs w:val="22"/>
         </w:rPr>
-        <w:t xml:space="preserve">Units held by an entity (like a business or trust) must be </w:t>
-      </w:r>
-      <w:proofErr w:type="gramStart"/>
-      <w:r>
-        <w:rPr>
-          <w:b w:val="0"/>
-          <w:bCs w:val="0"/>
-          <w:color w:val="0070C0"/>
-          <w:sz w:val="22"/>
-          <w:szCs w:val="22"/>
-        </w:rPr>
-        <w:t>voted</w:t>
-      </w:r>
-      <w:proofErr w:type="gramEnd"/>
-      <w:r>
-        <w:rPr>
-          <w:b w:val="0"/>
-          <w:bCs w:val="0"/>
-          <w:color w:val="0070C0"/>
-          <w:sz w:val="22"/>
-          <w:szCs w:val="22"/>
-        </w:rPr>
-        <w:t xml:space="preserve"> by the person the entity designates in writing.</w:t>
+        <w:t>Units held by an entity (like a business or trust) must be voted by the person the entity designates in writing.</w:t>
       </w:r>
     </w:p>
     <w:p>
@@ -6178,23 +5605,7 @@
           <w:bCs w:val="0"/>
           <w:color w:val="auto"/>
         </w:rPr>
-        <w:t xml:space="preserve">If more than one votes, but the vote is evenly split on any </w:t>
-      </w:r>
-      <w:proofErr w:type="gramStart"/>
-      <w:r>
-        <w:rPr>
-          <w:bCs w:val="0"/>
-          <w:color w:val="auto"/>
-        </w:rPr>
-        <w:t>particular matter</w:t>
-      </w:r>
-      <w:proofErr w:type="gramEnd"/>
-      <w:r>
-        <w:rPr>
-          <w:bCs w:val="0"/>
-          <w:color w:val="auto"/>
-        </w:rPr>
-        <w:t>, each fraction may vote the Membership Units in question proportionally.</w:t>
+        <w:t>If more than one votes, but the vote is evenly split on any particular matter, each fraction may vote the Membership Units in question proportionally.</w:t>
       </w:r>
     </w:p>
     <w:p>
@@ -6859,21 +6270,7 @@
         <w:rPr>
           <w:color w:val="0070C0"/>
         </w:rPr>
-        <w:t xml:space="preserve">If a </w:t>
-      </w:r>
-      <w:proofErr w:type="gramStart"/>
-      <w:r>
-        <w:rPr>
-          <w:color w:val="0070C0"/>
-        </w:rPr>
-        <w:t>Member</w:t>
-      </w:r>
-      <w:proofErr w:type="gramEnd"/>
-      <w:r>
-        <w:rPr>
-          <w:color w:val="0070C0"/>
-        </w:rPr>
-        <w:t xml:space="preserve"> requests it at least 14 days before a meeting, the Manager must prepare a list of all Members eligible to vote. The list must show each Member’s name, address, and number of Units. It must be available for review by any Member for 10 days before the meeting and during the meeting itself, either at the meeting location or another specified place in the same city.)</w:t>
+        <w:t>If a Member requests it at least 14 days before a meeting, the Manager must prepare a list of all Members eligible to vote. The list must show each Member’s name, address, and number of Units. It must be available for review by any Member for 10 days before the meeting and during the meeting itself, either at the meeting location or another specified place in the same city.)</w:t>
       </w:r>
     </w:p>
     <w:p>
@@ -6925,19 +6322,49 @@
         <w:rPr>
           <w:color w:val="0070C0"/>
         </w:rPr>
-        <w:t>The Company will start with one Manager, Jessica Santa</w:t>
-      </w:r>
-      <w:r>
-        <w:rPr>
-          <w:color w:val="0070C0"/>
-        </w:rPr>
-        <w:t>c</w:t>
-      </w:r>
-      <w:r>
-        <w:rPr>
-          <w:color w:val="0070C0"/>
-        </w:rPr>
-        <w:t>ruz, as named in the Articles</w:t>
+        <w:t>The Company will start with one Manager</w:t>
+      </w:r>
+      <w:del w:id="1" w:author="Wes Will Buy Your Home" w:date="2026-06-17T13:13:00Z" w16du:dateUtc="2026-06-17T17:13:00Z">
+        <w:r>
+          <w:rPr>
+            <w:color w:val="0070C0"/>
+          </w:rPr>
+          <w:delText>, Jessica Santa</w:delText>
+        </w:r>
+        <w:r>
+          <w:rPr>
+            <w:color w:val="0070C0"/>
+          </w:rPr>
+          <w:delText>c</w:delText>
+        </w:r>
+        <w:r>
+          <w:rPr>
+            <w:color w:val="0070C0"/>
+          </w:rPr>
+          <w:delText xml:space="preserve">ruz, as </w:delText>
+        </w:r>
+      </w:del>
+      <w:ins w:id="2" w:author="Wes Will Buy Your Home" w:date="2026-06-17T13:13:00Z" w16du:dateUtc="2026-06-17T17:13:00Z">
+        <w:r>
+          <w:rPr>
+            <w:color w:val="0070C0"/>
+          </w:rPr>
+          <w:t xml:space="preserve"> who will be named </w:t>
+        </w:r>
+      </w:ins>
+      <w:del w:id="3" w:author="Wes Will Buy Your Home" w:date="2026-06-17T13:13:00Z" w16du:dateUtc="2026-06-17T17:13:00Z">
+        <w:r>
+          <w:rPr>
+            <w:color w:val="0070C0"/>
+          </w:rPr>
+          <w:delText xml:space="preserve">named </w:delText>
+        </w:r>
+      </w:del>
+      <w:r>
+        <w:rPr>
+          <w:color w:val="0070C0"/>
+        </w:rPr>
+        <w:t>in the Articles</w:t>
       </w:r>
       <w:r>
         <w:rPr>
@@ -6955,21 +6382,29 @@
         <w:rPr>
           <w:color w:val="0070C0"/>
         </w:rPr>
-        <w:t xml:space="preserve">. She will serve until the first annual meeting or until she resigns or is removed. At each annual meeting, Members will elect a </w:t>
-      </w:r>
-      <w:proofErr w:type="gramStart"/>
-      <w:r>
-        <w:rPr>
-          <w:color w:val="0070C0"/>
-        </w:rPr>
-        <w:t>Manager</w:t>
-      </w:r>
-      <w:proofErr w:type="gramEnd"/>
-      <w:r>
-        <w:rPr>
-          <w:color w:val="0070C0"/>
-        </w:rPr>
-        <w:t xml:space="preserve"> for the next term. The number of Managers can only be changed with approval from Members holding at least 75% of the voting Units (as required for “Major Decisions” in </w:t>
+        <w:t xml:space="preserve">. </w:t>
+      </w:r>
+      <w:del w:id="4" w:author="Wes Will Buy Your Home" w:date="2026-06-17T13:14:00Z" w16du:dateUtc="2026-06-17T17:14:00Z">
+        <w:r>
+          <w:rPr>
+            <w:color w:val="0070C0"/>
+          </w:rPr>
+          <w:delText xml:space="preserve">She </w:delText>
+        </w:r>
+      </w:del>
+      <w:ins w:id="5" w:author="Wes Will Buy Your Home" w:date="2026-06-17T13:14:00Z" w16du:dateUtc="2026-06-17T17:14:00Z">
+        <w:r>
+          <w:rPr>
+            <w:color w:val="0070C0"/>
+          </w:rPr>
+          <w:t xml:space="preserve">The Mangager </w:t>
+        </w:r>
+      </w:ins>
+      <w:r>
+        <w:rPr>
+          <w:color w:val="0070C0"/>
+        </w:rPr>
+        <w:t xml:space="preserve">will serve until the first annual meeting or until she resigns or is removed. At each annual meeting, Members will elect a Manager for the next term. The number of Managers can only be changed with approval from Members holding at least 75% of the voting Units (as required for “Major Decisions” in </w:t>
       </w:r>
       <w:r>
         <w:rPr>
@@ -6982,21 +6417,7 @@
         <w:rPr>
           <w:color w:val="0070C0"/>
         </w:rPr>
-        <w:t xml:space="preserve">). A Manager doesn’t have to be a </w:t>
-      </w:r>
-      <w:proofErr w:type="gramStart"/>
-      <w:r>
-        <w:rPr>
-          <w:color w:val="0070C0"/>
-        </w:rPr>
-        <w:t>Member</w:t>
-      </w:r>
-      <w:proofErr w:type="gramEnd"/>
-      <w:r>
-        <w:rPr>
-          <w:color w:val="0070C0"/>
-        </w:rPr>
-        <w:t xml:space="preserve"> or own any Units.)</w:t>
+        <w:t>). A Manager doesn’t have to be a Member or own any Units.)</w:t>
       </w:r>
     </w:p>
     <w:p>
@@ -7021,81 +6442,66 @@
           <w:sz w:val="22"/>
           <w:szCs w:val="22"/>
         </w:rPr>
-        <w:t xml:space="preserve">A Manager need not be a </w:t>
-      </w:r>
-      <w:proofErr w:type="gramStart"/>
-      <w:r>
-        <w:rPr>
-          <w:b w:val="0"/>
-          <w:bCs w:val="0"/>
+        <w:t>A Manager need not be a Member or a holder of a Membership Unit.</w:t>
+      </w:r>
+    </w:p>
+    <w:p>
+      <w:pPr>
+        <w:spacing w:after="205" w:line="266" w:lineRule="auto"/>
+        <w:ind w:left="-5" w:hanging="10"/>
+      </w:pPr>
+    </w:p>
+    <w:p>
+      <w:pPr>
+        <w:pStyle w:val="Heading2"/>
+        <w:rPr>
+          <w:color w:val="0070C0"/>
+        </w:rPr>
+      </w:pPr>
+      <w:r>
+        <w:rPr>
+          <w:color w:val="0070C0"/>
+        </w:rPr>
+        <w:t>Each Manager remains in office until replaced, resigns, or is removed. Attending a meeting or approving its minutes counts as accepting the Manager role.</w:t>
+      </w:r>
+    </w:p>
+    <w:p>
+      <w:r>
+        <w:rPr>
+          <w:color w:val="008000"/>
+        </w:rPr>
+        <w:t>Current Manager(s). Joshua Kennedy is the current Manager of the Company and will serve until replaced, resignation, or removal under this Agreement.</w:t>
+      </w:r>
+    </w:p>
+    <w:p>
+      <w:r>
+        <w:rPr>
+          <w:color w:val="008000"/>
+        </w:rPr>
+        <w:lastRenderedPageBreak/>
+        <w:t>Entity Manager Authority. Investment Services LLC may serve as a Manager of the Company. When Investment Services LLC acts as Manager, it may act through its authorized manager or other authorized representative, and that person may sign on behalf of Investment Services LLC in its capacity as Manager.</w:t>
+      </w:r>
+    </w:p>
+    <w:p>
+      <w:pPr>
+        <w:pStyle w:val="Heading1"/>
+        <w:keepNext w:val="0"/>
+        <w:keepLines w:val="0"/>
+        <w:widowControl w:val="0"/>
+        <w:jc w:val="both"/>
+        <w:rPr>
           <w:color w:val="auto"/>
           <w:sz w:val="22"/>
           <w:szCs w:val="22"/>
         </w:rPr>
-        <w:t>Member</w:t>
-      </w:r>
-      <w:proofErr w:type="gramEnd"/>
-      <w:r>
-        <w:rPr>
-          <w:b w:val="0"/>
-          <w:bCs w:val="0"/>
+      </w:pPr>
+      <w:r>
+        <w:rPr>
           <w:color w:val="auto"/>
           <w:sz w:val="22"/>
           <w:szCs w:val="22"/>
         </w:rPr>
-        <w:t xml:space="preserve"> or a holder of a Membership Unit.</w:t>
-      </w:r>
-    </w:p>
-    <w:p>
-      <w:pPr>
-        <w:spacing w:after="205" w:line="266" w:lineRule="auto"/>
-        <w:ind w:left="-5" w:hanging="10"/>
-      </w:pPr>
-    </w:p>
-    <w:p>
-      <w:pPr>
-        <w:pStyle w:val="Heading2"/>
-        <w:rPr>
-          <w:color w:val="0070C0"/>
-        </w:rPr>
-      </w:pPr>
-      <w:r>
-        <w:rPr>
-          <w:color w:val="0070C0"/>
-        </w:rPr>
-        <w:t xml:space="preserve">Each Manager remains in office </w:t>
-      </w:r>
-      <w:proofErr w:type="gramStart"/>
-      <w:r>
-        <w:rPr>
-          <w:color w:val="0070C0"/>
-        </w:rPr>
-        <w:t>until</w:t>
-      </w:r>
-      <w:proofErr w:type="gramEnd"/>
-      <w:r>
-        <w:rPr>
-          <w:color w:val="0070C0"/>
-        </w:rPr>
-        <w:t xml:space="preserve"> replaced, resigns, or is removed. Attending a meeting or approving its minutes counts as accepting the Manager role.</w:t>
-      </w:r>
-    </w:p>
-    <w:p>
-      <w:r>
-        <w:rPr>
-          <w:b w:val="0"/>
-          <w:color w:val="008000"/>
-        </w:rPr>
-        <w:t>Current Manager(s). Joshua Kennedy is the current Manager of the Company and will serve until replaced, resignation, or removal under this Agreement.</w:t>
-      </w:r>
-    </w:p>
-    <w:p>
-      <w:pPr/>
-      <w:r>
-        <w:rPr>
-          <w:color w:val="008000"/>
-        </w:rPr>
-        <w:t>Entity Manager Authority. Investment Services LLC may serve as a Manager of the Company. When Investment Services LLC acts as Manager, it may act through its authorized manager or other authorized representative, and that person may sign on behalf of Investment Services LLC in its capacity as Manager.</w:t>
+        <w:t>Unless otherwise agreed to by the approval of Members holding the required percentage of Membership Units for “Major Decisions” (as defined in Section 5.2(b) of this Operating Agreement), a Manager shall not be the Account Holder of a Member (as defined in Section 3.7 of the Operating Agreement) or any other disqualified person (as defined in Internal Revenue Code §4975) to the Member.</w:t>
       </w:r>
     </w:p>
     <w:p>
@@ -7117,37 +6523,6 @@
           <w:sz w:val="22"/>
           <w:szCs w:val="22"/>
         </w:rPr>
-        <w:t xml:space="preserve">Unless otherwise agreed to by the approval of Members holding the required percentage of Membership Units for “Major Decisions” (as defined in Section 5.2(b) of this Operating </w:t>
-      </w:r>
-      <w:r>
-        <w:rPr>
-          <w:color w:val="auto"/>
-          <w:sz w:val="22"/>
-          <w:szCs w:val="22"/>
-        </w:rPr>
-        <w:lastRenderedPageBreak/>
-        <w:t>Agreement), a Manager shall not be the Account Holder of a Member (as defined in Section 3.7 of the Operating Agreement) or any other disqualified person (as defined in Internal Revenue Code §4975) to the Member.</w:t>
-      </w:r>
-    </w:p>
-    <w:p>
-      <w:pPr>
-        <w:pStyle w:val="Heading1"/>
-        <w:keepNext w:val="0"/>
-        <w:keepLines w:val="0"/>
-        <w:widowControl w:val="0"/>
-        <w:jc w:val="both"/>
-        <w:rPr>
-          <w:color w:val="auto"/>
-          <w:sz w:val="22"/>
-          <w:szCs w:val="22"/>
-        </w:rPr>
-      </w:pPr>
-      <w:r>
-        <w:rPr>
-          <w:color w:val="auto"/>
-          <w:sz w:val="22"/>
-          <w:szCs w:val="22"/>
-        </w:rPr>
         <w:t>It is expressly understood and agreed by all parties in this Operating Agreement that the following individuals (who may be commonly referred to as “account holders”), Wesley D.</w:t>
       </w:r>
       <w:r>
@@ -7322,28 +6697,12 @@
         </w:rPr>
         <w:t xml:space="preserve">Borrowing </w:t>
       </w:r>
-      <w:ins w:id="1" w:author="Jeff Watson" w:date="2025-10-31T12:43:00Z" w16du:dateUtc="2025-10-31T16:43:00Z">
+      <w:ins w:id="6" w:author="Jeff Watson" w:date="2025-10-31T12:43:00Z" w16du:dateUtc="2025-10-31T16:43:00Z">
         <w:r>
           <w:rPr>
             <w:color w:val="0070C0"/>
           </w:rPr>
-          <w:t xml:space="preserve">on a </w:t>
-        </w:r>
-        <w:proofErr w:type="spellStart"/>
-        <w:proofErr w:type="gramStart"/>
-        <w:r>
-          <w:rPr>
-            <w:color w:val="0070C0"/>
-          </w:rPr>
-          <w:t>non recourse</w:t>
-        </w:r>
-        <w:proofErr w:type="spellEnd"/>
-        <w:proofErr w:type="gramEnd"/>
-        <w:r>
-          <w:rPr>
-            <w:color w:val="0070C0"/>
-          </w:rPr>
-          <w:t xml:space="preserve"> basis </w:t>
+          <w:t xml:space="preserve">on a non recourse basis </w:t>
         </w:r>
       </w:ins>
       <w:r>
@@ -7386,6 +6745,7 @@
         <w:rPr>
           <w:color w:val="0070C0"/>
         </w:rPr>
+        <w:lastRenderedPageBreak/>
         <w:t>Selling or transferring real estate owned by the Company, or most of its assets.</w:t>
       </w:r>
     </w:p>
@@ -7437,7 +6797,6 @@
         </w:numPr>
       </w:pPr>
       <w:r>
-        <w:lastRenderedPageBreak/>
         <w:t>Removal of a Manager.</w:t>
       </w:r>
     </w:p>
@@ -7467,10 +6826,10 @@
           <w:numId w:val="10"/>
         </w:numPr>
         <w:rPr>
-          <w:del w:id="2" w:author="Jeff Watson" w:date="2025-10-31T12:42:00Z" w16du:dateUtc="2025-10-31T16:42:00Z"/>
-        </w:rPr>
-      </w:pPr>
-      <w:del w:id="3" w:author="Jeff Watson" w:date="2025-10-31T12:42:00Z" w16du:dateUtc="2025-10-31T16:42:00Z">
+          <w:del w:id="7" w:author="Jeff Watson" w:date="2025-10-31T12:42:00Z" w16du:dateUtc="2025-10-31T16:42:00Z"/>
+        </w:rPr>
+      </w:pPr>
+      <w:del w:id="8" w:author="Jeff Watson" w:date="2025-10-31T12:42:00Z" w16du:dateUtc="2025-10-31T16:42:00Z">
         <w:r>
           <w:rPr>
             <w:color w:val="0070C0"/>
@@ -7610,21 +6969,7 @@
         <w:rPr>
           <w:color w:val="0070C0"/>
         </w:rPr>
-        <w:t xml:space="preserve">Manager meetings can be held anywhere, as stated in the notice or waiver. Managers may also participate by phone or video if everyone can hear each other. </w:t>
-      </w:r>
-      <w:proofErr w:type="gramStart"/>
-      <w:r>
-        <w:rPr>
-          <w:color w:val="0070C0"/>
-        </w:rPr>
-        <w:t>Participating</w:t>
-      </w:r>
-      <w:proofErr w:type="gramEnd"/>
-      <w:r>
-        <w:rPr>
-          <w:color w:val="0070C0"/>
-        </w:rPr>
-        <w:t xml:space="preserve"> this way counts as being present, unless the Manager joins only to object that the meeting wasn’t properly called.</w:t>
+        <w:t>Manager meetings can be held anywhere, as stated in the notice or waiver. Managers may also participate by phone or video if everyone can hear each other. Participating this way counts as being present, unless the Manager joins only to object that the meeting wasn’t properly called.</w:t>
       </w:r>
     </w:p>
     <w:p>
@@ -7653,21 +6998,7 @@
         <w:rPr>
           <w:color w:val="0070C0"/>
         </w:rPr>
-        <w:t xml:space="preserve">Manager(s) can </w:t>
-      </w:r>
-      <w:proofErr w:type="gramStart"/>
-      <w:r>
-        <w:rPr>
-          <w:color w:val="0070C0"/>
-        </w:rPr>
-        <w:t>take action</w:t>
-      </w:r>
-      <w:proofErr w:type="gramEnd"/>
-      <w:r>
-        <w:rPr>
-          <w:color w:val="0070C0"/>
-        </w:rPr>
-        <w:t xml:space="preserve"> without a meeting if all of them agree in writing. The written consent must be kept with the Company’s meeting records.</w:t>
+        <w:t>Manager(s) can take action without a meeting if all of them agree in writing. The written consent must be kept with the Company’s meeting records.</w:t>
       </w:r>
     </w:p>
     <w:p>
@@ -7692,47 +7023,11 @@
       <w:r>
         <w:t xml:space="preserve">.  </w:t>
       </w:r>
-      <w:proofErr w:type="gramStart"/>
-      <w:r>
-        <w:rPr>
-          <w:color w:val="0070C0"/>
-        </w:rPr>
-        <w:t>A majority of</w:t>
-      </w:r>
-      <w:proofErr w:type="gramEnd"/>
-      <w:r>
-        <w:rPr>
-          <w:color w:val="0070C0"/>
-        </w:rPr>
-        <w:t xml:space="preserve"> all Managers is needed to conduct business. If a quorum is present, a majority vote decides the matter—unless the law, Articles, or this Agreement requires more. Business can continue even if some Managers leave and the quorum is lost. If there's no quorum, the meeting can be </w:t>
-      </w:r>
-      <w:proofErr w:type="gramStart"/>
-      <w:r>
-        <w:rPr>
-          <w:color w:val="0070C0"/>
-        </w:rPr>
-        <w:t>postponed up</w:t>
-      </w:r>
-      <w:proofErr w:type="gramEnd"/>
-      <w:r>
-        <w:rPr>
-          <w:color w:val="0070C0"/>
-        </w:rPr>
-        <w:t xml:space="preserve"> to 60 days without needing </w:t>
-      </w:r>
-      <w:proofErr w:type="gramStart"/>
-      <w:r>
-        <w:rPr>
-          <w:color w:val="0070C0"/>
-        </w:rPr>
-        <w:t>a new</w:t>
-      </w:r>
-      <w:proofErr w:type="gramEnd"/>
-      <w:r>
-        <w:rPr>
-          <w:color w:val="0070C0"/>
-        </w:rPr>
-        <w:t xml:space="preserve"> notice. Any business that could’ve been done at the original meeting can be handled at the rescheduled one.</w:t>
+      <w:r>
+        <w:rPr>
+          <w:color w:val="0070C0"/>
+        </w:rPr>
+        <w:t>A majority of all Managers is needed to conduct business. If a quorum is present, a majority vote decides the matter—unless the law, Articles, or this Agreement requires more. Business can continue even if some Managers leave and the quorum is lost. If there's no quorum, the meeting can be postponed up to 60 days without needing a new notice. Any business that could’ve been done at the original meeting can be handled at the rescheduled one.</w:t>
       </w:r>
     </w:p>
     <w:p>
@@ -7752,6 +7047,7 @@
           <w:bCs w:val="0"/>
           <w:u w:val="single"/>
         </w:rPr>
+        <w:lastRenderedPageBreak/>
         <w:t>Waiver</w:t>
       </w:r>
       <w:r>
@@ -7810,7 +7106,6 @@
           <w:bCs w:val="0"/>
           <w:u w:val="single"/>
         </w:rPr>
-        <w:lastRenderedPageBreak/>
         <w:t>Vacancies; Election of New Manager(s).</w:t>
       </w:r>
       <w:r>
@@ -7820,21 +7115,7 @@
         <w:rPr>
           <w:color w:val="0070C0"/>
         </w:rPr>
-        <w:t xml:space="preserve">If a </w:t>
-      </w:r>
-      <w:proofErr w:type="gramStart"/>
-      <w:r>
-        <w:rPr>
-          <w:color w:val="0070C0"/>
-        </w:rPr>
-        <w:t>Manager</w:t>
-      </w:r>
-      <w:proofErr w:type="gramEnd"/>
-      <w:r>
-        <w:rPr>
-          <w:color w:val="0070C0"/>
-        </w:rPr>
-        <w:t xml:space="preserve"> dies, resigns, is removed, becomes incapacitated (as confirmed by a doctor), or otherwise leaves the position, that role becomes vacant. The remaining Managers—if there’s more than one—can fill the vacancy by majority vote. If only one Manager remains, a new one must be elected by the Members at an annual or special meeting. If the number of Managers is increased, new positions must also be filled by Member vote at a meeting.</w:t>
+        <w:t>If a Manager dies, resigns, is removed, becomes incapacitated (as confirmed by a doctor), or otherwise leaves the position, that role becomes vacant. The remaining Managers—if there’s more than one—can fill the vacancy by majority vote. If only one Manager remains, a new one must be elected by the Members at an annual or special meeting. If the number of Managers is increased, new positions must also be filled by Member vote at a meeting.</w:t>
       </w:r>
     </w:p>
     <w:p>
@@ -7855,25 +7136,7 @@
           <w:bCs w:val="0"/>
           <w:u w:val="single"/>
         </w:rPr>
-        <w:t xml:space="preserve">Compensation </w:t>
-      </w:r>
-      <w:proofErr w:type="gramStart"/>
-      <w:r>
-        <w:rPr>
-          <w:b/>
-          <w:bCs w:val="0"/>
-          <w:u w:val="single"/>
-        </w:rPr>
-        <w:t>of</w:t>
-      </w:r>
-      <w:proofErr w:type="gramEnd"/>
-      <w:r>
-        <w:rPr>
-          <w:b/>
-          <w:bCs w:val="0"/>
-          <w:u w:val="single"/>
-        </w:rPr>
-        <w:t xml:space="preserve"> Manager(s)</w:t>
+        <w:t>Compensation of Manager(s)</w:t>
       </w:r>
       <w:r>
         <w:t xml:space="preserve">.  </w:t>
@@ -7943,49 +7206,7 @@
         <w:rPr>
           <w:color w:val="0070C0"/>
         </w:rPr>
-        <w:t xml:space="preserve">If the Company </w:t>
-      </w:r>
-      <w:proofErr w:type="gramStart"/>
-      <w:r>
-        <w:rPr>
-          <w:color w:val="0070C0"/>
-        </w:rPr>
-        <w:t>enters into</w:t>
-      </w:r>
-      <w:proofErr w:type="gramEnd"/>
-      <w:r>
-        <w:rPr>
-          <w:color w:val="0070C0"/>
-        </w:rPr>
-        <w:t xml:space="preserve"> a contract or transaction involving one or more of its </w:t>
-      </w:r>
-      <w:proofErr w:type="gramStart"/>
-      <w:r>
-        <w:rPr>
-          <w:color w:val="0070C0"/>
-        </w:rPr>
-        <w:t>Managers</w:t>
-      </w:r>
-      <w:proofErr w:type="gramEnd"/>
-      <w:r>
-        <w:rPr>
-          <w:color w:val="0070C0"/>
-        </w:rPr>
-        <w:t xml:space="preserve">—or with another business where a </w:t>
-      </w:r>
-      <w:proofErr w:type="gramStart"/>
-      <w:r>
-        <w:rPr>
-          <w:color w:val="0070C0"/>
-        </w:rPr>
-        <w:t>Manager</w:t>
-      </w:r>
-      <w:proofErr w:type="gramEnd"/>
-      <w:r>
-        <w:rPr>
-          <w:color w:val="0070C0"/>
-        </w:rPr>
-        <w:t xml:space="preserve"> has a role or financial interest—that deal is not automatically invalid just because of the Manager’s involvement.</w:t>
+        <w:t>If the Company enters into a contract or transaction involving one or more of its Managers—or with another business where a Manager has a role or financial interest—that deal is not automatically invalid just because of the Manager’s involvement.</w:t>
       </w:r>
     </w:p>
     <w:p>
@@ -8003,35 +7224,7 @@
         <w:rPr>
           <w:color w:val="0070C0"/>
         </w:rPr>
-        <w:t xml:space="preserve">The important details about the Manager’s role or interest are disclosed to the other Manager(s), and the deal is approved in good faith by </w:t>
-      </w:r>
-      <w:proofErr w:type="gramStart"/>
-      <w:r>
-        <w:rPr>
-          <w:color w:val="0070C0"/>
-        </w:rPr>
-        <w:t>a majority of</w:t>
-      </w:r>
-      <w:proofErr w:type="gramEnd"/>
-      <w:r>
-        <w:rPr>
-          <w:color w:val="0070C0"/>
-        </w:rPr>
-        <w:t xml:space="preserve"> the disinterested Manager(</w:t>
-      </w:r>
-      <w:proofErr w:type="gramStart"/>
-      <w:r>
-        <w:rPr>
-          <w:color w:val="0070C0"/>
-        </w:rPr>
-        <w:t>s)—</w:t>
-      </w:r>
-      <w:proofErr w:type="gramEnd"/>
-      <w:r>
-        <w:rPr>
-          <w:color w:val="0070C0"/>
-        </w:rPr>
-        <w:t>even if there are fewer than a quorum present; or</w:t>
+        <w:t>The important details about the Manager’s role or interest are disclosed to the other Manager(s), and the deal is approved in good faith by a majority of the disinterested Manager(s)—even if there are fewer than a quorum present; or</w:t>
       </w:r>
     </w:p>
     <w:p>
@@ -8156,6 +7349,7 @@
           <w:color w:val="auto"/>
           <w:u w:val="single"/>
         </w:rPr>
+        <w:lastRenderedPageBreak/>
         <w:t>Indemnification</w:t>
       </w:r>
     </w:p>
@@ -8239,14 +7433,7 @@
         <w:rPr>
           <w:color w:val="0070C0"/>
         </w:rPr>
-        <w:t xml:space="preserve">means anyone who is or was a Manager of the Company, including anyone who served at the Company’s request in a similar leadership or </w:t>
-      </w:r>
-      <w:r>
-        <w:rPr>
-          <w:color w:val="0070C0"/>
-        </w:rPr>
-        <w:lastRenderedPageBreak/>
-        <w:t>representative role in another business or organization.)</w:t>
+        <w:t>means anyone who is or was a Manager of the Company, including anyone who served at the Company’s request in a similar leadership or representative role in another business or organization.)</w:t>
       </w:r>
     </w:p>
     <w:p>
@@ -8291,15 +7478,7 @@
         </w:numPr>
       </w:pPr>
       <w:r>
-        <w:t xml:space="preserve">when used with respect to a </w:t>
-      </w:r>
-      <w:proofErr w:type="gramStart"/>
-      <w:r>
-        <w:t>Manager</w:t>
-      </w:r>
-      <w:proofErr w:type="gramEnd"/>
-      <w:r>
-        <w:t>, the office of Manager in the Company; and</w:t>
+        <w:t>when used with respect to a Manager, the office of Manager in the Company; and</w:t>
       </w:r>
     </w:p>
     <w:p>
@@ -8358,38 +7537,15 @@
         <w:rPr>
           <w:color w:val="0070C0"/>
         </w:rPr>
-        <w:t xml:space="preserve">The Company will cover (indemnify) a </w:t>
-      </w:r>
-      <w:proofErr w:type="gramStart"/>
-      <w:r>
-        <w:rPr>
-          <w:color w:val="0070C0"/>
-        </w:rPr>
-        <w:t>Manager’s</w:t>
-      </w:r>
-      <w:proofErr w:type="gramEnd"/>
-      <w:r>
-        <w:rPr>
-          <w:color w:val="0070C0"/>
-        </w:rPr>
-        <w:t xml:space="preserve"> legal costs if they are sued, named, or threatened in a legal proceeding </w:t>
-      </w:r>
-      <w:r>
-        <w:rPr>
-          <w:b/>
-          <w:color w:val="0070C0"/>
-        </w:rPr>
-        <w:t xml:space="preserve">because they are or were a </w:t>
-      </w:r>
-      <w:proofErr w:type="gramStart"/>
-      <w:r>
-        <w:rPr>
-          <w:b/>
-          <w:color w:val="0070C0"/>
-        </w:rPr>
-        <w:t>Manager</w:t>
-      </w:r>
-      <w:proofErr w:type="gramEnd"/>
+        <w:t xml:space="preserve">The Company will cover (indemnify) a Manager’s legal costs if they are sued, named, or threatened in a legal proceeding </w:t>
+      </w:r>
+      <w:r>
+        <w:rPr>
+          <w:b/>
+          <w:color w:val="0070C0"/>
+        </w:rPr>
+        <w:t>because they are or were a Manager</w:t>
+      </w:r>
       <w:r>
         <w:rPr>
           <w:color w:val="0070C0"/>
@@ -8419,15 +7575,7 @@
           <w:b/>
           <w:color w:val="0070C0"/>
         </w:rPr>
-        <w:t xml:space="preserve">good </w:t>
-      </w:r>
-      <w:proofErr w:type="gramStart"/>
-      <w:r>
-        <w:rPr>
-          <w:b/>
-          <w:color w:val="0070C0"/>
-        </w:rPr>
-        <w:t>faith</w:t>
+        <w:t>good faith</w:t>
       </w:r>
       <w:r>
         <w:rPr>
@@ -8435,7 +7583,6 @@
         </w:rPr>
         <w:t>;</w:t>
       </w:r>
-      <w:proofErr w:type="gramEnd"/>
     </w:p>
     <w:p>
       <w:pPr>
@@ -8448,19 +7595,11 @@
           <w:numId w:val="10"/>
         </w:numPr>
       </w:pPr>
-      <w:proofErr w:type="gramStart"/>
-      <w:r>
-        <w:rPr>
-          <w:color w:val="0070C0"/>
-        </w:rPr>
-        <w:t>Believed</w:t>
-      </w:r>
-      <w:proofErr w:type="gramEnd"/>
-      <w:r>
-        <w:rPr>
-          <w:color w:val="0070C0"/>
-        </w:rPr>
-        <w:t xml:space="preserve"> their actions were:</w:t>
+      <w:r>
+        <w:rPr>
+          <w:color w:val="0070C0"/>
+        </w:rPr>
+        <w:t>Believed their actions were:</w:t>
       </w:r>
     </w:p>
     <w:p>
@@ -8512,19 +7651,11 @@
         <w:keepLines w:val="0"/>
         <w:widowControl w:val="0"/>
       </w:pPr>
-      <w:proofErr w:type="gramStart"/>
-      <w:r>
-        <w:rPr>
-          <w:color w:val="0070C0"/>
-        </w:rPr>
-        <w:t>Had</w:t>
-      </w:r>
-      <w:proofErr w:type="gramEnd"/>
-      <w:r>
-        <w:rPr>
-          <w:color w:val="0070C0"/>
-        </w:rPr>
-        <w:t xml:space="preserve"> </w:t>
+      <w:r>
+        <w:rPr>
+          <w:color w:val="0070C0"/>
+        </w:rPr>
+        <w:t xml:space="preserve">Had </w:t>
       </w:r>
       <w:r>
         <w:rPr>
@@ -8552,6 +7683,7 @@
         <w:rPr>
           <w:color w:val="0070C0"/>
         </w:rPr>
+        <w:lastRenderedPageBreak/>
         <w:t>Only if these standards are met (as determined under later sections of this Article) will indemnification be allowed.</w:t>
       </w:r>
     </w:p>
@@ -8594,21 +7726,7 @@
         <w:rPr>
           <w:color w:val="0070C0"/>
         </w:rPr>
-        <w:t xml:space="preserve"> indemnify a </w:t>
-      </w:r>
-      <w:proofErr w:type="gramStart"/>
-      <w:r>
-        <w:rPr>
-          <w:color w:val="0070C0"/>
-        </w:rPr>
-        <w:t>Manager</w:t>
-      </w:r>
-      <w:proofErr w:type="gramEnd"/>
-      <w:r>
-        <w:rPr>
-          <w:color w:val="0070C0"/>
-        </w:rPr>
-        <w:t xml:space="preserve"> if:</w:t>
+        <w:t xml:space="preserve"> indemnify a Manager if:</w:t>
       </w:r>
     </w:p>
     <w:p>
@@ -8634,21 +7752,12 @@
         </w:rPr>
         <w:t xml:space="preserve">hey are found liable for </w:t>
       </w:r>
-      <w:proofErr w:type="gramStart"/>
-      <w:r>
-        <w:rPr>
-          <w:b/>
-          <w:color w:val="0070C0"/>
-        </w:rPr>
-        <w:t>personally</w:t>
-      </w:r>
-      <w:proofErr w:type="gramEnd"/>
-      <w:r>
-        <w:rPr>
-          <w:b/>
-          <w:color w:val="0070C0"/>
-        </w:rPr>
-        <w:t xml:space="preserve"> benefiting improperly</w:t>
+      <w:r>
+        <w:rPr>
+          <w:b/>
+          <w:color w:val="0070C0"/>
+        </w:rPr>
+        <w:t>personally benefiting improperly</w:t>
       </w:r>
       <w:r>
         <w:rPr>
@@ -8679,15 +7788,7 @@
           <w:b/>
           <w:color w:val="0070C0"/>
         </w:rPr>
-        <w:t xml:space="preserve">willful or intentional </w:t>
-      </w:r>
-      <w:r>
-        <w:rPr>
-          <w:b/>
-          <w:color w:val="0070C0"/>
-        </w:rPr>
-        <w:lastRenderedPageBreak/>
-        <w:t>misconduct</w:t>
+        <w:t>willful or intentional misconduct</w:t>
       </w:r>
       <w:r>
         <w:rPr>
@@ -8757,21 +7858,7 @@
         <w:rPr>
           <w:color w:val="0070C0"/>
         </w:rPr>
-        <w:t xml:space="preserve">If a </w:t>
-      </w:r>
-      <w:proofErr w:type="gramStart"/>
-      <w:r>
-        <w:rPr>
-          <w:color w:val="0070C0"/>
-        </w:rPr>
-        <w:t>Manager</w:t>
-      </w:r>
-      <w:proofErr w:type="gramEnd"/>
-      <w:r>
-        <w:rPr>
-          <w:color w:val="0070C0"/>
-        </w:rPr>
-        <w:t xml:space="preserve"> qualifies for indemnification under this Article, the Company will cover any judgments, penalties (including taxes), fines, settlements, and reasonable legal expenses they actually paid because of the proceeding.</w:t>
+        <w:t>If a Manager qualifies for indemnification under this Article, the Company will cover any judgments, penalties (including taxes), fines, settlements, and reasonable legal expenses they actually paid because of the proceeding.</w:t>
       </w:r>
     </w:p>
     <w:p>
@@ -8847,16 +7934,8 @@
         <w:rPr>
           <w:color w:val="0070C0"/>
         </w:rPr>
-        <w:t xml:space="preserve"> in the </w:t>
-      </w:r>
-      <w:proofErr w:type="gramStart"/>
-      <w:r>
-        <w:rPr>
-          <w:color w:val="0070C0"/>
-        </w:rPr>
-        <w:t>proceeding;</w:t>
-      </w:r>
-      <w:proofErr w:type="gramEnd"/>
+        <w:t xml:space="preserve"> in the proceeding;</w:t>
+      </w:r>
     </w:p>
     <w:p>
       <w:pPr>
@@ -8973,6 +8052,7 @@
           <w:bCs w:val="0"/>
           <w:u w:val="single"/>
         </w:rPr>
+        <w:lastRenderedPageBreak/>
         <w:t>Authorization of Indemnification.</w:t>
       </w:r>
       <w:r>
@@ -9065,21 +8145,7 @@
         <w:rPr>
           <w:color w:val="0070C0"/>
         </w:rPr>
-        <w:t xml:space="preserve">If a </w:t>
-      </w:r>
-      <w:proofErr w:type="gramStart"/>
-      <w:r>
-        <w:rPr>
-          <w:color w:val="0070C0"/>
-        </w:rPr>
-        <w:t>Manager</w:t>
-      </w:r>
-      <w:proofErr w:type="gramEnd"/>
-      <w:r>
-        <w:rPr>
-          <w:color w:val="0070C0"/>
-        </w:rPr>
-        <w:t xml:space="preserve"> successfully defends themselves—whether by winning the case or otherwise resolving it in their favor—the Company must reimburse them for reasonable legal expenses related to that defense.</w:t>
+        <w:t>If a Manager successfully defends themselves—whether by winning the case or otherwise resolving it in their favor—the Company must reimburse them for reasonable legal expenses related to that defense.</w:t>
       </w:r>
     </w:p>
     <w:p>
@@ -9126,21 +8192,7 @@
         <w:rPr>
           <w:color w:val="0070C0"/>
         </w:rPr>
-        <w:t>, the court must order the Company to pay—</w:t>
-      </w:r>
-      <w:proofErr w:type="gramStart"/>
-      <w:r>
-        <w:rPr>
-          <w:color w:val="0070C0"/>
-        </w:rPr>
-        <w:t>and also</w:t>
-      </w:r>
-      <w:proofErr w:type="gramEnd"/>
-      <w:r>
-        <w:rPr>
-          <w:color w:val="0070C0"/>
-        </w:rPr>
-        <w:t xml:space="preserve"> cover the Manager’s legal costs for winning the indemnification.</w:t>
+        <w:t>, the court must order the Company to pay—and also cover the Manager’s legal costs for winning the indemnification.</w:t>
       </w:r>
     </w:p>
     <w:p>
@@ -9183,28 +8235,7 @@
         <w:rPr>
           <w:color w:val="0070C0"/>
         </w:rPr>
-        <w:t xml:space="preserve">Even if a </w:t>
-      </w:r>
-      <w:proofErr w:type="gramStart"/>
-      <w:r>
-        <w:rPr>
-          <w:color w:val="0070C0"/>
-        </w:rPr>
-        <w:t>Manager</w:t>
-      </w:r>
-      <w:proofErr w:type="gramEnd"/>
-      <w:r>
-        <w:rPr>
-          <w:color w:val="0070C0"/>
-        </w:rPr>
-        <w:t xml:space="preserve"> doesn’t meet the usual </w:t>
-      </w:r>
-      <w:r>
-        <w:rPr>
-          <w:color w:val="0070C0"/>
-        </w:rPr>
-        <w:lastRenderedPageBreak/>
-        <w:t>requirements for indemnification—or has been found liable</w:t>
+        <w:t>Even if a Manager doesn’t meet the usual requirements for indemnification—or has been found liable</w:t>
       </w:r>
       <w:r>
         <w:rPr>
@@ -9216,21 +8247,7 @@
         <w:rPr>
           <w:color w:val="0070C0"/>
         </w:rPr>
-        <w:t xml:space="preserve">a court can still decide to award indemnification if it believes it’s fair under the circumstances. However, if the Manager was found liable to the Company or received </w:t>
-      </w:r>
-      <w:proofErr w:type="gramStart"/>
-      <w:r>
-        <w:rPr>
-          <w:color w:val="0070C0"/>
-        </w:rPr>
-        <w:t>an improper</w:t>
-      </w:r>
-      <w:proofErr w:type="gramEnd"/>
-      <w:r>
-        <w:rPr>
-          <w:color w:val="0070C0"/>
-        </w:rPr>
-        <w:t xml:space="preserve"> personal benefit, the court can only award reimbursement for reasonable legal expenses actually incurred.</w:t>
+        <w:t>a court can still decide to award indemnification if it believes it’s fair under the circumstances. However, if the Manager was found liable to the Company or received an improper personal benefit, the court can only award reimbursement for reasonable legal expenses actually incurred.</w:t>
       </w:r>
     </w:p>
     <w:p>
@@ -9265,35 +8282,7 @@
         <w:rPr>
           <w:color w:val="0070C0"/>
         </w:rPr>
-        <w:t xml:space="preserve">If a </w:t>
-      </w:r>
-      <w:proofErr w:type="gramStart"/>
-      <w:r>
-        <w:rPr>
-          <w:color w:val="0070C0"/>
-        </w:rPr>
-        <w:t>Manager</w:t>
-      </w:r>
-      <w:proofErr w:type="gramEnd"/>
-      <w:r>
-        <w:rPr>
-          <w:color w:val="0070C0"/>
-        </w:rPr>
-        <w:t xml:space="preserve"> is involved in a legal proceeding (or might be), the Company can pay their legal costs </w:t>
-      </w:r>
-      <w:proofErr w:type="gramStart"/>
-      <w:r>
-        <w:rPr>
-          <w:color w:val="0070C0"/>
-        </w:rPr>
-        <w:t>up front—</w:t>
-      </w:r>
-      <w:proofErr w:type="gramEnd"/>
-      <w:r>
-        <w:rPr>
-          <w:color w:val="0070C0"/>
-        </w:rPr>
-        <w:t>before the case is resolved—</w:t>
+        <w:t>If a Manager is involved in a legal proceeding (or might be), the Company can pay their legal costs up front—before the case is resolved—</w:t>
       </w:r>
       <w:r>
         <w:rPr>
@@ -9423,21 +8412,7 @@
         <w:rPr>
           <w:color w:val="0070C0"/>
         </w:rPr>
-        <w:t xml:space="preserve">The Company may choose to indemnify and advance expenses to someone who is not a </w:t>
-      </w:r>
-      <w:proofErr w:type="gramStart"/>
-      <w:r>
-        <w:rPr>
-          <w:color w:val="0070C0"/>
-        </w:rPr>
-        <w:t>Manager</w:t>
-      </w:r>
-      <w:proofErr w:type="gramEnd"/>
-      <w:r>
-        <w:rPr>
-          <w:color w:val="0070C0"/>
-        </w:rPr>
-        <w:t>, employee, or agent—but who served at the Company’s request in a leadership or representative role for another organization—on the same terms it offers to Managers under this Article.</w:t>
+        <w:t>The Company may choose to indemnify and advance expenses to someone who is not a Manager, employee, or agent—but who served at the Company’s request in a leadership or representative role for another organization—on the same terms it offers to Managers under this Article.</w:t>
       </w:r>
     </w:p>
     <w:p>
@@ -9480,7 +8455,14 @@
         <w:rPr>
           <w:color w:val="0070C0"/>
         </w:rPr>
-        <w:t>The Company may also advance legal expenses to non-employees and non-agents who served at the Company’s request in a leadership or representative role for another organization</w:t>
+        <w:t xml:space="preserve">The Company may also advance legal expenses to non-employees and non-agents who served at the Company’s request in a leadership or </w:t>
+      </w:r>
+      <w:r>
+        <w:rPr>
+          <w:color w:val="0070C0"/>
+        </w:rPr>
+        <w:lastRenderedPageBreak/>
+        <w:t>representative role for another organization</w:t>
       </w:r>
       <w:r>
         <w:rPr>
@@ -9529,19 +8511,11 @@
         </w:rPr>
         <w:t xml:space="preserve"> </w:t>
       </w:r>
-      <w:proofErr w:type="gramStart"/>
-      <w:r>
-        <w:rPr>
-          <w:color w:val="0070C0"/>
-        </w:rPr>
-        <w:t>Manager</w:t>
-      </w:r>
-      <w:proofErr w:type="gramEnd"/>
-      <w:r>
-        <w:rPr>
-          <w:color w:val="0070C0"/>
-        </w:rPr>
-        <w:t>, employee, agent, or representative. These protections also extend to their heirs, executors, and administrators.</w:t>
+      <w:r>
+        <w:rPr>
+          <w:color w:val="0070C0"/>
+        </w:rPr>
+        <w:t>Manager, employee, agent, or representative. These protections also extend to their heirs, executors, and administrators.</w:t>
       </w:r>
     </w:p>
     <w:p>
@@ -9615,49 +8589,7 @@
         <w:rPr>
           <w:color w:val="0070C0"/>
         </w:rPr>
-        <w:t xml:space="preserve">Whenever the Company provides indemnification or </w:t>
-      </w:r>
-      <w:proofErr w:type="gramStart"/>
-      <w:r>
-        <w:rPr>
-          <w:color w:val="0070C0"/>
-        </w:rPr>
-        <w:t>advances</w:t>
-      </w:r>
-      <w:proofErr w:type="gramEnd"/>
-      <w:r>
-        <w:rPr>
-          <w:color w:val="0070C0"/>
-        </w:rPr>
-        <w:t xml:space="preserve"> expenses to a </w:t>
-      </w:r>
-      <w:proofErr w:type="gramStart"/>
-      <w:r>
-        <w:rPr>
-          <w:color w:val="0070C0"/>
-        </w:rPr>
-        <w:t>Manager</w:t>
-      </w:r>
-      <w:proofErr w:type="gramEnd"/>
-      <w:r>
-        <w:rPr>
-          <w:color w:val="0070C0"/>
-        </w:rPr>
-        <w:t xml:space="preserve">, it must notify the Members in writing—either with or before the next meeting notice or written consent request. In any case, this report must be given within 12 months of </w:t>
-      </w:r>
-      <w:proofErr w:type="gramStart"/>
-      <w:r>
-        <w:rPr>
-          <w:color w:val="0070C0"/>
-        </w:rPr>
-        <w:t>the payment</w:t>
-      </w:r>
-      <w:proofErr w:type="gramEnd"/>
-      <w:r>
-        <w:rPr>
-          <w:color w:val="0070C0"/>
-        </w:rPr>
-        <w:t>.</w:t>
+        <w:t>Whenever the Company provides indemnification or advances expenses to a Manager, it must notify the Members in writing—either with or before the next meeting notice or written consent request. In any case, this report must be given within 12 months of the payment.</w:t>
       </w:r>
     </w:p>
     <w:p>
@@ -9685,28 +8617,7 @@
         <w:rPr>
           <w:color w:val="0070C0"/>
         </w:rPr>
-        <w:t xml:space="preserve">If a </w:t>
-      </w:r>
-      <w:proofErr w:type="gramStart"/>
-      <w:r>
-        <w:rPr>
-          <w:color w:val="0070C0"/>
-        </w:rPr>
-        <w:t>Manager</w:t>
-      </w:r>
-      <w:proofErr w:type="gramEnd"/>
-      <w:r>
-        <w:rPr>
-          <w:color w:val="0070C0"/>
-        </w:rPr>
-        <w:t xml:space="preserve"> serves an employee benefit plan as part of their duties </w:t>
-      </w:r>
-      <w:r>
-        <w:rPr>
-          <w:color w:val="0070C0"/>
-        </w:rPr>
-        <w:lastRenderedPageBreak/>
-        <w:t>to the Company, that service is treated as serving the Company. Any excise taxes they incur related to the plan are considered fines. If they act in good faith for the benefit of the plan’s participants, it is considered acting in the Company’s best interest.</w:t>
+        <w:t>If a Manager serves an employee benefit plan as part of their duties to the Company, that service is treated as serving the Company. Any excise taxes they incur related to the plan are considered fines. If they act in good faith for the benefit of the plan’s participants, it is considered acting in the Company’s best interest.</w:t>
       </w:r>
     </w:p>
     <w:p/>
@@ -9821,21 +8732,7 @@
         <w:rPr>
           <w:color w:val="0070C0"/>
         </w:rPr>
-        <w:t xml:space="preserve">. No interest is paid </w:t>
-      </w:r>
-      <w:proofErr w:type="gramStart"/>
-      <w:r>
-        <w:rPr>
-          <w:color w:val="0070C0"/>
-        </w:rPr>
-        <w:t>on</w:t>
-      </w:r>
-      <w:proofErr w:type="gramEnd"/>
-      <w:r>
-        <w:rPr>
-          <w:color w:val="0070C0"/>
-        </w:rPr>
-        <w:t xml:space="preserve"> </w:t>
+        <w:t xml:space="preserve">. No interest is paid on </w:t>
       </w:r>
       <w:r>
         <w:rPr>
@@ -9905,6 +8802,7 @@
         <w:rPr>
           <w:color w:val="0070C0"/>
         </w:rPr>
+        <w:lastRenderedPageBreak/>
         <w:t>A Member may demand a return of their Capital Contribution only at dissolution or as otherwise allowed by law—and only in cash.</w:t>
       </w:r>
     </w:p>
@@ -9964,25 +8862,7 @@
           <w:sz w:val="24"/>
           <w:szCs w:val="24"/>
         </w:rPr>
-        <w:t xml:space="preserve">Members can only contribute additional capital if the IRS provides written confirmation that it won’t violate prohibited transaction rules. Any approved </w:t>
-      </w:r>
-      <w:proofErr w:type="gramStart"/>
-      <w:r>
-        <w:rPr>
-          <w:color w:val="0070C0"/>
-          <w:sz w:val="24"/>
-          <w:szCs w:val="24"/>
-        </w:rPr>
-        <w:t>contributions</w:t>
-      </w:r>
-      <w:proofErr w:type="gramEnd"/>
-      <w:r>
-        <w:rPr>
-          <w:color w:val="0070C0"/>
-          <w:sz w:val="24"/>
-          <w:szCs w:val="24"/>
-        </w:rPr>
-        <w:t xml:space="preserve"> must be proportional to ownership percentages. Members also cannot loan money or provide services to the Company, as that would violate IRS rules (26 U.S.C. §4975</w:t>
+        <w:t>Members can only contribute additional capital if the IRS provides written confirmation that it won’t violate prohibited transaction rules. Any approved contributions must be proportional to ownership percentages. Members also cannot loan money or provide services to the Company, as that would violate IRS rules (26 U.S.C. §4975</w:t>
       </w:r>
     </w:p>
     <w:p>
@@ -10128,7 +9008,6 @@
           <w:bCs w:val="0"/>
           <w:u w:val="single"/>
         </w:rPr>
-        <w:lastRenderedPageBreak/>
         <w:t>Fiscal Year.</w:t>
       </w:r>
       <w:r>
@@ -10402,42 +9281,20 @@
         <w:rPr>
           <w:sz w:val="22"/>
         </w:rPr>
-        <w:t xml:space="preserve">retirement, resignation, expulsion, bankruptcy or dissolution of a </w:t>
-      </w:r>
-      <w:proofErr w:type="gramStart"/>
+        <w:t>retirement, resignation, expulsion, bankruptcy or dissolution of a Member or the occurrence of any other event which terminates the continued membership of a</w:t>
+      </w:r>
       <w:r>
         <w:rPr>
           <w:sz w:val="22"/>
         </w:rPr>
-        <w:t>Member</w:t>
-      </w:r>
-      <w:proofErr w:type="gramEnd"/>
+        <w:t xml:space="preserve"> </w:t>
+      </w:r>
       <w:r>
         <w:rPr>
           <w:sz w:val="22"/>
         </w:rPr>
-        <w:t xml:space="preserve"> or the occurrence of any other event which terminates the continued membership of a</w:t>
-      </w:r>
-      <w:r>
-        <w:rPr>
-          <w:sz w:val="22"/>
-        </w:rPr>
-        <w:t xml:space="preserve"> </w:t>
-      </w:r>
-      <w:r>
-        <w:rPr>
-          <w:sz w:val="22"/>
-        </w:rPr>
-        <w:t xml:space="preserve">Member in the </w:t>
-      </w:r>
-      <w:proofErr w:type="gramStart"/>
-      <w:r>
-        <w:rPr>
-          <w:sz w:val="22"/>
-        </w:rPr>
-        <w:t>Company;</w:t>
-      </w:r>
-      <w:proofErr w:type="gramEnd"/>
+        <w:t>Member in the Company;</w:t>
+      </w:r>
       <w:r>
         <w:rPr>
           <w:sz w:val="22"/>
@@ -10463,16 +9320,8 @@
         <w:rPr>
           <w:sz w:val="22"/>
         </w:rPr>
-        <w:t xml:space="preserve">the adjudicated incapacity of an individual </w:t>
-      </w:r>
-      <w:proofErr w:type="gramStart"/>
-      <w:r>
-        <w:rPr>
-          <w:sz w:val="22"/>
-        </w:rPr>
-        <w:t>Member;</w:t>
-      </w:r>
-      <w:proofErr w:type="gramEnd"/>
+        <w:t>the adjudicated incapacity of an individual Member;</w:t>
+      </w:r>
     </w:p>
     <w:p>
       <w:pPr>
@@ -10492,16 +9341,8 @@
         <w:rPr>
           <w:sz w:val="22"/>
         </w:rPr>
-        <w:t xml:space="preserve">the Company’s </w:t>
-      </w:r>
-      <w:proofErr w:type="gramStart"/>
-      <w:r>
-        <w:rPr>
-          <w:sz w:val="22"/>
-        </w:rPr>
-        <w:t>bankruptcy;</w:t>
-      </w:r>
-      <w:proofErr w:type="gramEnd"/>
+        <w:t>the Company’s bankruptcy;</w:t>
+      </w:r>
     </w:p>
     <w:p>
       <w:pPr>
@@ -10521,16 +9362,8 @@
         <w:rPr>
           <w:sz w:val="22"/>
         </w:rPr>
-        <w:t xml:space="preserve">the unanimous decision of the Members to dissolve the </w:t>
-      </w:r>
-      <w:proofErr w:type="gramStart"/>
-      <w:r>
-        <w:rPr>
-          <w:sz w:val="22"/>
-        </w:rPr>
-        <w:t>Company;</w:t>
-      </w:r>
-      <w:proofErr w:type="gramEnd"/>
+        <w:t>the unanimous decision of the Members to dissolve the Company;</w:t>
+      </w:r>
     </w:p>
     <w:p>
       <w:pPr>
@@ -10550,16 +9383,8 @@
         <w:rPr>
           <w:sz w:val="22"/>
         </w:rPr>
-        <w:t xml:space="preserve">the cessation to exist as a legal entity of the sole remaining </w:t>
-      </w:r>
-      <w:proofErr w:type="gramStart"/>
-      <w:r>
-        <w:rPr>
-          <w:sz w:val="22"/>
-        </w:rPr>
-        <w:t>Member;</w:t>
-      </w:r>
-      <w:proofErr w:type="gramEnd"/>
+        <w:t>the cessation to exist as a legal entity of the sole remaining Member;</w:t>
+      </w:r>
     </w:p>
     <w:p>
       <w:pPr>
@@ -10575,21 +9400,12 @@
           <w:sz w:val="22"/>
         </w:rPr>
       </w:pPr>
-      <w:proofErr w:type="gramStart"/>
       <w:r>
         <w:rPr>
           <w:color w:val="0070C0"/>
           <w:sz w:val="22"/>
         </w:rPr>
-        <w:t>it</w:t>
-      </w:r>
-      <w:proofErr w:type="gramEnd"/>
-      <w:r>
-        <w:rPr>
-          <w:color w:val="0070C0"/>
-          <w:sz w:val="22"/>
-        </w:rPr>
-        <w:t xml:space="preserve"> sells or otherwise disposes of all or nearly all its property—unless it receives a loan or lease as part of the deal. In that case, dissolution is delayed until the Company finishes collecting, distributing, or selling its interest in that loan or lease.</w:t>
+        <w:t>it sells or otherwise disposes of all or nearly all its property—unless it receives a loan or lease as part of the deal. In that case, dissolution is delayed until the Company finishes collecting, distributing, or selling its interest in that loan or lease.</w:t>
       </w:r>
     </w:p>
     <w:p>
@@ -10611,15 +9427,7 @@
           <w:color w:val="0070C0"/>
           <w:sz w:val="22"/>
         </w:rPr>
-        <w:t xml:space="preserve">The Company will dissolve if required by North Carolina law, through automatic </w:t>
-      </w:r>
-      <w:r>
-        <w:rPr>
-          <w:color w:val="0070C0"/>
-          <w:sz w:val="22"/>
-        </w:rPr>
-        <w:lastRenderedPageBreak/>
-        <w:t>legal action, or by a court order</w:t>
+        <w:t>The Company will dissolve if required by North Carolina law, through automatic legal action, or by a court order</w:t>
       </w:r>
       <w:r>
         <w:rPr>
@@ -10870,7 +9678,15 @@
           <w:color w:val="0070C0"/>
           <w:sz w:val="22"/>
         </w:rPr>
-        <w:t>Fifth, any remaining assets are distributed to Members based on their percentage of Membership Units."</w:t>
+        <w:t xml:space="preserve">Fifth, any remaining assets are distributed to Members based on their percentage </w:t>
+      </w:r>
+      <w:r>
+        <w:rPr>
+          <w:color w:val="0070C0"/>
+          <w:sz w:val="22"/>
+        </w:rPr>
+        <w:lastRenderedPageBreak/>
+        <w:t>of Membership Units."</w:t>
       </w:r>
     </w:p>
     <w:p>
@@ -11016,25 +9832,7 @@
           <w:bCs w:val="0"/>
           <w:color w:val="0070C0"/>
         </w:rPr>
-        <w:t xml:space="preserve">Members acknowledge that IRAs, ESAs, and HSAs are subject to tax on Unrelated Business Taxable Income (UBTI) and Unrelated Debt-Financed Income (UDFI) under IRC §§511–514. Because the Company is a pass-through entity, this income passes </w:t>
-      </w:r>
-      <w:proofErr w:type="gramStart"/>
-      <w:r>
-        <w:rPr>
-          <w:b/>
-          <w:bCs w:val="0"/>
-          <w:color w:val="0070C0"/>
-        </w:rPr>
-        <w:t>directly</w:t>
-      </w:r>
-      <w:proofErr w:type="gramEnd"/>
-      <w:r>
-        <w:rPr>
-          <w:b/>
-          <w:bCs w:val="0"/>
-          <w:color w:val="0070C0"/>
-        </w:rPr>
-        <w:t xml:space="preserve"> to the Members. The Manager must provide the necessary details for Members to file IRS Form 990-T and, where allowed under Section 7.4, make distributions to cover the resulting tax liabilities.</w:t>
+        <w:t>Members acknowledge that IRAs, ESAs, and HSAs are subject to tax on Unrelated Business Taxable Income (UBTI) and Unrelated Debt-Financed Income (UDFI) under IRC §§511–514. Because the Company is a pass-through entity, this income passes directly to the Members. The Manager must provide the necessary details for Members to file IRS Form 990-T and, where allowed under Section 7.4, make distributions to cover the resulting tax liabilities.</w:t>
       </w:r>
     </w:p>
     <w:p>
@@ -11059,7 +9857,6 @@
           <w:bCs w:val="0"/>
           <w:u w:val="single"/>
         </w:rPr>
-        <w:lastRenderedPageBreak/>
         <w:t>Annual Valuations</w:t>
       </w:r>
       <w:r>
@@ -11182,50 +9979,42 @@
         </w:rPr>
         <w:t xml:space="preserve">  </w:t>
       </w:r>
-      <w:proofErr w:type="gramStart"/>
       <w:r>
         <w:rPr>
           <w:b/>
           <w:bCs w:val="0"/>
           <w:color w:val="FF0000"/>
         </w:rPr>
-        <w:t>( I</w:t>
-      </w:r>
-      <w:proofErr w:type="gramEnd"/>
+        <w:t xml:space="preserve">( I would rather </w:t>
+      </w:r>
       <w:r>
         <w:rPr>
           <w:b/>
           <w:bCs w:val="0"/>
           <w:color w:val="FF0000"/>
         </w:rPr>
-        <w:t xml:space="preserve"> would rather </w:t>
-      </w:r>
+        <w:t xml:space="preserve">prohibit accounts that require </w:t>
+      </w:r>
+      <w:commentRangeStart w:id="9"/>
       <w:r>
         <w:rPr>
           <w:b/>
           <w:bCs w:val="0"/>
           <w:color w:val="FF0000"/>
         </w:rPr>
-        <w:t xml:space="preserve">prohibit accounts that require </w:t>
-      </w:r>
-      <w:commentRangeStart w:id="4"/>
-      <w:r>
-        <w:rPr>
+        <w:t>RMD</w:t>
+      </w:r>
+      <w:commentRangeEnd w:id="9"/>
+      <w:r>
+        <w:rPr>
+          <w:rStyle w:val="CommentReference"/>
           <w:b/>
           <w:bCs w:val="0"/>
           <w:color w:val="FF0000"/>
-        </w:rPr>
-        <w:t>RMD</w:t>
-      </w:r>
-      <w:commentRangeEnd w:id="4"/>
-      <w:r>
-        <w:rPr>
-          <w:rStyle w:val="CommentReference"/>
-          <w:rFonts w:eastAsiaTheme="minorEastAsia" w:cstheme="minorBidi"/>
-          <w:bCs w:val="0"/>
-          <w:color w:val="auto"/>
-        </w:rPr>
-        <w:commentReference w:id="4"/>
+          <w:sz w:val="22"/>
+          <w:szCs w:val="26"/>
+        </w:rPr>
+        <w:commentReference w:id="9"/>
       </w:r>
       <w:r>
         <w:rPr>
@@ -11311,6 +10100,7 @@
           <w:bCs w:val="0"/>
           <w:u w:val="single"/>
         </w:rPr>
+        <w:lastRenderedPageBreak/>
         <w:t>Company Seal.</w:t>
       </w:r>
       <w:r>
@@ -11322,7 +10112,7 @@
         </w:rPr>
         <w:t xml:space="preserve">The Company may adopt a </w:t>
       </w:r>
-      <w:ins w:id="5" w:author="Jeff Watson" w:date="2025-10-31T12:48:00Z" w16du:dateUtc="2025-10-31T16:48:00Z">
+      <w:ins w:id="10" w:author="Jeff Watson" w:date="2025-10-31T12:48:00Z" w16du:dateUtc="2025-10-31T16:48:00Z">
         <w:r>
           <w:rPr>
             <w:color w:val="0070C0"/>
@@ -11455,26 +10245,12 @@
         </w:rPr>
         <w:t xml:space="preserve">This Agreement is legally binding on the parties and </w:t>
       </w:r>
-      <w:ins w:id="6" w:author="Jeff Watson" w:date="2025-10-31T12:49:00Z" w16du:dateUtc="2025-10-31T16:49:00Z">
+      <w:ins w:id="11" w:author="Jeff Watson" w:date="2025-10-31T12:49:00Z" w16du:dateUtc="2025-10-31T16:49:00Z">
         <w:r>
           <w:rPr>
             <w:color w:val="0070C0"/>
           </w:rPr>
-          <w:t xml:space="preserve">the account </w:t>
-        </w:r>
-        <w:proofErr w:type="gramStart"/>
-        <w:r>
-          <w:rPr>
-            <w:color w:val="0070C0"/>
-          </w:rPr>
-          <w:t>holders;</w:t>
-        </w:r>
-        <w:proofErr w:type="gramEnd"/>
-        <w:r>
-          <w:rPr>
-            <w:color w:val="0070C0"/>
-          </w:rPr>
-          <w:t xml:space="preserve"> </w:t>
+          <w:t xml:space="preserve">the account holders; </w:t>
         </w:r>
       </w:ins>
       <w:r>
@@ -11568,14 +10344,7 @@
         <w:rPr>
           <w:color w:val="0070C0"/>
         </w:rPr>
-        <w:t xml:space="preserve">This Agreement represents the entire understanding among </w:t>
-      </w:r>
-      <w:r>
-        <w:rPr>
-          <w:color w:val="0070C0"/>
-        </w:rPr>
-        <w:lastRenderedPageBreak/>
-        <w:t>the Members. Any prior agreements—oral or written—are merged into or voided by this document.</w:t>
+        <w:t>This Agreement represents the entire understanding among the Members. Any prior agreements—oral or written—are merged into or voided by this document.</w:t>
       </w:r>
     </w:p>
     <w:p>
@@ -11633,21 +10402,7 @@
         <w:rPr>
           <w:color w:val="0070C0"/>
         </w:rPr>
-        <w:t xml:space="preserve">If a </w:t>
-      </w:r>
-      <w:proofErr w:type="gramStart"/>
-      <w:r>
-        <w:rPr>
-          <w:color w:val="0070C0"/>
-        </w:rPr>
-        <w:t>Member</w:t>
-      </w:r>
-      <w:proofErr w:type="gramEnd"/>
-      <w:r>
-        <w:rPr>
-          <w:color w:val="0070C0"/>
-        </w:rPr>
-        <w:t xml:space="preserve"> is an entity, the Company and other Members can rely on the person signing this Agreement on its behalf without verifying that person’s authority or how proceeds are handled.</w:t>
+        <w:t>If a Member is an entity, the Company and other Members can rely on the person signing this Agreement on its behalf without verifying that person’s authority or how proceeds are handled.</w:t>
       </w:r>
     </w:p>
     <w:p>
@@ -11674,7 +10429,6 @@
       </w:pPr>
       <w:r>
         <w:rPr>
-          <w:b/>
           <w:sz w:val="22"/>
         </w:rPr>
         <w:lastRenderedPageBreak/>
@@ -11702,103 +10456,43 @@
           <w:color w:val="auto"/>
           <w:sz w:val="18"/>
         </w:rPr>
-        <w:t xml:space="preserve">THE UNDERSIGNED, being </w:t>
-      </w:r>
-      <w:proofErr w:type="gramStart"/>
-      <w:r>
-        <w:rPr>
-          <w:b w:val="0"/>
-          <w:bCs w:val="0"/>
-          <w:color w:val="auto"/>
-          <w:sz w:val="18"/>
-        </w:rPr>
-        <w:t>all of</w:t>
-      </w:r>
-      <w:proofErr w:type="gramEnd"/>
-      <w:r>
-        <w:rPr>
-          <w:b w:val="0"/>
-          <w:bCs w:val="0"/>
-          <w:color w:val="auto"/>
-          <w:sz w:val="18"/>
-        </w:rPr>
-        <w:t xml:space="preserve"> the Members and Manager(s) of the Company, hereby evidence their adoption and ratification of this Amended and Restated Operating Agreement for and on </w:t>
-      </w:r>
-      <w:proofErr w:type="gramStart"/>
-      <w:r>
-        <w:rPr>
-          <w:b w:val="0"/>
-          <w:bCs w:val="0"/>
-          <w:color w:val="auto"/>
-          <w:sz w:val="18"/>
-        </w:rPr>
-        <w:t>the behalf</w:t>
-      </w:r>
-      <w:proofErr w:type="gramEnd"/>
-      <w:r>
-        <w:rPr>
-          <w:b w:val="0"/>
-          <w:bCs w:val="0"/>
-          <w:color w:val="auto"/>
-          <w:sz w:val="18"/>
-        </w:rPr>
-        <w:t xml:space="preserve"> of themselves and the Company, effective </w:t>
-      </w:r>
-      <w:proofErr w:type="gramStart"/>
-      <w:r>
-        <w:rPr>
-          <w:b w:val="0"/>
-          <w:bCs w:val="0"/>
-          <w:color w:val="auto"/>
-          <w:sz w:val="18"/>
-        </w:rPr>
-        <w:t>June __</w:t>
-      </w:r>
-      <w:proofErr w:type="gramEnd"/>
-      <w:r>
-        <w:rPr>
-          <w:b w:val="0"/>
-          <w:bCs w:val="0"/>
-          <w:color w:val="auto"/>
-          <w:sz w:val="18"/>
-        </w:rPr>
-        <w:t>__, 2025.</w:t>
+        <w:t>THE UNDERSIGNED, being all of the Members and Manager(s) of the Company, hereby evidence their adoption and ratification of this Amended and Restated Operating Agreement for and on the behalf of themselves and the Company, effective June ____, 2025.</w:t>
       </w:r>
     </w:p>
     <w:tbl>
       <w:tblPr>
-        <w:tblW w:type="auto" w:w="0"/>
+        <w:tblW w:w="0" w:type="auto"/>
         <w:jc w:val="center"/>
         <w:tblLayout w:type="fixed"/>
-        <w:tblLook w:firstColumn="1" w:firstRow="1" w:lastColumn="0" w:lastRow="0" w:noHBand="0" w:noVBand="1" w:val="04A0"/>
+        <w:tblLook w:val="04A0" w:firstRow="1" w:lastRow="0" w:firstColumn="1" w:lastColumn="0" w:noHBand="0" w:noVBand="1"/>
       </w:tblPr>
       <w:tblGrid>
-        <w:gridCol w:w="4680"/>
-        <w:gridCol w:w="4680"/>
+        <w:gridCol w:w="4608"/>
+        <w:gridCol w:w="4608"/>
       </w:tblGrid>
       <w:tr>
+        <w:trPr>
+          <w:jc w:val="center"/>
+        </w:trPr>
         <w:tc>
           <w:tcPr>
-            <w:tcW w:type="dxa" w:w="4608"/>
-            <w:vAlign w:val="top"/>
+            <w:tcW w:w="4608" w:type="dxa"/>
             <w:tcBorders>
               <w:top w:val="nil"/>
               <w:left w:val="nil"/>
               <w:bottom w:val="nil"/>
               <w:right w:val="nil"/>
-              <w:insideH w:val="nil"/>
-              <w:insideV w:val="nil"/>
             </w:tcBorders>
             <w:tcMar>
               <w:top w:w="40" w:type="dxa"/>
-              <w:start w:w="80" w:type="dxa"/>
+              <w:left w:w="80" w:type="dxa"/>
               <w:bottom w:w="40" w:type="dxa"/>
-              <w:end w:w="80" w:type="dxa"/>
+              <w:right w:w="80" w:type="dxa"/>
             </w:tcMar>
           </w:tcPr>
           <w:p>
             <w:pPr>
-              <w:spacing w:before="0" w:after="40" w:line="240" w:lineRule="auto"/>
+              <w:spacing w:after="40" w:line="240" w:lineRule="auto"/>
             </w:pPr>
             <w:r>
               <w:rPr>
@@ -11810,11 +10504,10 @@
           </w:p>
           <w:p>
             <w:pPr>
-              <w:spacing w:before="0" w:after="0" w:line="240" w:lineRule="auto"/>
+              <w:spacing w:after="0" w:line="240" w:lineRule="auto"/>
             </w:pPr>
             <w:r>
               <w:rPr>
-                <w:b w:val="0"/>
                 <w:sz w:val="18"/>
               </w:rPr>
               <w:t>By: ________________________________</w:t>
@@ -11822,11 +10515,10 @@
           </w:p>
           <w:p>
             <w:pPr>
-              <w:spacing w:before="0" w:after="60" w:line="240" w:lineRule="auto"/>
+              <w:spacing w:after="60" w:line="240" w:lineRule="auto"/>
             </w:pPr>
             <w:r>
               <w:rPr>
-                <w:b w:val="0"/>
                 <w:sz w:val="16"/>
               </w:rPr>
               <w:t>as an authorized signer</w:t>
@@ -11834,11 +10526,10 @@
           </w:p>
           <w:p>
             <w:pPr>
-              <w:spacing w:before="0" w:after="0" w:line="240" w:lineRule="auto"/>
+              <w:spacing w:after="0" w:line="240" w:lineRule="auto"/>
             </w:pPr>
             <w:r>
               <w:rPr>
-                <w:b w:val="0"/>
                 <w:sz w:val="16"/>
               </w:rPr>
               <w:t>Read and approved for investment by:</w:t>
@@ -11846,11 +10537,10 @@
           </w:p>
           <w:p>
             <w:pPr>
-              <w:spacing w:before="0" w:after="0" w:line="240" w:lineRule="auto"/>
+              <w:spacing w:after="0" w:line="240" w:lineRule="auto"/>
             </w:pPr>
             <w:r>
               <w:rPr>
-                <w:b w:val="0"/>
                 <w:sz w:val="18"/>
               </w:rPr>
               <w:t>____________________________________</w:t>
@@ -11858,11 +10548,10 @@
           </w:p>
           <w:p>
             <w:pPr>
-              <w:spacing w:before="0" w:after="120" w:line="240" w:lineRule="auto"/>
+              <w:spacing w:after="120" w:line="240" w:lineRule="auto"/>
             </w:pPr>
             <w:r>
               <w:rPr>
-                <w:b w:val="0"/>
                 <w:sz w:val="16"/>
               </w:rPr>
               <w:t>Wesley Dale Browning, Accountholder</w:t>
@@ -11871,26 +10560,23 @@
         </w:tc>
         <w:tc>
           <w:tcPr>
-            <w:tcW w:type="dxa" w:w="4608"/>
-            <w:vAlign w:val="top"/>
+            <w:tcW w:w="4608" w:type="dxa"/>
             <w:tcBorders>
               <w:top w:val="nil"/>
               <w:left w:val="nil"/>
               <w:bottom w:val="nil"/>
               <w:right w:val="nil"/>
-              <w:insideH w:val="nil"/>
-              <w:insideV w:val="nil"/>
             </w:tcBorders>
             <w:tcMar>
               <w:top w:w="40" w:type="dxa"/>
-              <w:start w:w="80" w:type="dxa"/>
+              <w:left w:w="80" w:type="dxa"/>
               <w:bottom w:w="40" w:type="dxa"/>
-              <w:end w:w="80" w:type="dxa"/>
+              <w:right w:w="80" w:type="dxa"/>
             </w:tcMar>
           </w:tcPr>
           <w:p>
             <w:pPr>
-              <w:spacing w:before="0" w:after="40" w:line="240" w:lineRule="auto"/>
+              <w:spacing w:after="40" w:line="240" w:lineRule="auto"/>
             </w:pPr>
             <w:r>
               <w:rPr>
@@ -11902,11 +10588,10 @@
           </w:p>
           <w:p>
             <w:pPr>
-              <w:spacing w:before="0" w:after="0" w:line="240" w:lineRule="auto"/>
+              <w:spacing w:after="0" w:line="240" w:lineRule="auto"/>
             </w:pPr>
             <w:r>
               <w:rPr>
-                <w:b w:val="0"/>
                 <w:sz w:val="18"/>
               </w:rPr>
               <w:t>By: ________________________________</w:t>
@@ -11914,11 +10599,10 @@
           </w:p>
           <w:p>
             <w:pPr>
-              <w:spacing w:before="0" w:after="60" w:line="240" w:lineRule="auto"/>
+              <w:spacing w:after="60" w:line="240" w:lineRule="auto"/>
             </w:pPr>
             <w:r>
               <w:rPr>
-                <w:b w:val="0"/>
                 <w:sz w:val="16"/>
               </w:rPr>
               <w:t>as an authorized signer</w:t>
@@ -11926,11 +10610,10 @@
           </w:p>
           <w:p>
             <w:pPr>
-              <w:spacing w:before="0" w:after="0" w:line="240" w:lineRule="auto"/>
+              <w:spacing w:after="0" w:line="240" w:lineRule="auto"/>
             </w:pPr>
             <w:r>
               <w:rPr>
-                <w:b w:val="0"/>
                 <w:sz w:val="16"/>
               </w:rPr>
               <w:t>Read and approved for investment by:</w:t>
@@ -11938,11 +10621,10 @@
           </w:p>
           <w:p>
             <w:pPr>
-              <w:spacing w:before="0" w:after="0" w:line="240" w:lineRule="auto"/>
+              <w:spacing w:after="0" w:line="240" w:lineRule="auto"/>
             </w:pPr>
             <w:r>
               <w:rPr>
-                <w:b w:val="0"/>
                 <w:sz w:val="18"/>
               </w:rPr>
               <w:t>____________________________________</w:t>
@@ -11950,11 +10632,10 @@
           </w:p>
           <w:p>
             <w:pPr>
-              <w:spacing w:before="0" w:after="120" w:line="240" w:lineRule="auto"/>
+              <w:spacing w:after="120" w:line="240" w:lineRule="auto"/>
             </w:pPr>
             <w:r>
               <w:rPr>
-                <w:b w:val="0"/>
                 <w:sz w:val="16"/>
               </w:rPr>
               <w:t>Wesley Dale Browning, Accountholder</w:t>
@@ -11963,28 +10644,28 @@
         </w:tc>
       </w:tr>
       <w:tr>
+        <w:trPr>
+          <w:jc w:val="center"/>
+        </w:trPr>
         <w:tc>
           <w:tcPr>
-            <w:tcW w:type="dxa" w:w="4608"/>
-            <w:vAlign w:val="top"/>
+            <w:tcW w:w="4608" w:type="dxa"/>
             <w:tcBorders>
               <w:top w:val="nil"/>
               <w:left w:val="nil"/>
               <w:bottom w:val="nil"/>
               <w:right w:val="nil"/>
-              <w:insideH w:val="nil"/>
-              <w:insideV w:val="nil"/>
             </w:tcBorders>
             <w:tcMar>
               <w:top w:w="40" w:type="dxa"/>
-              <w:start w:w="80" w:type="dxa"/>
+              <w:left w:w="80" w:type="dxa"/>
               <w:bottom w:w="40" w:type="dxa"/>
-              <w:end w:w="80" w:type="dxa"/>
+              <w:right w:w="80" w:type="dxa"/>
             </w:tcMar>
           </w:tcPr>
           <w:p>
             <w:pPr>
-              <w:spacing w:before="0" w:after="40" w:line="240" w:lineRule="auto"/>
+              <w:spacing w:after="40" w:line="240" w:lineRule="auto"/>
             </w:pPr>
             <w:r>
               <w:rPr>
@@ -11996,11 +10677,10 @@
           </w:p>
           <w:p>
             <w:pPr>
-              <w:spacing w:before="0" w:after="0" w:line="240" w:lineRule="auto"/>
+              <w:spacing w:after="0" w:line="240" w:lineRule="auto"/>
             </w:pPr>
             <w:r>
               <w:rPr>
-                <w:b w:val="0"/>
                 <w:sz w:val="18"/>
               </w:rPr>
               <w:t>By: ________________________________</w:t>
@@ -12008,11 +10688,10 @@
           </w:p>
           <w:p>
             <w:pPr>
-              <w:spacing w:before="0" w:after="60" w:line="240" w:lineRule="auto"/>
+              <w:spacing w:after="60" w:line="240" w:lineRule="auto"/>
             </w:pPr>
             <w:r>
               <w:rPr>
-                <w:b w:val="0"/>
                 <w:sz w:val="16"/>
               </w:rPr>
               <w:t>as an authorized signer</w:t>
@@ -12020,11 +10699,10 @@
           </w:p>
           <w:p>
             <w:pPr>
-              <w:spacing w:before="0" w:after="0" w:line="240" w:lineRule="auto"/>
+              <w:spacing w:after="0" w:line="240" w:lineRule="auto"/>
             </w:pPr>
             <w:r>
               <w:rPr>
-                <w:b w:val="0"/>
                 <w:sz w:val="16"/>
               </w:rPr>
               <w:t>Read and approved for investment by:</w:t>
@@ -12032,11 +10710,10 @@
           </w:p>
           <w:p>
             <w:pPr>
-              <w:spacing w:before="0" w:after="0" w:line="240" w:lineRule="auto"/>
+              <w:spacing w:after="0" w:line="240" w:lineRule="auto"/>
             </w:pPr>
             <w:r>
               <w:rPr>
-                <w:b w:val="0"/>
                 <w:sz w:val="18"/>
               </w:rPr>
               <w:t>____________________________________</w:t>
@@ -12044,11 +10721,10 @@
           </w:p>
           <w:p>
             <w:pPr>
-              <w:spacing w:before="0" w:after="120" w:line="240" w:lineRule="auto"/>
+              <w:spacing w:after="120" w:line="240" w:lineRule="auto"/>
             </w:pPr>
             <w:r>
               <w:rPr>
-                <w:b w:val="0"/>
                 <w:sz w:val="16"/>
               </w:rPr>
               <w:t>Jeanette W. Hollinger</w:t>
@@ -12057,26 +10733,23 @@
         </w:tc>
         <w:tc>
           <w:tcPr>
-            <w:tcW w:type="dxa" w:w="4608"/>
-            <w:vAlign w:val="top"/>
+            <w:tcW w:w="4608" w:type="dxa"/>
             <w:tcBorders>
               <w:top w:val="nil"/>
               <w:left w:val="nil"/>
               <w:bottom w:val="nil"/>
               <w:right w:val="nil"/>
-              <w:insideH w:val="nil"/>
-              <w:insideV w:val="nil"/>
             </w:tcBorders>
             <w:tcMar>
               <w:top w:w="40" w:type="dxa"/>
-              <w:start w:w="80" w:type="dxa"/>
+              <w:left w:w="80" w:type="dxa"/>
               <w:bottom w:w="40" w:type="dxa"/>
-              <w:end w:w="80" w:type="dxa"/>
+              <w:right w:w="80" w:type="dxa"/>
             </w:tcMar>
           </w:tcPr>
           <w:p>
             <w:pPr>
-              <w:spacing w:before="0" w:after="40" w:line="240" w:lineRule="auto"/>
+              <w:spacing w:after="40" w:line="240" w:lineRule="auto"/>
             </w:pPr>
             <w:r>
               <w:rPr>
@@ -12089,11 +10762,10 @@
           </w:p>
           <w:p>
             <w:pPr>
-              <w:spacing w:before="0" w:after="0" w:line="240" w:lineRule="auto"/>
+              <w:spacing w:after="0" w:line="240" w:lineRule="auto"/>
             </w:pPr>
             <w:r>
               <w:rPr>
-                <w:b w:val="0"/>
                 <w:color w:val="008000"/>
                 <w:sz w:val="18"/>
               </w:rPr>
@@ -12102,26 +10774,17 @@
           </w:p>
           <w:p>
             <w:pPr>
-              <w:spacing w:before="0" w:after="120" w:line="240" w:lineRule="auto"/>
+              <w:spacing w:after="120" w:line="240" w:lineRule="auto"/>
             </w:pPr>
             <w:r>
               <w:rPr>
-                <w:b w:val="0"/>
                 <w:color w:val="008000"/>
                 <w:sz w:val="16"/>
               </w:rPr>
               <w:t>Joshua Kennedy, Manager</w:t>
             </w:r>
           </w:p>
-          <w:p>
-            <w:r>
-              <w:rPr>
-                <w:b w:val="0"/>
-                <w:color w:val="008000"/>
-                <w:sz w:val="18"/>
-              </w:rPr>
-            </w:r>
-          </w:p>
+          <w:p/>
           <w:p>
             <w:r>
               <w:rPr>
@@ -12135,7 +10798,6 @@
           <w:p>
             <w:r>
               <w:rPr>
-                <w:b w:val="0"/>
                 <w:color w:val="008000"/>
                 <w:sz w:val="18"/>
               </w:rPr>
@@ -12145,7 +10807,6 @@
           <w:p>
             <w:r>
               <w:rPr>
-                <w:b w:val="0"/>
                 <w:color w:val="008000"/>
                 <w:sz w:val="16"/>
               </w:rPr>
@@ -12155,7 +10816,6 @@
           <w:p>
             <w:r>
               <w:rPr>
-                <w:b w:val="0"/>
                 <w:color w:val="008000"/>
                 <w:sz w:val="16"/>
               </w:rPr>
@@ -12961,8 +11621,8 @@
       <w:r>
         <w:rPr>
           <w:b/>
-          <w:sz w:val="24"/>
-        </w:rPr>
+        </w:rPr>
+        <w:lastRenderedPageBreak/>
         <w:t>Drafting Legend</w:t>
       </w:r>
     </w:p>
@@ -12978,7 +11638,6 @@
     <w:p>
       <w:r>
         <w:rPr>
-          <w:strike w:val="0"/>
           <w:color w:val="000000"/>
           <w:sz w:val="20"/>
         </w:rPr>
@@ -12988,7 +11647,6 @@
     <w:p>
       <w:r>
         <w:rPr>
-          <w:strike w:val="0"/>
           <w:color w:val="0000FF"/>
           <w:sz w:val="20"/>
         </w:rPr>
@@ -12998,7 +11656,6 @@
     <w:p>
       <w:r>
         <w:rPr>
-          <w:strike w:val="0"/>
           <w:color w:val="FF0000"/>
           <w:sz w:val="20"/>
         </w:rPr>
@@ -13008,7 +11665,6 @@
     <w:p>
       <w:r>
         <w:rPr>
-          <w:strike w:val="0"/>
           <w:color w:val="008000"/>
           <w:sz w:val="20"/>
         </w:rPr>
@@ -13026,8 +11682,8 @@
       </w:r>
     </w:p>
     <w:sectPr>
-      <w:headerReference w:type="default" r:id="rId24"/>
-      <w:footerReference w:type="default" r:id="rId25"/>
+      <w:headerReference w:type="default" r:id="rId21"/>
+      <w:footerReference w:type="default" r:id="rId22"/>
       <w:pgSz w:w="12240" w:h="15840"/>
       <w:pgMar w:top="1440" w:right="1440" w:bottom="1440" w:left="1440" w:header="720" w:footer="720" w:gutter="0"/>
       <w:cols w:space="720"/>
@@ -13039,7 +11695,7 @@
 
 <file path=word/comments.xml><?xml version="1.0" encoding="utf-8"?>
 <w:comments xmlns:wpc="http://schemas.microsoft.com/office/word/2010/wordprocessingCanvas" xmlns:cx="http://schemas.microsoft.com/office/drawing/2014/chartex" xmlns:cx1="http://schemas.microsoft.com/office/drawing/2015/9/8/chartex" xmlns:cx2="http://schemas.microsoft.com/office/drawing/2015/10/21/chartex" xmlns:cx3="http://schemas.microsoft.com/office/drawing/2016/5/9/chartex" xmlns:cx4="http://schemas.microsoft.com/office/drawing/2016/5/10/chartex" xmlns:cx5="http://schemas.microsoft.com/office/drawing/2016/5/11/chartex" xmlns:cx6="http://schemas.microsoft.com/office/drawing/2016/5/12/chartex" xmlns:cx7="http://schemas.microsoft.com/office/drawing/2016/5/13/chartex" xmlns:cx8="http://schemas.microsoft.com/office/drawing/2016/5/14/chartex" xmlns:mc="http://schemas.openxmlformats.org/markup-compatibility/2006" xmlns:aink="http://schemas.microsoft.com/office/drawing/2016/ink" xmlns:am3d="http://schemas.microsoft.com/office/drawing/2017/model3d" xmlns:o="urn:schemas-microsoft-com:office:office" xmlns:oel="http://schemas.microsoft.com/office/2019/extlst" xmlns:r="http://schemas.openxmlformats.org/officeDocument/2006/relationships" xmlns:m="http://schemas.openxmlformats.org/officeDocument/2006/math" xmlns:v="urn:schemas-microsoft-com:vml" xmlns:wp14="http://schemas.microsoft.com/office/word/2010/wordprocessingDrawing" xmlns:wp="http://schemas.openxmlformats.org/drawingml/2006/wordprocessingDrawing" xmlns:w10="urn:schemas-microsoft-com:office:word" xmlns:w="http://schemas.openxmlformats.org/wordprocessingml/2006/main" xmlns:w14="http://schemas.microsoft.com/office/word/2010/wordml" xmlns:w15="http://schemas.microsoft.com/office/word/2012/wordml" xmlns:w16cex="http://schemas.microsoft.com/office/word/2018/wordml/cex" xmlns:w16cid="http://schemas.microsoft.com/office/word/2016/wordml/cid" xmlns:w16="http://schemas.microsoft.com/office/word/2018/wordml" xmlns:w16du="http://schemas.microsoft.com/office/word/2023/wordml/word16du" xmlns:w16sdtdh="http://schemas.microsoft.com/office/word/2020/wordml/sdtdatahash" xmlns:w16sdtfl="http://schemas.microsoft.com/office/word/2024/wordml/sdtformatlock" xmlns:w16se="http://schemas.microsoft.com/office/word/2015/wordml/symex" xmlns:wpg="http://schemas.microsoft.com/office/word/2010/wordprocessingGroup" xmlns:wpi="http://schemas.microsoft.com/office/word/2010/wordprocessingInk" xmlns:wne="http://schemas.microsoft.com/office/word/2006/wordml" xmlns:wps="http://schemas.microsoft.com/office/word/2010/wordprocessingShape" mc:Ignorable="w14 w15 w16se w16cid w16 w16cex w16sdtdh w16sdtfl w16du wp14">
-  <w:comment w:id="4" w:author="Jeff Watson" w:date="2025-10-31T12:48:00Z" w:initials="JW">
+  <w:comment w:id="9" w:author="Jeff Watson" w:date="2025-10-31T12:48:00Z" w:initials="JW">
     <w:p>
       <w:pPr>
         <w:pStyle w:val="CommentText"/>
@@ -13182,7 +11838,7 @@
 </file>
 
 <file path=word/footer4.xml><?xml version="1.0" encoding="utf-8"?>
-<w:ftr xmlns:m="http://schemas.openxmlformats.org/officeDocument/2006/math" xmlns:mc="http://schemas.openxmlformats.org/markup-compatibility/2006" xmlns:mo="http://schemas.microsoft.com/office/mac/office/2008/main" xmlns:mv="urn:schemas-microsoft-com:mac:vml" xmlns:o="urn:schemas-microsoft-com:office:office" xmlns:r="http://schemas.openxmlformats.org/officeDocument/2006/relationships" xmlns:v="urn:schemas-microsoft-com:vml" xmlns:w10="urn:schemas-microsoft-com:office:word" xmlns:w14="http://schemas.microsoft.com/office/word/2010/wordml" xmlns:w="http://schemas.openxmlformats.org/wordprocessingml/2006/main" xmlns:wne="http://schemas.microsoft.com/office/word/2006/wordml" xmlns:wp14="http://schemas.microsoft.com/office/word/2010/wordprocessingDrawing" xmlns:wp="http://schemas.openxmlformats.org/drawingml/2006/wordprocessingDrawing" xmlns:wpc="http://schemas.microsoft.com/office/word/2010/wordprocessingCanvas" xmlns:wpg="http://schemas.microsoft.com/office/word/2010/wordprocessingGroup" xmlns:wpi="http://schemas.microsoft.com/office/word/2010/wordprocessingInk" xmlns:wps="http://schemas.microsoft.com/office/word/2010/wordprocessingShape" mc:Ignorable="w14 wp14">
+<w:ftr xmlns:wpc="http://schemas.microsoft.com/office/word/2010/wordprocessingCanvas" xmlns:cx="http://schemas.microsoft.com/office/drawing/2014/chartex" xmlns:cx1="http://schemas.microsoft.com/office/drawing/2015/9/8/chartex" xmlns:cx2="http://schemas.microsoft.com/office/drawing/2015/10/21/chartex" xmlns:cx3="http://schemas.microsoft.com/office/drawing/2016/5/9/chartex" xmlns:cx4="http://schemas.microsoft.com/office/drawing/2016/5/10/chartex" xmlns:cx5="http://schemas.microsoft.com/office/drawing/2016/5/11/chartex" xmlns:cx6="http://schemas.microsoft.com/office/drawing/2016/5/12/chartex" xmlns:cx7="http://schemas.microsoft.com/office/drawing/2016/5/13/chartex" xmlns:cx8="http://schemas.microsoft.com/office/drawing/2016/5/14/chartex" xmlns:mc="http://schemas.openxmlformats.org/markup-compatibility/2006" xmlns:aink="http://schemas.microsoft.com/office/drawing/2016/ink" xmlns:am3d="http://schemas.microsoft.com/office/drawing/2017/model3d" xmlns:o="urn:schemas-microsoft-com:office:office" xmlns:oel="http://schemas.microsoft.com/office/2019/extlst" xmlns:r="http://schemas.openxmlformats.org/officeDocument/2006/relationships" xmlns:m="http://schemas.openxmlformats.org/officeDocument/2006/math" xmlns:v="urn:schemas-microsoft-com:vml" xmlns:wp14="http://schemas.microsoft.com/office/word/2010/wordprocessingDrawing" xmlns:wp="http://schemas.openxmlformats.org/drawingml/2006/wordprocessingDrawing" xmlns:w10="urn:schemas-microsoft-com:office:word" xmlns:w="http://schemas.openxmlformats.org/wordprocessingml/2006/main" xmlns:w14="http://schemas.microsoft.com/office/word/2010/wordml" xmlns:w15="http://schemas.microsoft.com/office/word/2012/wordml" xmlns:w16cex="http://schemas.microsoft.com/office/word/2018/wordml/cex" xmlns:w16cid="http://schemas.microsoft.com/office/word/2016/wordml/cid" xmlns:w16="http://schemas.microsoft.com/office/word/2018/wordml" xmlns:w16du="http://schemas.microsoft.com/office/word/2023/wordml/word16du" xmlns:w16sdtdh="http://schemas.microsoft.com/office/word/2020/wordml/sdtdatahash" xmlns:w16sdtfl="http://schemas.microsoft.com/office/word/2024/wordml/sdtformatlock" xmlns:w16se="http://schemas.microsoft.com/office/word/2015/wordml/symex" xmlns:wpg="http://schemas.microsoft.com/office/word/2010/wordprocessingGroup" xmlns:wpi="http://schemas.microsoft.com/office/word/2010/wordprocessingInk" xmlns:wne="http://schemas.microsoft.com/office/word/2006/wordml" xmlns:wps="http://schemas.microsoft.com/office/word/2010/wordprocessingShape" mc:Ignorable="w14 w15 w16se w16cid w16 w16cex w16sdtdh w16sdtfl w16du wp14">
   <w:p>
     <w:pPr>
       <w:pStyle w:val="Footer"/>
@@ -13254,7 +11910,7 @@
 </file>
 
 <file path=word/header4.xml><?xml version="1.0" encoding="utf-8"?>
-<w:hdr xmlns:m="http://schemas.openxmlformats.org/officeDocument/2006/math" xmlns:mc="http://schemas.openxmlformats.org/markup-compatibility/2006" xmlns:mo="http://schemas.microsoft.com/office/mac/office/2008/main" xmlns:mv="urn:schemas-microsoft-com:mac:vml" xmlns:o="urn:schemas-microsoft-com:office:office" xmlns:r="http://schemas.openxmlformats.org/officeDocument/2006/relationships" xmlns:v="urn:schemas-microsoft-com:vml" xmlns:w10="urn:schemas-microsoft-com:office:word" xmlns:w14="http://schemas.microsoft.com/office/word/2010/wordml" xmlns:w="http://schemas.openxmlformats.org/wordprocessingml/2006/main" xmlns:wne="http://schemas.microsoft.com/office/word/2006/wordml" xmlns:wp14="http://schemas.microsoft.com/office/word/2010/wordprocessingDrawing" xmlns:wp="http://schemas.openxmlformats.org/drawingml/2006/wordprocessingDrawing" xmlns:wpc="http://schemas.microsoft.com/office/word/2010/wordprocessingCanvas" xmlns:wpg="http://schemas.microsoft.com/office/word/2010/wordprocessingGroup" xmlns:wpi="http://schemas.microsoft.com/office/word/2010/wordprocessingInk" xmlns:wps="http://schemas.microsoft.com/office/word/2010/wordprocessingShape" mc:Ignorable="w14 wp14">
+<w:hdr xmlns:wpc="http://schemas.microsoft.com/office/word/2010/wordprocessingCanvas" xmlns:cx="http://schemas.microsoft.com/office/drawing/2014/chartex" xmlns:cx1="http://schemas.microsoft.com/office/drawing/2015/9/8/chartex" xmlns:cx2="http://schemas.microsoft.com/office/drawing/2015/10/21/chartex" xmlns:cx3="http://schemas.microsoft.com/office/drawing/2016/5/9/chartex" xmlns:cx4="http://schemas.microsoft.com/office/drawing/2016/5/10/chartex" xmlns:cx5="http://schemas.microsoft.com/office/drawing/2016/5/11/chartex" xmlns:cx6="http://schemas.microsoft.com/office/drawing/2016/5/12/chartex" xmlns:cx7="http://schemas.microsoft.com/office/drawing/2016/5/13/chartex" xmlns:cx8="http://schemas.microsoft.com/office/drawing/2016/5/14/chartex" xmlns:mc="http://schemas.openxmlformats.org/markup-compatibility/2006" xmlns:aink="http://schemas.microsoft.com/office/drawing/2016/ink" xmlns:am3d="http://schemas.microsoft.com/office/drawing/2017/model3d" xmlns:o="urn:schemas-microsoft-com:office:office" xmlns:oel="http://schemas.microsoft.com/office/2019/extlst" xmlns:r="http://schemas.openxmlformats.org/officeDocument/2006/relationships" xmlns:m="http://schemas.openxmlformats.org/officeDocument/2006/math" xmlns:v="urn:schemas-microsoft-com:vml" xmlns:wp14="http://schemas.microsoft.com/office/word/2010/wordprocessingDrawing" xmlns:wp="http://schemas.openxmlformats.org/drawingml/2006/wordprocessingDrawing" xmlns:w10="urn:schemas-microsoft-com:office:word" xmlns:w="http://schemas.openxmlformats.org/wordprocessingml/2006/main" xmlns:w14="http://schemas.microsoft.com/office/word/2010/wordml" xmlns:w15="http://schemas.microsoft.com/office/word/2012/wordml" xmlns:w16cex="http://schemas.microsoft.com/office/word/2018/wordml/cex" xmlns:w16cid="http://schemas.microsoft.com/office/word/2016/wordml/cid" xmlns:w16="http://schemas.microsoft.com/office/word/2018/wordml" xmlns:w16du="http://schemas.microsoft.com/office/word/2023/wordml/word16du" xmlns:w16sdtdh="http://schemas.microsoft.com/office/word/2020/wordml/sdtdatahash" xmlns:w16sdtfl="http://schemas.microsoft.com/office/word/2024/wordml/sdtformatlock" xmlns:w16se="http://schemas.microsoft.com/office/word/2015/wordml/symex" xmlns:wpg="http://schemas.microsoft.com/office/word/2010/wordprocessingGroup" xmlns:wpi="http://schemas.microsoft.com/office/word/2010/wordprocessingInk" xmlns:wne="http://schemas.microsoft.com/office/word/2006/wordml" xmlns:wps="http://schemas.microsoft.com/office/word/2010/wordprocessingShape" mc:Ignorable="w14 w15 w16se w16cid w16 w16cex w16sdtdh w16sdtfl w16du wp14">
   <w:p>
     <w:pPr>
       <w:pStyle w:val="Header"/>
@@ -15412,6 +14068,9 @@
 
 <file path=word/people.xml><?xml version="1.0" encoding="utf-8"?>
 <w15:people xmlns:wpc="http://schemas.microsoft.com/office/word/2010/wordprocessingCanvas" xmlns:cx="http://schemas.microsoft.com/office/drawing/2014/chartex" xmlns:cx1="http://schemas.microsoft.com/office/drawing/2015/9/8/chartex" xmlns:cx2="http://schemas.microsoft.com/office/drawing/2015/10/21/chartex" xmlns:cx3="http://schemas.microsoft.com/office/drawing/2016/5/9/chartex" xmlns:cx4="http://schemas.microsoft.com/office/drawing/2016/5/10/chartex" xmlns:cx5="http://schemas.microsoft.com/office/drawing/2016/5/11/chartex" xmlns:cx6="http://schemas.microsoft.com/office/drawing/2016/5/12/chartex" xmlns:cx7="http://schemas.microsoft.com/office/drawing/2016/5/13/chartex" xmlns:cx8="http://schemas.microsoft.com/office/drawing/2016/5/14/chartex" xmlns:mc="http://schemas.openxmlformats.org/markup-compatibility/2006" xmlns:aink="http://schemas.microsoft.com/office/drawing/2016/ink" xmlns:am3d="http://schemas.microsoft.com/office/drawing/2017/model3d" xmlns:o="urn:schemas-microsoft-com:office:office" xmlns:oel="http://schemas.microsoft.com/office/2019/extlst" xmlns:r="http://schemas.openxmlformats.org/officeDocument/2006/relationships" xmlns:m="http://schemas.openxmlformats.org/officeDocument/2006/math" xmlns:v="urn:schemas-microsoft-com:vml" xmlns:wp14="http://schemas.microsoft.com/office/word/2010/wordprocessingDrawing" xmlns:wp="http://schemas.openxmlformats.org/drawingml/2006/wordprocessingDrawing" xmlns:w10="urn:schemas-microsoft-com:office:word" xmlns:w="http://schemas.openxmlformats.org/wordprocessingml/2006/main" xmlns:w14="http://schemas.microsoft.com/office/word/2010/wordml" xmlns:w15="http://schemas.microsoft.com/office/word/2012/wordml" xmlns:w16cex="http://schemas.microsoft.com/office/word/2018/wordml/cex" xmlns:w16cid="http://schemas.microsoft.com/office/word/2016/wordml/cid" xmlns:w16="http://schemas.microsoft.com/office/word/2018/wordml" xmlns:w16du="http://schemas.microsoft.com/office/word/2023/wordml/word16du" xmlns:w16sdtdh="http://schemas.microsoft.com/office/word/2020/wordml/sdtdatahash" xmlns:w16sdtfl="http://schemas.microsoft.com/office/word/2024/wordml/sdtformatlock" xmlns:w16se="http://schemas.microsoft.com/office/word/2015/wordml/symex" xmlns:wpg="http://schemas.microsoft.com/office/word/2010/wordprocessingGroup" xmlns:wpi="http://schemas.microsoft.com/office/word/2010/wordprocessingInk" xmlns:wne="http://schemas.microsoft.com/office/word/2006/wordml" xmlns:wps="http://schemas.microsoft.com/office/word/2010/wordprocessingShape" mc:Ignorable="w14 w15 w16se w16cid w16 w16cex w16sdtdh w16sdtfl w16du wp14">
+  <w15:person w15:author="Wes Will Buy Your Home">
+    <w15:presenceInfo w15:providerId="AD" w15:userId="S::WesWill@BuyYourHomeLLC.com::f11e14ef-79d4-4c0c-9ca8-f8d663a0e563"/>
+  </w15:person>
   <w15:person w15:author="Jeff Watson">
     <w15:presenceInfo w15:providerId="Windows Live" w15:userId="dcdb38203bf7a9b9"/>
   </w15:person>
@@ -27232,6 +25891,15 @@
 </file>
 
 <file path=customXml/item1.xml><?xml version="1.0" encoding="utf-8"?>
+<?mso-contentType ?>
+<FormTemplates xmlns="http://schemas.microsoft.com/sharepoint/v3/contenttype/forms">
+  <Display>DocumentLibraryForm</Display>
+  <Edit>DocumentLibraryForm</Edit>
+  <New>DocumentLibraryForm</New>
+</FormTemplates>
+</file>
+
+<file path=customXml/item2.xml><?xml version="1.0" encoding="utf-8"?>
 <ct:contentTypeSchema xmlns:ct="http://schemas.microsoft.com/office/2006/metadata/contentType" xmlns:ma="http://schemas.microsoft.com/office/2006/metadata/properties/metaAttributes" ct:_="" ma:_="" ma:contentTypeName="Document" ma:contentTypeID="0x010100DDC7FDB1C8256C4EA4678CC05D188078" ma:contentTypeVersion="20" ma:contentTypeDescription="Create a new document." ma:contentTypeScope="" ma:versionID="2a9650d830cc67299a1a440994d8139a">
   <xsd:schema xmlns:xsd="http://www.w3.org/2001/XMLSchema" xmlns:xs="http://www.w3.org/2001/XMLSchema" xmlns:p="http://schemas.microsoft.com/office/2006/metadata/properties" xmlns:ns2="ab9fedca-001d-4cc9-b244-d9c3be5a27d3" xmlns:ns3="42cc25d9-27fe-4f07-accb-ded05ec47eee" targetNamespace="http://schemas.microsoft.com/office/2006/metadata/properties" ma:root="true" ma:fieldsID="b7be75ccca685a650eabb79854d6018f" ns2:_="" ns3:_="">
     <xsd:import namespace="ab9fedca-001d-4cc9-b244-d9c3be5a27d3"/>
@@ -27498,16 +26166,11 @@
 </ct:contentTypeSchema>
 </file>
 
-<file path=customXml/item2.xml><?xml version="1.0" encoding="utf-8"?>
-<?mso-contentType ?>
-<FormTemplates xmlns="http://schemas.microsoft.com/sharepoint/v3/contenttype/forms">
-  <Display>DocumentLibraryForm</Display>
-  <Edit>DocumentLibraryForm</Edit>
-  <New>DocumentLibraryForm</New>
-</FormTemplates>
+<file path=customXml/item3.xml><?xml version="1.0" encoding="utf-8"?>
+<b:Sources xmlns:b="http://schemas.openxmlformats.org/officeDocument/2006/bibliography" xmlns="http://schemas.openxmlformats.org/officeDocument/2006/bibliography" SelectedStyle="/APA.XSL" StyleName="APA"/>
 </file>
 
-<file path=customXml/item3.xml><?xml version="1.0" encoding="utf-8"?>
+<file path=customXml/item4.xml><?xml version="1.0" encoding="utf-8"?>
 <p:properties xmlns:p="http://schemas.microsoft.com/office/2006/metadata/properties" xmlns:xsi="http://www.w3.org/2001/XMLSchema-instance" xmlns:pc="http://schemas.microsoft.com/office/infopath/2007/PartnerControls">
   <documentManagement>
     <TaxCatchAll xmlns="42cc25d9-27fe-4f07-accb-ded05ec47eee" xsi:nil="true"/>
@@ -27519,15 +26182,7 @@
 </p:properties>
 </file>
 
-<file path=customXml/item4.xml><?xml version="1.0" encoding="utf-8"?>
-<b:Sources xmlns:b="http://schemas.openxmlformats.org/officeDocument/2006/bibliography" xmlns="http://schemas.openxmlformats.org/officeDocument/2006/bibliography" SelectedStyle="/APA.XSL" StyleName="APA"/>
-</file>
-
 <file path=customXml/itemProps1.xml><?xml version="1.0" encoding="utf-8"?>
-<ds:datastoreItem xmlns:ds="http://schemas.openxmlformats.org/officeDocument/2006/customXml" ds:itemID="{E1A392CF-E3E2-49C9-9EED-3BECD1E5A0F6}"/>
-</file>
-
-<file path=customXml/itemProps2.xml><?xml version="1.0" encoding="utf-8"?>
 <ds:datastoreItem xmlns:ds="http://schemas.openxmlformats.org/officeDocument/2006/customXml" ds:itemID="{8FB87CE3-B469-4182-AEDE-9227E391BD91}">
   <ds:schemaRefs>
     <ds:schemaRef ds:uri="http://schemas.microsoft.com/sharepoint/v3/contenttype/forms"/>
@@ -27535,7 +26190,34 @@
 </ds:datastoreItem>
 </file>
 
+<file path=customXml/itemProps2.xml><?xml version="1.0" encoding="utf-8"?>
+<ds:datastoreItem xmlns:ds="http://schemas.openxmlformats.org/officeDocument/2006/customXml" ds:itemID="{E1A392CF-E3E2-49C9-9EED-3BECD1E5A0F6}">
+  <ds:schemaRefs>
+    <ds:schemaRef ds:uri="http://schemas.microsoft.com/office/2006/metadata/contentType"/>
+    <ds:schemaRef ds:uri="http://schemas.microsoft.com/office/2006/metadata/properties/metaAttributes"/>
+    <ds:schemaRef ds:uri="http://www.w3.org/2001/XMLSchema"/>
+    <ds:schemaRef ds:uri="http://schemas.microsoft.com/office/2006/metadata/properties"/>
+    <ds:schemaRef ds:uri="ab9fedca-001d-4cc9-b244-d9c3be5a27d3"/>
+    <ds:schemaRef ds:uri="42cc25d9-27fe-4f07-accb-ded05ec47eee"/>
+    <ds:schemaRef ds:uri="http://schemas.microsoft.com/office/2006/documentManagement/types"/>
+    <ds:schemaRef ds:uri="http://schemas.microsoft.com/office/infopath/2007/PartnerControls"/>
+    <ds:schemaRef ds:uri="http://schemas.openxmlformats.org/package/2006/metadata/core-properties"/>
+    <ds:schemaRef ds:uri="http://purl.org/dc/elements/1.1/"/>
+    <ds:schemaRef ds:uri="http://purl.org/dc/terms/"/>
+    <ds:schemaRef ds:uri="http://schemas.microsoft.com/internal/obd"/>
+  </ds:schemaRefs>
+</ds:datastoreItem>
+</file>
+
 <file path=customXml/itemProps3.xml><?xml version="1.0" encoding="utf-8"?>
+<ds:datastoreItem xmlns:ds="http://schemas.openxmlformats.org/officeDocument/2006/customXml" ds:itemID="{EF278816-EC6F-A645-907D-7F25AECB1D4A}">
+  <ds:schemaRefs>
+    <ds:schemaRef ds:uri="http://schemas.openxmlformats.org/officeDocument/2006/bibliography"/>
+  </ds:schemaRefs>
+</ds:datastoreItem>
+</file>
+
+<file path=customXml/itemProps4.xml><?xml version="1.0" encoding="utf-8"?>
 <ds:datastoreItem xmlns:ds="http://schemas.openxmlformats.org/officeDocument/2006/customXml" ds:itemID="{7B319A58-F8E2-4C19-94CA-2C6944BB395B}">
   <ds:schemaRefs>
     <ds:schemaRef ds:uri="http://schemas.microsoft.com/office/2006/metadata/properties"/>
@@ -27544,12 +26226,4 @@
     <ds:schemaRef ds:uri="ab9fedca-001d-4cc9-b244-d9c3be5a27d3"/>
   </ds:schemaRefs>
 </ds:datastoreItem>
-</file>
-
-<file path=customXml/itemProps4.xml><?xml version="1.0" encoding="utf-8"?>
-<ds:datastoreItem xmlns:ds="http://schemas.openxmlformats.org/officeDocument/2006/customXml" ds:itemID="{EF278816-EC6F-A645-907D-7F25AECB1D4A}">
-  <ds:schemaRefs>
-    <ds:schemaRef ds:uri="http://schemas.openxmlformats.org/officeDocument/2006/bibliography"/>
-  </ds:schemaRefs>
-</ds:datastoreItem>
 </file>
</xml_diff>

<commit_message>
Rebuild Investment Services OA V06
</commit_message>
<xml_diff>
--- a/Project Rooms/Operating Agreements/sources/Jeff Watson/Simplified OA - 25-06-25 SELL_YOUR_HOME_LLC Simplified with Summary with Jeff Watson tracked edits.docx
+++ b/Project Rooms/Operating Agreements/sources/Jeff Watson/Simplified OA - 25-06-25 SELL_YOUR_HOME_LLC Simplified with Summary with Jeff Watson tracked edits.docx
@@ -6397,7 +6397,7 @@
           <w:rPr>
             <w:color w:val="0070C0"/>
           </w:rPr>
-          <w:t xml:space="preserve">The Mangager </w:t>
+          <w:t xml:space="preserve">The Manager </w:t>
         </w:r>
       </w:ins>
       <w:r>
@@ -25891,15 +25891,6 @@
 </file>
 
 <file path=customXml/item1.xml><?xml version="1.0" encoding="utf-8"?>
-<?mso-contentType ?>
-<FormTemplates xmlns="http://schemas.microsoft.com/sharepoint/v3/contenttype/forms">
-  <Display>DocumentLibraryForm</Display>
-  <Edit>DocumentLibraryForm</Edit>
-  <New>DocumentLibraryForm</New>
-</FormTemplates>
-</file>
-
-<file path=customXml/item2.xml><?xml version="1.0" encoding="utf-8"?>
 <ct:contentTypeSchema xmlns:ct="http://schemas.microsoft.com/office/2006/metadata/contentType" xmlns:ma="http://schemas.microsoft.com/office/2006/metadata/properties/metaAttributes" ct:_="" ma:_="" ma:contentTypeName="Document" ma:contentTypeID="0x010100DDC7FDB1C8256C4EA4678CC05D188078" ma:contentTypeVersion="20" ma:contentTypeDescription="Create a new document." ma:contentTypeScope="" ma:versionID="2a9650d830cc67299a1a440994d8139a">
   <xsd:schema xmlns:xsd="http://www.w3.org/2001/XMLSchema" xmlns:xs="http://www.w3.org/2001/XMLSchema" xmlns:p="http://schemas.microsoft.com/office/2006/metadata/properties" xmlns:ns2="ab9fedca-001d-4cc9-b244-d9c3be5a27d3" xmlns:ns3="42cc25d9-27fe-4f07-accb-ded05ec47eee" targetNamespace="http://schemas.microsoft.com/office/2006/metadata/properties" ma:root="true" ma:fieldsID="b7be75ccca685a650eabb79854d6018f" ns2:_="" ns3:_="">
     <xsd:import namespace="ab9fedca-001d-4cc9-b244-d9c3be5a27d3"/>
@@ -26166,11 +26157,16 @@
 </ct:contentTypeSchema>
 </file>
 
-<file path=customXml/item3.xml><?xml version="1.0" encoding="utf-8"?>
-<b:Sources xmlns:b="http://schemas.openxmlformats.org/officeDocument/2006/bibliography" xmlns="http://schemas.openxmlformats.org/officeDocument/2006/bibliography" SelectedStyle="/APA.XSL" StyleName="APA"/>
+<file path=customXml/item2.xml><?xml version="1.0" encoding="utf-8"?>
+<?mso-contentType ?>
+<FormTemplates xmlns="http://schemas.microsoft.com/sharepoint/v3/contenttype/forms">
+  <Display>DocumentLibraryForm</Display>
+  <Edit>DocumentLibraryForm</Edit>
+  <New>DocumentLibraryForm</New>
+</FormTemplates>
 </file>
 
-<file path=customXml/item4.xml><?xml version="1.0" encoding="utf-8"?>
+<file path=customXml/item3.xml><?xml version="1.0" encoding="utf-8"?>
 <p:properties xmlns:p="http://schemas.microsoft.com/office/2006/metadata/properties" xmlns:xsi="http://www.w3.org/2001/XMLSchema-instance" xmlns:pc="http://schemas.microsoft.com/office/infopath/2007/PartnerControls">
   <documentManagement>
     <TaxCatchAll xmlns="42cc25d9-27fe-4f07-accb-ded05ec47eee" xsi:nil="true"/>
@@ -26182,15 +26178,11 @@
 </p:properties>
 </file>
 
-<file path=customXml/itemProps1.xml><?xml version="1.0" encoding="utf-8"?>
-<ds:datastoreItem xmlns:ds="http://schemas.openxmlformats.org/officeDocument/2006/customXml" ds:itemID="{8FB87CE3-B469-4182-AEDE-9227E391BD91}">
-  <ds:schemaRefs>
-    <ds:schemaRef ds:uri="http://schemas.microsoft.com/sharepoint/v3/contenttype/forms"/>
-  </ds:schemaRefs>
-</ds:datastoreItem>
+<file path=customXml/item4.xml><?xml version="1.0" encoding="utf-8"?>
+<b:Sources xmlns:b="http://schemas.openxmlformats.org/officeDocument/2006/bibliography" xmlns="http://schemas.openxmlformats.org/officeDocument/2006/bibliography" SelectedStyle="/APA.XSL" StyleName="APA"/>
 </file>
 
-<file path=customXml/itemProps2.xml><?xml version="1.0" encoding="utf-8"?>
+<file path=customXml/itemProps1.xml><?xml version="1.0" encoding="utf-8"?>
 <ds:datastoreItem xmlns:ds="http://schemas.openxmlformats.org/officeDocument/2006/customXml" ds:itemID="{E1A392CF-E3E2-49C9-9EED-3BECD1E5A0F6}">
   <ds:schemaRefs>
     <ds:schemaRef ds:uri="http://schemas.microsoft.com/office/2006/metadata/contentType"/>
@@ -26209,15 +26201,15 @@
 </ds:datastoreItem>
 </file>
 
-<file path=customXml/itemProps3.xml><?xml version="1.0" encoding="utf-8"?>
-<ds:datastoreItem xmlns:ds="http://schemas.openxmlformats.org/officeDocument/2006/customXml" ds:itemID="{EF278816-EC6F-A645-907D-7F25AECB1D4A}">
+<file path=customXml/itemProps2.xml><?xml version="1.0" encoding="utf-8"?>
+<ds:datastoreItem xmlns:ds="http://schemas.openxmlformats.org/officeDocument/2006/customXml" ds:itemID="{8FB87CE3-B469-4182-AEDE-9227E391BD91}">
   <ds:schemaRefs>
-    <ds:schemaRef ds:uri="http://schemas.openxmlformats.org/officeDocument/2006/bibliography"/>
+    <ds:schemaRef ds:uri="http://schemas.microsoft.com/sharepoint/v3/contenttype/forms"/>
   </ds:schemaRefs>
 </ds:datastoreItem>
 </file>
 
-<file path=customXml/itemProps4.xml><?xml version="1.0" encoding="utf-8"?>
+<file path=customXml/itemProps3.xml><?xml version="1.0" encoding="utf-8"?>
 <ds:datastoreItem xmlns:ds="http://schemas.openxmlformats.org/officeDocument/2006/customXml" ds:itemID="{7B319A58-F8E2-4C19-94CA-2C6944BB395B}">
   <ds:schemaRefs>
     <ds:schemaRef ds:uri="http://schemas.microsoft.com/office/2006/metadata/properties"/>
@@ -26226,4 +26218,12 @@
     <ds:schemaRef ds:uri="ab9fedca-001d-4cc9-b244-d9c3be5a27d3"/>
   </ds:schemaRefs>
 </ds:datastoreItem>
+</file>
+
+<file path=customXml/itemProps4.xml><?xml version="1.0" encoding="utf-8"?>
+<ds:datastoreItem xmlns:ds="http://schemas.openxmlformats.org/officeDocument/2006/customXml" ds:itemID="{EF278816-EC6F-A645-907D-7F25AECB1D4A}">
+  <ds:schemaRefs>
+    <ds:schemaRef ds:uri="http://schemas.openxmlformats.org/officeDocument/2006/bibliography"/>
+  </ds:schemaRefs>
+</ds:datastoreItem>
 </file>
</xml_diff>